<commit_message>
feat: incorporar victimas en estadisticas, graficos, excel y ajustes de autenticacion
</commit_message>
<xml_diff>
--- a/siad/docs/Plantilla_Word.docx
+++ b/siad/docs/Plantilla_Word.docx
@@ -406,6 +406,62 @@
                 <w:sz w:val="21"/>
               </w:rPr>
               <w:t>{{ Detenidos }}</w:t>
+            </w:r>
+          </w:p>
+        </w:tc>
+      </w:tr>
+      <w:tr>
+        <w:tc>
+          <w:tcPr>
+            <w:tcW w:type="dxa" w:w="2154"/>
+            <w:tcMar>
+              <w:top w:w="70" w:type="dxa"/>
+              <w:bottom w:w="70" w:type="dxa"/>
+              <w:left w:w="120" w:type="dxa"/>
+              <w:right w:w="120" w:type="dxa"/>
+            </w:tcMar>
+            <w:shd w:fill="FFFFFF"/>
+          </w:tcPr>
+          <w:p>
+            <w:pPr>
+              <w:spacing w:before="40" w:after="40"/>
+            </w:pPr>
+            <w:r>
+              <w:rPr>
+                <w:rFonts w:ascii="Arial" w:hAnsi="Arial"/>
+                <w:b/>
+                <w:i w:val="0"/>
+                <w:color w:val="222222"/>
+                <w:sz w:val="21"/>
+              </w:rPr>
+              <w:t>Víctima</w:t>
+            </w:r>
+          </w:p>
+        </w:tc>
+        <w:tc>
+          <w:tcPr>
+            <w:tcW w:type="dxa" w:w="6917"/>
+            <w:tcMar>
+              <w:top w:w="70" w:type="dxa"/>
+              <w:bottom w:w="70" w:type="dxa"/>
+              <w:left w:w="120" w:type="dxa"/>
+              <w:right w:w="120" w:type="dxa"/>
+            </w:tcMar>
+            <w:shd w:fill="FFFFFF"/>
+          </w:tcPr>
+          <w:p>
+            <w:pPr>
+              <w:spacing w:before="40" w:after="40"/>
+            </w:pPr>
+            <w:r>
+              <w:rPr>
+                <w:rFonts w:ascii="Arial" w:hAnsi="Arial"/>
+                <w:b w:val="0"/>
+                <w:i w:val="0"/>
+                <w:color w:val="222222"/>
+                <w:sz w:val="21"/>
+              </w:rPr>
+              <w:t>{{ Victimas }}</w:t>
             </w:r>
           </w:p>
         </w:tc>
@@ -1419,6 +1475,62 @@
           </w:p>
         </w:tc>
       </w:tr>
+      <w:tr>
+        <w:tc>
+          <w:tcPr>
+            <w:tcW w:type="dxa" w:w="2835"/>
+            <w:tcMar>
+              <w:top w:w="70" w:type="dxa"/>
+              <w:bottom w:w="70" w:type="dxa"/>
+              <w:left w:w="120" w:type="dxa"/>
+              <w:right w:w="120" w:type="dxa"/>
+            </w:tcMar>
+            <w:shd w:fill="F8FAFC"/>
+          </w:tcPr>
+          <w:p>
+            <w:pPr>
+              <w:spacing w:before="40" w:after="40" w:line="276" w:lineRule="auto"/>
+            </w:pPr>
+            <w:r>
+              <w:rPr>
+                <w:rFonts w:ascii="Arial" w:hAnsi="Arial"/>
+                <w:b/>
+                <w:i w:val="0"/>
+                <w:color w:val="003366"/>
+                <w:sz w:val="21"/>
+              </w:rPr>
+              <w:t>Víctimas Identificadas:</w:t>
+            </w:r>
+          </w:p>
+        </w:tc>
+        <w:tc>
+          <w:tcPr>
+            <w:tcW w:type="dxa" w:w="6236"/>
+            <w:tcMar>
+              <w:top w:w="70" w:type="dxa"/>
+              <w:bottom w:w="70" w:type="dxa"/>
+              <w:left w:w="120" w:type="dxa"/>
+              <w:right w:w="120" w:type="dxa"/>
+            </w:tcMar>
+            <w:shd w:fill="FFFFFF"/>
+          </w:tcPr>
+          <w:p>
+            <w:pPr>
+              <w:spacing w:before="40" w:after="40" w:line="276" w:lineRule="auto"/>
+            </w:pPr>
+            <w:r>
+              <w:rPr>
+                <w:rFonts w:ascii="Arial" w:hAnsi="Arial"/>
+                <w:b w:val="0"/>
+                <w:i w:val="0"/>
+                <w:color w:val="222222"/>
+                <w:sz w:val="21"/>
+              </w:rPr>
+              <w:t>{{ Victimas }}</w:t>
+            </w:r>
+          </w:p>
+        </w:tc>
+      </w:tr>
     </w:tbl>
     <w:p>
       <w:pPr>

</xml_diff>

<commit_message>
feat: consolidar avances de ABIS y SIAD
</commit_message>
<xml_diff>
--- a/siad/docs/Plantilla_Word.docx
+++ b/siad/docs/Plantilla_Word.docx
@@ -462,6 +462,118 @@
                 <w:sz w:val="21"/>
               </w:rPr>
               <w:t>{{ Victimas }}</w:t>
+            </w:r>
+          </w:p>
+        </w:tc>
+      </w:tr>
+      <w:tr>
+        <w:tc>
+          <w:tcPr>
+            <w:tcW w:type="dxa" w:w="2154"/>
+            <w:tcMar>
+              <w:top w:w="70" w:type="dxa"/>
+              <w:bottom w:w="70" w:type="dxa"/>
+              <w:left w:w="120" w:type="dxa"/>
+              <w:right w:w="120" w:type="dxa"/>
+            </w:tcMar>
+            <w:shd w:fill="FFFFFF"/>
+          </w:tcPr>
+          <w:p>
+            <w:pPr>
+              <w:spacing w:before="40" w:after="40"/>
+            </w:pPr>
+            <w:r>
+              <w:rPr>
+                <w:rFonts w:ascii="Arial" w:hAnsi="Arial"/>
+                <w:b/>
+                <w:i w:val="0"/>
+                <w:color w:val="222222"/>
+                <w:sz w:val="21"/>
+              </w:rPr>
+              <w:t>Detenidos menores de edad</w:t>
+            </w:r>
+          </w:p>
+        </w:tc>
+        <w:tc>
+          <w:tcPr>
+            <w:tcW w:type="dxa" w:w="6917"/>
+            <w:tcMar>
+              <w:top w:w="70" w:type="dxa"/>
+              <w:bottom w:w="70" w:type="dxa"/>
+              <w:left w:w="120" w:type="dxa"/>
+              <w:right w:w="120" w:type="dxa"/>
+            </w:tcMar>
+            <w:shd w:fill="FFFFFF"/>
+          </w:tcPr>
+          <w:p>
+            <w:pPr>
+              <w:spacing w:before="40" w:after="40"/>
+            </w:pPr>
+            <w:r>
+              <w:rPr>
+                <w:rFonts w:ascii="Arial" w:hAnsi="Arial"/>
+                <w:b w:val="0"/>
+                <w:i w:val="0"/>
+                <w:color w:val="222222"/>
+                <w:sz w:val="21"/>
+              </w:rPr>
+              <w:t>{{ Detenidos_Menores }}</w:t>
+            </w:r>
+          </w:p>
+        </w:tc>
+      </w:tr>
+      <w:tr>
+        <w:tc>
+          <w:tcPr>
+            <w:tcW w:type="dxa" w:w="2154"/>
+            <w:tcMar>
+              <w:top w:w="70" w:type="dxa"/>
+              <w:bottom w:w="70" w:type="dxa"/>
+              <w:left w:w="120" w:type="dxa"/>
+              <w:right w:w="120" w:type="dxa"/>
+            </w:tcMar>
+            <w:shd w:fill="FFFFFF"/>
+          </w:tcPr>
+          <w:p>
+            <w:pPr>
+              <w:spacing w:before="40" w:after="40"/>
+            </w:pPr>
+            <w:r>
+              <w:rPr>
+                <w:rFonts w:ascii="Arial" w:hAnsi="Arial"/>
+                <w:b/>
+                <w:i w:val="0"/>
+                <w:color w:val="222222"/>
+                <w:sz w:val="21"/>
+              </w:rPr>
+              <w:t>Víctimas menores de edad</w:t>
+            </w:r>
+          </w:p>
+        </w:tc>
+        <w:tc>
+          <w:tcPr>
+            <w:tcW w:type="dxa" w:w="6917"/>
+            <w:tcMar>
+              <w:top w:w="70" w:type="dxa"/>
+              <w:bottom w:w="70" w:type="dxa"/>
+              <w:left w:w="120" w:type="dxa"/>
+              <w:right w:w="120" w:type="dxa"/>
+            </w:tcMar>
+            <w:shd w:fill="FFFFFF"/>
+          </w:tcPr>
+          <w:p>
+            <w:pPr>
+              <w:spacing w:before="40" w:after="40"/>
+            </w:pPr>
+            <w:r>
+              <w:rPr>
+                <w:rFonts w:ascii="Arial" w:hAnsi="Arial"/>
+                <w:b w:val="0"/>
+                <w:i w:val="0"/>
+                <w:color w:val="222222"/>
+                <w:sz w:val="21"/>
+              </w:rPr>
+              <w:t>{{ Victimas_Menores }}</w:t>
             </w:r>
           </w:p>
         </w:tc>
@@ -1531,6 +1643,118 @@
           </w:p>
         </w:tc>
       </w:tr>
+      <w:tr>
+        <w:tc>
+          <w:tcPr>
+            <w:tcW w:type="dxa" w:w="2835"/>
+            <w:tcMar>
+              <w:top w:w="70" w:type="dxa"/>
+              <w:bottom w:w="70" w:type="dxa"/>
+              <w:left w:w="120" w:type="dxa"/>
+              <w:right w:w="120" w:type="dxa"/>
+            </w:tcMar>
+            <w:shd w:fill="F8FAFC"/>
+          </w:tcPr>
+          <w:p>
+            <w:pPr>
+              <w:spacing w:before="40" w:after="40" w:line="276" w:lineRule="auto"/>
+            </w:pPr>
+            <w:r>
+              <w:rPr>
+                <w:rFonts w:ascii="Arial" w:hAnsi="Arial"/>
+                <w:b/>
+                <w:i w:val="0"/>
+                <w:color w:val="003366"/>
+                <w:sz w:val="21"/>
+              </w:rPr>
+              <w:t>Detenidos menores de edad:</w:t>
+            </w:r>
+          </w:p>
+        </w:tc>
+        <w:tc>
+          <w:tcPr>
+            <w:tcW w:type="dxa" w:w="6236"/>
+            <w:tcMar>
+              <w:top w:w="70" w:type="dxa"/>
+              <w:bottom w:w="70" w:type="dxa"/>
+              <w:left w:w="120" w:type="dxa"/>
+              <w:right w:w="120" w:type="dxa"/>
+            </w:tcMar>
+            <w:shd w:fill="FFFFFF"/>
+          </w:tcPr>
+          <w:p>
+            <w:pPr>
+              <w:spacing w:before="40" w:after="40" w:line="276" w:lineRule="auto"/>
+            </w:pPr>
+            <w:r>
+              <w:rPr>
+                <w:rFonts w:ascii="Arial" w:hAnsi="Arial"/>
+                <w:b w:val="0"/>
+                <w:i w:val="0"/>
+                <w:color w:val="222222"/>
+                <w:sz w:val="21"/>
+              </w:rPr>
+              <w:t>{{ Detenidos_Menores }}</w:t>
+            </w:r>
+          </w:p>
+        </w:tc>
+      </w:tr>
+      <w:tr>
+        <w:tc>
+          <w:tcPr>
+            <w:tcW w:type="dxa" w:w="2835"/>
+            <w:tcMar>
+              <w:top w:w="70" w:type="dxa"/>
+              <w:bottom w:w="70" w:type="dxa"/>
+              <w:left w:w="120" w:type="dxa"/>
+              <w:right w:w="120" w:type="dxa"/>
+            </w:tcMar>
+            <w:shd w:fill="F8FAFC"/>
+          </w:tcPr>
+          <w:p>
+            <w:pPr>
+              <w:spacing w:before="40" w:after="40" w:line="276" w:lineRule="auto"/>
+            </w:pPr>
+            <w:r>
+              <w:rPr>
+                <w:rFonts w:ascii="Arial" w:hAnsi="Arial"/>
+                <w:b/>
+                <w:i w:val="0"/>
+                <w:color w:val="003366"/>
+                <w:sz w:val="21"/>
+              </w:rPr>
+              <w:t>Víctimas menores de edad:</w:t>
+            </w:r>
+          </w:p>
+        </w:tc>
+        <w:tc>
+          <w:tcPr>
+            <w:tcW w:type="dxa" w:w="6236"/>
+            <w:tcMar>
+              <w:top w:w="70" w:type="dxa"/>
+              <w:bottom w:w="70" w:type="dxa"/>
+              <w:left w:w="120" w:type="dxa"/>
+              <w:right w:w="120" w:type="dxa"/>
+            </w:tcMar>
+            <w:shd w:fill="FFFFFF"/>
+          </w:tcPr>
+          <w:p>
+            <w:pPr>
+              <w:spacing w:before="40" w:after="40" w:line="276" w:lineRule="auto"/>
+            </w:pPr>
+            <w:r>
+              <w:rPr>
+                <w:rFonts w:ascii="Arial" w:hAnsi="Arial"/>
+                <w:b w:val="0"/>
+                <w:i w:val="0"/>
+                <w:color w:val="222222"/>
+                <w:sz w:val="21"/>
+              </w:rPr>
+              <w:t>{{ Victimas_Menores }}</w:t>
+            </w:r>
+          </w:p>
+        </w:tc>
+      </w:tr>
     </w:tbl>
     <w:p>
       <w:pPr>

</xml_diff>

<commit_message>
feat: integrar mejoras de SIAD y presentacion de Ashley
</commit_message>
<xml_diff>
--- a/siad/docs/Plantilla_Word.docx
+++ b/siad/docs/Plantilla_Word.docx
@@ -406,6 +406,174 @@
                 <w:sz w:val="21"/>
               </w:rPr>
               <w:t>{{ Detenidos }}</w:t>
+            </w:r>
+          </w:p>
+        </w:tc>
+      </w:tr>
+      <w:tr>
+        <w:tc>
+          <w:tcPr>
+            <w:tcW w:type="dxa" w:w="2154"/>
+            <w:tcMar>
+              <w:top w:w="70" w:type="dxa"/>
+              <w:bottom w:w="70" w:type="dxa"/>
+              <w:left w:w="120" w:type="dxa"/>
+              <w:right w:w="120" w:type="dxa"/>
+            </w:tcMar>
+            <w:shd w:fill="FFFFFF"/>
+          </w:tcPr>
+          <w:p>
+            <w:pPr>
+              <w:spacing w:before="40" w:after="40"/>
+            </w:pPr>
+            <w:r>
+              <w:rPr>
+                <w:rFonts w:ascii="Arial" w:hAnsi="Arial"/>
+                <w:b/>
+                <w:i w:val="0"/>
+                <w:color w:val="222222"/>
+                <w:sz w:val="21"/>
+              </w:rPr>
+              <w:t>Víctima</w:t>
+            </w:r>
+          </w:p>
+        </w:tc>
+        <w:tc>
+          <w:tcPr>
+            <w:tcW w:type="dxa" w:w="6917"/>
+            <w:tcMar>
+              <w:top w:w="70" w:type="dxa"/>
+              <w:bottom w:w="70" w:type="dxa"/>
+              <w:left w:w="120" w:type="dxa"/>
+              <w:right w:w="120" w:type="dxa"/>
+            </w:tcMar>
+            <w:shd w:fill="FFFFFF"/>
+          </w:tcPr>
+          <w:p>
+            <w:pPr>
+              <w:spacing w:before="40" w:after="40"/>
+            </w:pPr>
+            <w:r>
+              <w:rPr>
+                <w:rFonts w:ascii="Arial" w:hAnsi="Arial"/>
+                <w:b w:val="0"/>
+                <w:i w:val="0"/>
+                <w:color w:val="222222"/>
+                <w:sz w:val="21"/>
+              </w:rPr>
+              <w:t>{{ Victimas }}</w:t>
+            </w:r>
+          </w:p>
+        </w:tc>
+      </w:tr>
+      <w:tr>
+        <w:tc>
+          <w:tcPr>
+            <w:tcW w:type="dxa" w:w="2154"/>
+            <w:tcMar>
+              <w:top w:w="70" w:type="dxa"/>
+              <w:bottom w:w="70" w:type="dxa"/>
+              <w:left w:w="120" w:type="dxa"/>
+              <w:right w:w="120" w:type="dxa"/>
+            </w:tcMar>
+            <w:shd w:fill="FFFFFF"/>
+          </w:tcPr>
+          <w:p>
+            <w:pPr>
+              <w:spacing w:before="40" w:after="40"/>
+            </w:pPr>
+            <w:r>
+              <w:rPr>
+                <w:rFonts w:ascii="Arial" w:hAnsi="Arial"/>
+                <w:b/>
+                <w:i w:val="0"/>
+                <w:color w:val="222222"/>
+                <w:sz w:val="21"/>
+              </w:rPr>
+              <w:t>Detenidos menores de edad</w:t>
+            </w:r>
+          </w:p>
+        </w:tc>
+        <w:tc>
+          <w:tcPr>
+            <w:tcW w:type="dxa" w:w="6917"/>
+            <w:tcMar>
+              <w:top w:w="70" w:type="dxa"/>
+              <w:bottom w:w="70" w:type="dxa"/>
+              <w:left w:w="120" w:type="dxa"/>
+              <w:right w:w="120" w:type="dxa"/>
+            </w:tcMar>
+            <w:shd w:fill="FFFFFF"/>
+          </w:tcPr>
+          <w:p>
+            <w:pPr>
+              <w:spacing w:before="40" w:after="40"/>
+            </w:pPr>
+            <w:r>
+              <w:rPr>
+                <w:rFonts w:ascii="Arial" w:hAnsi="Arial"/>
+                <w:b w:val="0"/>
+                <w:i w:val="0"/>
+                <w:color w:val="222222"/>
+                <w:sz w:val="21"/>
+              </w:rPr>
+              <w:t>{{ Detenidos_Menores }}</w:t>
+            </w:r>
+          </w:p>
+        </w:tc>
+      </w:tr>
+      <w:tr>
+        <w:tc>
+          <w:tcPr>
+            <w:tcW w:type="dxa" w:w="2154"/>
+            <w:tcMar>
+              <w:top w:w="70" w:type="dxa"/>
+              <w:bottom w:w="70" w:type="dxa"/>
+              <w:left w:w="120" w:type="dxa"/>
+              <w:right w:w="120" w:type="dxa"/>
+            </w:tcMar>
+            <w:shd w:fill="FFFFFF"/>
+          </w:tcPr>
+          <w:p>
+            <w:pPr>
+              <w:spacing w:before="40" w:after="40"/>
+            </w:pPr>
+            <w:r>
+              <w:rPr>
+                <w:rFonts w:ascii="Arial" w:hAnsi="Arial"/>
+                <w:b/>
+                <w:i w:val="0"/>
+                <w:color w:val="222222"/>
+                <w:sz w:val="21"/>
+              </w:rPr>
+              <w:t>Víctimas menores de edad</w:t>
+            </w:r>
+          </w:p>
+        </w:tc>
+        <w:tc>
+          <w:tcPr>
+            <w:tcW w:type="dxa" w:w="6917"/>
+            <w:tcMar>
+              <w:top w:w="70" w:type="dxa"/>
+              <w:bottom w:w="70" w:type="dxa"/>
+              <w:left w:w="120" w:type="dxa"/>
+              <w:right w:w="120" w:type="dxa"/>
+            </w:tcMar>
+            <w:shd w:fill="FFFFFF"/>
+          </w:tcPr>
+          <w:p>
+            <w:pPr>
+              <w:spacing w:before="40" w:after="40"/>
+            </w:pPr>
+            <w:r>
+              <w:rPr>
+                <w:rFonts w:ascii="Arial" w:hAnsi="Arial"/>
+                <w:b w:val="0"/>
+                <w:i w:val="0"/>
+                <w:color w:val="222222"/>
+                <w:sz w:val="21"/>
+              </w:rPr>
+              <w:t>{{ Victimas_Menores }}</w:t>
             </w:r>
           </w:p>
         </w:tc>
@@ -1419,6 +1587,174 @@
           </w:p>
         </w:tc>
       </w:tr>
+      <w:tr>
+        <w:tc>
+          <w:tcPr>
+            <w:tcW w:type="dxa" w:w="2835"/>
+            <w:tcMar>
+              <w:top w:w="70" w:type="dxa"/>
+              <w:bottom w:w="70" w:type="dxa"/>
+              <w:left w:w="120" w:type="dxa"/>
+              <w:right w:w="120" w:type="dxa"/>
+            </w:tcMar>
+            <w:shd w:fill="F8FAFC"/>
+          </w:tcPr>
+          <w:p>
+            <w:pPr>
+              <w:spacing w:before="40" w:after="40" w:line="276" w:lineRule="auto"/>
+            </w:pPr>
+            <w:r>
+              <w:rPr>
+                <w:rFonts w:ascii="Arial" w:hAnsi="Arial"/>
+                <w:b/>
+                <w:i w:val="0"/>
+                <w:color w:val="003366"/>
+                <w:sz w:val="21"/>
+              </w:rPr>
+              <w:t>Víctimas Identificadas:</w:t>
+            </w:r>
+          </w:p>
+        </w:tc>
+        <w:tc>
+          <w:tcPr>
+            <w:tcW w:type="dxa" w:w="6236"/>
+            <w:tcMar>
+              <w:top w:w="70" w:type="dxa"/>
+              <w:bottom w:w="70" w:type="dxa"/>
+              <w:left w:w="120" w:type="dxa"/>
+              <w:right w:w="120" w:type="dxa"/>
+            </w:tcMar>
+            <w:shd w:fill="FFFFFF"/>
+          </w:tcPr>
+          <w:p>
+            <w:pPr>
+              <w:spacing w:before="40" w:after="40" w:line="276" w:lineRule="auto"/>
+            </w:pPr>
+            <w:r>
+              <w:rPr>
+                <w:rFonts w:ascii="Arial" w:hAnsi="Arial"/>
+                <w:b w:val="0"/>
+                <w:i w:val="0"/>
+                <w:color w:val="222222"/>
+                <w:sz w:val="21"/>
+              </w:rPr>
+              <w:t>{{ Victimas }}</w:t>
+            </w:r>
+          </w:p>
+        </w:tc>
+      </w:tr>
+      <w:tr>
+        <w:tc>
+          <w:tcPr>
+            <w:tcW w:type="dxa" w:w="2835"/>
+            <w:tcMar>
+              <w:top w:w="70" w:type="dxa"/>
+              <w:bottom w:w="70" w:type="dxa"/>
+              <w:left w:w="120" w:type="dxa"/>
+              <w:right w:w="120" w:type="dxa"/>
+            </w:tcMar>
+            <w:shd w:fill="F8FAFC"/>
+          </w:tcPr>
+          <w:p>
+            <w:pPr>
+              <w:spacing w:before="40" w:after="40" w:line="276" w:lineRule="auto"/>
+            </w:pPr>
+            <w:r>
+              <w:rPr>
+                <w:rFonts w:ascii="Arial" w:hAnsi="Arial"/>
+                <w:b/>
+                <w:i w:val="0"/>
+                <w:color w:val="003366"/>
+                <w:sz w:val="21"/>
+              </w:rPr>
+              <w:t>Detenidos menores de edad:</w:t>
+            </w:r>
+          </w:p>
+        </w:tc>
+        <w:tc>
+          <w:tcPr>
+            <w:tcW w:type="dxa" w:w="6236"/>
+            <w:tcMar>
+              <w:top w:w="70" w:type="dxa"/>
+              <w:bottom w:w="70" w:type="dxa"/>
+              <w:left w:w="120" w:type="dxa"/>
+              <w:right w:w="120" w:type="dxa"/>
+            </w:tcMar>
+            <w:shd w:fill="FFFFFF"/>
+          </w:tcPr>
+          <w:p>
+            <w:pPr>
+              <w:spacing w:before="40" w:after="40" w:line="276" w:lineRule="auto"/>
+            </w:pPr>
+            <w:r>
+              <w:rPr>
+                <w:rFonts w:ascii="Arial" w:hAnsi="Arial"/>
+                <w:b w:val="0"/>
+                <w:i w:val="0"/>
+                <w:color w:val="222222"/>
+                <w:sz w:val="21"/>
+              </w:rPr>
+              <w:t>{{ Detenidos_Menores }}</w:t>
+            </w:r>
+          </w:p>
+        </w:tc>
+      </w:tr>
+      <w:tr>
+        <w:tc>
+          <w:tcPr>
+            <w:tcW w:type="dxa" w:w="2835"/>
+            <w:tcMar>
+              <w:top w:w="70" w:type="dxa"/>
+              <w:bottom w:w="70" w:type="dxa"/>
+              <w:left w:w="120" w:type="dxa"/>
+              <w:right w:w="120" w:type="dxa"/>
+            </w:tcMar>
+            <w:shd w:fill="F8FAFC"/>
+          </w:tcPr>
+          <w:p>
+            <w:pPr>
+              <w:spacing w:before="40" w:after="40" w:line="276" w:lineRule="auto"/>
+            </w:pPr>
+            <w:r>
+              <w:rPr>
+                <w:rFonts w:ascii="Arial" w:hAnsi="Arial"/>
+                <w:b/>
+                <w:i w:val="0"/>
+                <w:color w:val="003366"/>
+                <w:sz w:val="21"/>
+              </w:rPr>
+              <w:t>Víctimas menores de edad:</w:t>
+            </w:r>
+          </w:p>
+        </w:tc>
+        <w:tc>
+          <w:tcPr>
+            <w:tcW w:type="dxa" w:w="6236"/>
+            <w:tcMar>
+              <w:top w:w="70" w:type="dxa"/>
+              <w:bottom w:w="70" w:type="dxa"/>
+              <w:left w:w="120" w:type="dxa"/>
+              <w:right w:w="120" w:type="dxa"/>
+            </w:tcMar>
+            <w:shd w:fill="FFFFFF"/>
+          </w:tcPr>
+          <w:p>
+            <w:pPr>
+              <w:spacing w:before="40" w:after="40" w:line="276" w:lineRule="auto"/>
+            </w:pPr>
+            <w:r>
+              <w:rPr>
+                <w:rFonts w:ascii="Arial" w:hAnsi="Arial"/>
+                <w:b w:val="0"/>
+                <w:i w:val="0"/>
+                <w:color w:val="222222"/>
+                <w:sz w:val="21"/>
+              </w:rPr>
+              <w:t>{{ Victimas_Menores }}</w:t>
+            </w:r>
+          </w:p>
+        </w:tc>
+      </w:tr>
     </w:tbl>
     <w:p>
       <w:pPr>

</xml_diff>

<commit_message>
feat(siad): modernizar acta Word con entidades y NNA
</commit_message>
<xml_diff>
--- a/siad/docs/Plantilla_Word.docx
+++ b/siad/docs/Plantilla_Word.docx
@@ -12,10 +12,26 @@
           <w:rFonts w:ascii="Arial" w:hAnsi="Arial"/>
           <w:b/>
           <w:i w:val="0"/>
-          <w:color w:val="003366"/>
+          <w:color w:val="0B2A5B"/>
           <w:sz w:val="28"/>
         </w:rPr>
         <w:t>INFORME DE ANÁLISIS DOCUMENTAL</w:t>
+      </w:r>
+    </w:p>
+    <w:p>
+      <w:pPr>
+        <w:spacing w:before="0" w:after="200"/>
+        <w:jc w:val="center"/>
+      </w:pPr>
+      <w:r>
+        <w:rPr>
+          <w:rFonts w:ascii="Arial" w:hAnsi="Arial"/>
+          <w:b/>
+          <w:i w:val="0"/>
+          <w:color w:val="C69214"/>
+          <w:sz w:val="15"/>
+        </w:rPr>
+        <w:t>━━━━━━━━━━━━━━━━━━━━━━━━━━━━━━━━</w:t>
       </w:r>
     </w:p>
     <w:tbl>
@@ -58,7 +74,7 @@
                 <w:rFonts w:ascii="Arial" w:hAnsi="Arial"/>
                 <w:b/>
                 <w:i w:val="0"/>
-                <w:color w:val="003366"/>
+                <w:color w:val="0B2A5B"/>
                 <w:sz w:val="21"/>
               </w:rPr>
               <w:t>Documento Analizado:</w:t>
@@ -85,7 +101,7 @@
                 <w:rFonts w:ascii="Arial" w:hAnsi="Arial"/>
                 <w:b w:val="0"/>
                 <w:i w:val="0"/>
-                <w:color w:val="222222"/>
+                <w:color w:val="1F2937"/>
                 <w:sz w:val="21"/>
               </w:rPr>
               <w:t>{{ Nombre_Documento }}</w:t>
@@ -114,7 +130,7 @@
                 <w:rFonts w:ascii="Arial" w:hAnsi="Arial"/>
                 <w:b/>
                 <w:i w:val="0"/>
-                <w:color w:val="003366"/>
+                <w:color w:val="0B2A5B"/>
                 <w:sz w:val="21"/>
               </w:rPr>
               <w:t>Fecha de Generación:</w:t>
@@ -141,7 +157,7 @@
                 <w:rFonts w:ascii="Arial" w:hAnsi="Arial"/>
                 <w:b w:val="0"/>
                 <w:i w:val="0"/>
-                <w:color w:val="222222"/>
+                <w:color w:val="1F2937"/>
                 <w:sz w:val="21"/>
               </w:rPr>
               <w:t>{{ Fecha_Generacion }}</w:t>
@@ -161,7 +177,7 @@
           <w:rFonts w:ascii="Arial" w:hAnsi="Arial"/>
           <w:b/>
           <w:i w:val="0"/>
-          <w:color w:val="003366"/>
+          <w:color w:val="0B2A5B"/>
           <w:sz w:val="24"/>
         </w:rPr>
         <w:t>1. Resumen de Diligencia</w:t>
@@ -263,7 +279,7 @@
                 <w:rFonts w:ascii="Arial" w:hAnsi="Arial"/>
                 <w:b/>
                 <w:i w:val="0"/>
-                <w:color w:val="222222"/>
+                <w:color w:val="1F2937"/>
                 <w:sz w:val="21"/>
               </w:rPr>
               <w:t>Unidad</w:t>
@@ -290,7 +306,7 @@
                 <w:rFonts w:ascii="Arial" w:hAnsi="Arial"/>
                 <w:b w:val="0"/>
                 <w:i w:val="0"/>
-                <w:color w:val="222222"/>
+                <w:color w:val="1F2937"/>
                 <w:sz w:val="21"/>
               </w:rPr>
               <w:t>{{ Unidad }}</w:t>
@@ -319,7 +335,7 @@
                 <w:rFonts w:ascii="Arial" w:hAnsi="Arial"/>
                 <w:b/>
                 <w:i w:val="0"/>
-                <w:color w:val="222222"/>
+                <w:color w:val="1F2937"/>
                 <w:sz w:val="21"/>
               </w:rPr>
               <w:t>Hecho</w:t>
@@ -346,7 +362,7 @@
                 <w:rFonts w:ascii="Arial" w:hAnsi="Arial"/>
                 <w:b w:val="0"/>
                 <w:i w:val="0"/>
-                <w:color w:val="222222"/>
+                <w:color w:val="1F2937"/>
                 <w:sz w:val="21"/>
               </w:rPr>
               <w:t>{{ Hecho }}</w:t>
@@ -375,7 +391,7 @@
                 <w:rFonts w:ascii="Arial" w:hAnsi="Arial"/>
                 <w:b/>
                 <w:i w:val="0"/>
-                <w:color w:val="222222"/>
+                <w:color w:val="1F2937"/>
                 <w:sz w:val="21"/>
               </w:rPr>
               <w:t>Detenido</w:t>
@@ -402,7 +418,7 @@
                 <w:rFonts w:ascii="Arial" w:hAnsi="Arial"/>
                 <w:b w:val="0"/>
                 <w:i w:val="0"/>
-                <w:color w:val="222222"/>
+                <w:color w:val="1F2937"/>
                 <w:sz w:val="21"/>
               </w:rPr>
               <w:t>{{ Detenidos }}</w:t>
@@ -431,7 +447,7 @@
                 <w:rFonts w:ascii="Arial" w:hAnsi="Arial"/>
                 <w:b/>
                 <w:i w:val="0"/>
-                <w:color w:val="222222"/>
+                <w:color w:val="1F2937"/>
                 <w:sz w:val="21"/>
               </w:rPr>
               <w:t>Víctima</w:t>
@@ -458,7 +474,7 @@
                 <w:rFonts w:ascii="Arial" w:hAnsi="Arial"/>
                 <w:b w:val="0"/>
                 <w:i w:val="0"/>
-                <w:color w:val="222222"/>
+                <w:color w:val="1F2937"/>
                 <w:sz w:val="21"/>
               </w:rPr>
               <w:t>{{ Victimas }}</w:t>
@@ -487,7 +503,7 @@
                 <w:rFonts w:ascii="Arial" w:hAnsi="Arial"/>
                 <w:b/>
                 <w:i w:val="0"/>
-                <w:color w:val="222222"/>
+                <w:color w:val="1F2937"/>
                 <w:sz w:val="21"/>
               </w:rPr>
               <w:t>Detenidos menores de edad</w:t>
@@ -514,7 +530,7 @@
                 <w:rFonts w:ascii="Arial" w:hAnsi="Arial"/>
                 <w:b w:val="0"/>
                 <w:i w:val="0"/>
-                <w:color w:val="222222"/>
+                <w:color w:val="1F2937"/>
                 <w:sz w:val="21"/>
               </w:rPr>
               <w:t>{{ Detenidos_Menores }}</w:t>
@@ -543,7 +559,7 @@
                 <w:rFonts w:ascii="Arial" w:hAnsi="Arial"/>
                 <w:b/>
                 <w:i w:val="0"/>
-                <w:color w:val="222222"/>
+                <w:color w:val="1F2937"/>
                 <w:sz w:val="21"/>
               </w:rPr>
               <w:t>Víctimas menores de edad</w:t>
@@ -570,7 +586,7 @@
                 <w:rFonts w:ascii="Arial" w:hAnsi="Arial"/>
                 <w:b w:val="0"/>
                 <w:i w:val="0"/>
-                <w:color w:val="222222"/>
+                <w:color w:val="1F2937"/>
                 <w:sz w:val="21"/>
               </w:rPr>
               <w:t>{{ Victimas_Menores }}</w:t>
@@ -599,7 +615,7 @@
                 <w:rFonts w:ascii="Arial" w:hAnsi="Arial"/>
                 <w:b/>
                 <w:i w:val="0"/>
-                <w:color w:val="222222"/>
+                <w:color w:val="1F2937"/>
                 <w:sz w:val="21"/>
               </w:rPr>
               <w:t>Resumen Diligencia</w:t>
@@ -626,7 +642,7 @@
                 <w:rFonts w:ascii="Arial" w:hAnsi="Arial"/>
                 <w:b w:val="0"/>
                 <w:i w:val="0"/>
-                <w:color w:val="222222"/>
+                <w:color w:val="1F2937"/>
                 <w:sz w:val="21"/>
               </w:rPr>
               <w:t>{{ Resumen_Relato }}</w:t>
@@ -638,6 +654,163 @@
     <w:p>
       <w:pPr>
         <w:spacing w:after="320"/>
+      </w:pPr>
+    </w:p>
+    <w:p>
+      <w:pPr>
+        <w:keepNext/>
+        <w:spacing w:before="100" w:after="100"/>
+      </w:pPr>
+      <w:r>
+        <w:rPr>
+          <w:rFonts w:ascii="Arial" w:hAnsi="Arial"/>
+          <w:b/>
+          <w:i w:val="0"/>
+          <w:color w:val="0B2A5B"/>
+          <w:sz w:val="21"/>
+        </w:rPr>
+        <w:t>INDICADORES DE NIÑOS, NIÑAS Y ADOLESCENTES</w:t>
+      </w:r>
+    </w:p>
+    <w:tbl>
+      <w:tblPr>
+        <w:tblW w:type="auto" w:w="0"/>
+        <w:jc w:val="center"/>
+        <w:tblLayout w:type="fixed"/>
+        <w:tblLook w:firstColumn="1" w:firstRow="1" w:lastColumn="0" w:lastRow="0" w:noHBand="0" w:noVBand="1" w:val="04A0"/>
+        <w:tblBorders>
+          <w:top w:val="single" w:sz="6" w:space="0" w:color="CBD5E1"/>
+          <w:bottom w:val="single" w:sz="6" w:space="0" w:color="CBD5E1"/>
+          <w:left w:val="single" w:sz="6" w:space="0" w:color="CBD5E1"/>
+          <w:right w:val="single" w:sz="6" w:space="0" w:color="CBD5E1"/>
+          <w:insideH w:val="single" w:sz="4" w:space="0" w:color="FFFFFF"/>
+          <w:insideV w:val="none"/>
+        </w:tblBorders>
+      </w:tblPr>
+      <w:tblGrid>
+        <w:gridCol w:w="4680"/>
+        <w:gridCol w:w="4680"/>
+      </w:tblGrid>
+      <w:tr>
+        <w:tc>
+          <w:tcPr>
+            <w:tcW w:type="dxa" w:w="4535"/>
+            <w:tcMar>
+              <w:top w:w="120" w:type="dxa"/>
+              <w:bottom w:w="120" w:type="dxa"/>
+              <w:left w:w="150" w:type="dxa"/>
+              <w:right w:w="150" w:type="dxa"/>
+            </w:tcMar>
+            <w:shd w:fill="E6F7FB"/>
+          </w:tcPr>
+          <w:p>
+            <w:pPr>
+              <w:spacing w:before="20" w:after="60"/>
+            </w:pPr>
+            <w:r>
+              <w:rPr>
+                <w:rFonts w:ascii="Arial" w:hAnsi="Arial"/>
+                <w:b/>
+                <w:i w:val="0"/>
+                <w:color w:val="0891B2"/>
+                <w:sz w:val="17"/>
+              </w:rPr>
+              <w:t>VÍCTIMAS MENORES DE EDAD (N.N.A.)</w:t>
+            </w:r>
+          </w:p>
+          <w:p>
+            <w:pPr>
+              <w:spacing w:before="0" w:after="20"/>
+            </w:pPr>
+            <w:r>
+              <w:rPr>
+                <w:rFonts w:ascii="Arial" w:hAnsi="Arial"/>
+                <w:b/>
+                <w:i w:val="0"/>
+                <w:color w:val="0891B2"/>
+                <w:sz w:val="40"/>
+              </w:rPr>
+              <w:t>{{ Victimas_Menores }}</w:t>
+            </w:r>
+          </w:p>
+          <w:p>
+            <w:pPr>
+              <w:spacing w:before="0" w:after="20"/>
+            </w:pPr>
+            <w:r>
+              <w:rPr>
+                <w:rFonts w:ascii="Arial" w:hAnsi="Arial"/>
+                <w:b w:val="0"/>
+                <w:i w:val="0"/>
+                <w:color w:val="64748B"/>
+                <w:sz w:val="17"/>
+              </w:rPr>
+              <w:t>Personas detectadas en el documento</w:t>
+            </w:r>
+          </w:p>
+        </w:tc>
+        <w:tc>
+          <w:tcPr>
+            <w:tcW w:type="dxa" w:w="4535"/>
+            <w:tcMar>
+              <w:top w:w="120" w:type="dxa"/>
+              <w:bottom w:w="120" w:type="dxa"/>
+              <w:left w:w="150" w:type="dxa"/>
+              <w:right w:w="150" w:type="dxa"/>
+            </w:tcMar>
+            <w:shd w:fill="FFF0E7"/>
+          </w:tcPr>
+          <w:p>
+            <w:pPr>
+              <w:spacing w:before="20" w:after="60"/>
+            </w:pPr>
+            <w:r>
+              <w:rPr>
+                <w:rFonts w:ascii="Arial" w:hAnsi="Arial"/>
+                <w:b/>
+                <w:i w:val="0"/>
+                <w:color w:val="EA580C"/>
+                <w:sz w:val="17"/>
+              </w:rPr>
+              <w:t>DETENIDOS MENORES DE EDAD (N.N.A.)</w:t>
+            </w:r>
+          </w:p>
+          <w:p>
+            <w:pPr>
+              <w:spacing w:before="0" w:after="20"/>
+            </w:pPr>
+            <w:r>
+              <w:rPr>
+                <w:rFonts w:ascii="Arial" w:hAnsi="Arial"/>
+                <w:b/>
+                <w:i w:val="0"/>
+                <w:color w:val="EA580C"/>
+                <w:sz w:val="40"/>
+              </w:rPr>
+              <w:t>{{ Detenidos_Menores }}</w:t>
+            </w:r>
+          </w:p>
+          <w:p>
+            <w:pPr>
+              <w:spacing w:before="0" w:after="20"/>
+            </w:pPr>
+            <w:r>
+              <w:rPr>
+                <w:rFonts w:ascii="Arial" w:hAnsi="Arial"/>
+                <w:b w:val="0"/>
+                <w:i w:val="0"/>
+                <w:color w:val="64748B"/>
+                <w:sz w:val="17"/>
+              </w:rPr>
+              <w:t>Personas detectadas en el documento</w:t>
+            </w:r>
+          </w:p>
+        </w:tc>
+      </w:tr>
+    </w:tbl>
+    <w:p>
+      <w:pPr>
+        <w:spacing w:after="140"/>
       </w:pPr>
     </w:p>
     <w:p>
@@ -656,7 +829,7 @@
           <w:rFonts w:ascii="Arial" w:hAnsi="Arial"/>
           <w:b/>
           <w:i w:val="0"/>
-          <w:color w:val="003366"/>
+          <w:color w:val="0B2A5B"/>
           <w:sz w:val="24"/>
         </w:rPr>
         <w:t>2. Entidades Identificadas</w:t>
@@ -678,7 +851,7 @@
           <w:rFonts w:ascii="Arial" w:hAnsi="Arial"/>
           <w:b/>
           <w:i w:val="0"/>
-          <w:color w:val="003366"/>
+          <w:color w:val="0B2A5B"/>
           <w:sz w:val="23"/>
         </w:rPr>
         <w:t>2.1 Vehículos Detectados</w:t>
@@ -691,11 +864,11 @@
         <w:tblLayout w:type="fixed"/>
         <w:tblLook w:firstColumn="1" w:firstRow="1" w:lastColumn="0" w:lastRow="0" w:noHBand="0" w:noVBand="1" w:val="04A0"/>
         <w:tblBorders>
-          <w:top w:val="single" w:sz="6" w:space="0" w:color="003366"/>
-          <w:bottom w:val="single" w:sz="6" w:space="0" w:color="003366"/>
-          <w:left w:val="single" w:sz="6" w:space="0" w:color="003366"/>
-          <w:right w:val="single" w:sz="6" w:space="0" w:color="003366"/>
-          <w:insideH w:val="single" w:sz="4" w:space="0" w:color="E2E8F0"/>
+          <w:top w:val="single" w:sz="6" w:space="0" w:color="2B5FAE"/>
+          <w:bottom w:val="single" w:sz="6" w:space="0" w:color="2B5FAE"/>
+          <w:left w:val="single" w:sz="6" w:space="0" w:color="2B5FAE"/>
+          <w:right w:val="single" w:sz="6" w:space="0" w:color="2B5FAE"/>
+          <w:insideH w:val="single" w:sz="4" w:space="0" w:color="D7DEE9"/>
           <w:insideV w:val="none"/>
         </w:tblBorders>
       </w:tblPr>
@@ -706,6 +879,36 @@
       <w:tr>
         <w:tc>
           <w:tcPr>
+            <w:tcW w:type="dxa" w:w="9360"/>
+            <w:gridSpan w:val="2"/>
+            <w:tcMar>
+              <w:top w:w="95" w:type="dxa"/>
+              <w:bottom w:w="95" w:type="dxa"/>
+              <w:left w:w="140" w:type="dxa"/>
+              <w:right w:w="140" w:type="dxa"/>
+            </w:tcMar>
+            <w:shd w:fill="2B5FAE"/>
+          </w:tcPr>
+          <w:p>
+            <w:pPr>
+              <w:spacing w:before="20" w:after="20"/>
+            </w:pPr>
+            <w:r>
+              <w:rPr>
+                <w:rFonts w:ascii="Arial" w:hAnsi="Arial"/>
+                <w:b/>
+                <w:i w:val="0"/>
+                <w:color w:val="FFFFFF"/>
+                <w:sz w:val="21"/>
+              </w:rPr>
+              <w:t>VEHÍCULOS DETECTADOS</w:t>
+            </w:r>
+          </w:p>
+        </w:tc>
+      </w:tr>
+      <w:tr>
+        <w:tc>
+          <w:tcPr>
             <w:tcW w:type="dxa" w:w="2835"/>
             <w:tcMar>
               <w:top w:w="70" w:type="dxa"/>
@@ -713,7 +916,7 @@
               <w:left w:w="120" w:type="dxa"/>
               <w:right w:w="120" w:type="dxa"/>
             </w:tcMar>
-            <w:shd w:fill="F8FAFC"/>
+            <w:shd w:fill="EAF2FF"/>
           </w:tcPr>
           <w:p>
             <w:pPr>
@@ -724,7 +927,7 @@
                 <w:rFonts w:ascii="Arial" w:hAnsi="Arial"/>
                 <w:b/>
                 <w:i w:val="0"/>
-                <w:color w:val="003366"/>
+                <w:color w:val="2B5FAE"/>
                 <w:sz w:val="21"/>
               </w:rPr>
               <w:t>Marcas:</w:t>
@@ -751,7 +954,7 @@
                 <w:rFonts w:ascii="Arial" w:hAnsi="Arial"/>
                 <w:b w:val="0"/>
                 <w:i w:val="0"/>
-                <w:color w:val="222222"/>
+                <w:color w:val="1F2937"/>
                 <w:sz w:val="21"/>
               </w:rPr>
               <w:t>{{ Marcas }}</w:t>
@@ -769,7 +972,7 @@
               <w:left w:w="120" w:type="dxa"/>
               <w:right w:w="120" w:type="dxa"/>
             </w:tcMar>
-            <w:shd w:fill="F8FAFC"/>
+            <w:shd w:fill="EAF2FF"/>
           </w:tcPr>
           <w:p>
             <w:pPr>
@@ -780,7 +983,7 @@
                 <w:rFonts w:ascii="Arial" w:hAnsi="Arial"/>
                 <w:b/>
                 <w:i w:val="0"/>
-                <w:color w:val="003366"/>
+                <w:color w:val="2B5FAE"/>
                 <w:sz w:val="21"/>
               </w:rPr>
               <w:t>Modelos:</w:t>
@@ -807,7 +1010,7 @@
                 <w:rFonts w:ascii="Arial" w:hAnsi="Arial"/>
                 <w:b w:val="0"/>
                 <w:i w:val="0"/>
-                <w:color w:val="222222"/>
+                <w:color w:val="1F2937"/>
                 <w:sz w:val="21"/>
               </w:rPr>
               <w:t>{{ Modelos }}</w:t>
@@ -825,7 +1028,7 @@
               <w:left w:w="120" w:type="dxa"/>
               <w:right w:w="120" w:type="dxa"/>
             </w:tcMar>
-            <w:shd w:fill="F8FAFC"/>
+            <w:shd w:fill="EAF2FF"/>
           </w:tcPr>
           <w:p>
             <w:pPr>
@@ -836,7 +1039,7 @@
                 <w:rFonts w:ascii="Arial" w:hAnsi="Arial"/>
                 <w:b/>
                 <w:i w:val="0"/>
-                <w:color w:val="003366"/>
+                <w:color w:val="2B5FAE"/>
                 <w:sz w:val="21"/>
               </w:rPr>
               <w:t>Colores:</w:t>
@@ -863,7 +1066,7 @@
                 <w:rFonts w:ascii="Arial" w:hAnsi="Arial"/>
                 <w:b w:val="0"/>
                 <w:i w:val="0"/>
-                <w:color w:val="222222"/>
+                <w:color w:val="1F2937"/>
                 <w:sz w:val="21"/>
               </w:rPr>
               <w:t>{{ Colores }}</w:t>
@@ -881,7 +1084,7 @@
               <w:left w:w="120" w:type="dxa"/>
               <w:right w:w="120" w:type="dxa"/>
             </w:tcMar>
-            <w:shd w:fill="F8FAFC"/>
+            <w:shd w:fill="EAF2FF"/>
           </w:tcPr>
           <w:p>
             <w:pPr>
@@ -892,7 +1095,7 @@
                 <w:rFonts w:ascii="Arial" w:hAnsi="Arial"/>
                 <w:b/>
                 <w:i w:val="0"/>
-                <w:color w:val="003366"/>
+                <w:color w:val="2B5FAE"/>
                 <w:sz w:val="21"/>
               </w:rPr>
               <w:t>Años de Fabricación:</w:t>
@@ -919,7 +1122,7 @@
                 <w:rFonts w:ascii="Arial" w:hAnsi="Arial"/>
                 <w:b w:val="0"/>
                 <w:i w:val="0"/>
-                <w:color w:val="222222"/>
+                <w:color w:val="1F2937"/>
                 <w:sz w:val="21"/>
               </w:rPr>
               <w:t>{{ Anios }}</w:t>
@@ -937,7 +1140,7 @@
               <w:left w:w="120" w:type="dxa"/>
               <w:right w:w="120" w:type="dxa"/>
             </w:tcMar>
-            <w:shd w:fill="F8FAFC"/>
+            <w:shd w:fill="EAF2FF"/>
           </w:tcPr>
           <w:p>
             <w:pPr>
@@ -948,7 +1151,7 @@
                 <w:rFonts w:ascii="Arial" w:hAnsi="Arial"/>
                 <w:b/>
                 <w:i w:val="0"/>
-                <w:color w:val="003366"/>
+                <w:color w:val="2B5FAE"/>
                 <w:sz w:val="21"/>
               </w:rPr>
               <w:t>Patentes / PPU:</w:t>
@@ -975,7 +1178,7 @@
                 <w:rFonts w:ascii="Arial" w:hAnsi="Arial"/>
                 <w:b w:val="0"/>
                 <w:i w:val="0"/>
-                <w:color w:val="222222"/>
+                <w:color w:val="1F2937"/>
                 <w:sz w:val="21"/>
               </w:rPr>
               <w:t>{{ Patentes_PPU }}</w:t>
@@ -986,7 +1189,7 @@
     </w:tbl>
     <w:p>
       <w:pPr>
-        <w:spacing w:after="120"/>
+        <w:spacing w:after="140"/>
       </w:pPr>
     </w:p>
     <w:p>
@@ -1010,7 +1213,7 @@
           <w:rFonts w:ascii="Arial" w:hAnsi="Arial"/>
           <w:b/>
           <w:i w:val="0"/>
-          <w:color w:val="003366"/>
+          <w:color w:val="0B2A5B"/>
           <w:sz w:val="23"/>
         </w:rPr>
         <w:t>2.2 Armas de Fuego Detectadas</w:t>
@@ -1023,11 +1226,11 @@
         <w:tblLayout w:type="fixed"/>
         <w:tblLook w:firstColumn="1" w:firstRow="1" w:lastColumn="0" w:lastRow="0" w:noHBand="0" w:noVBand="1" w:val="04A0"/>
         <w:tblBorders>
-          <w:top w:val="single" w:sz="6" w:space="0" w:color="003366"/>
-          <w:bottom w:val="single" w:sz="6" w:space="0" w:color="003366"/>
-          <w:left w:val="single" w:sz="6" w:space="0" w:color="003366"/>
-          <w:right w:val="single" w:sz="6" w:space="0" w:color="003366"/>
-          <w:insideH w:val="single" w:sz="4" w:space="0" w:color="E2E8F0"/>
+          <w:top w:val="single" w:sz="6" w:space="0" w:color="D92D20"/>
+          <w:bottom w:val="single" w:sz="6" w:space="0" w:color="D92D20"/>
+          <w:left w:val="single" w:sz="6" w:space="0" w:color="D92D20"/>
+          <w:right w:val="single" w:sz="6" w:space="0" w:color="D92D20"/>
+          <w:insideH w:val="single" w:sz="4" w:space="0" w:color="D7DEE9"/>
           <w:insideV w:val="none"/>
         </w:tblBorders>
       </w:tblPr>
@@ -1038,6 +1241,36 @@
       <w:tr>
         <w:tc>
           <w:tcPr>
+            <w:tcW w:type="dxa" w:w="9360"/>
+            <w:gridSpan w:val="2"/>
+            <w:tcMar>
+              <w:top w:w="95" w:type="dxa"/>
+              <w:bottom w:w="95" w:type="dxa"/>
+              <w:left w:w="140" w:type="dxa"/>
+              <w:right w:w="140" w:type="dxa"/>
+            </w:tcMar>
+            <w:shd w:fill="D92D20"/>
+          </w:tcPr>
+          <w:p>
+            <w:pPr>
+              <w:spacing w:before="20" w:after="20"/>
+            </w:pPr>
+            <w:r>
+              <w:rPr>
+                <w:rFonts w:ascii="Arial" w:hAnsi="Arial"/>
+                <w:b/>
+                <w:i w:val="0"/>
+                <w:color w:val="FFFFFF"/>
+                <w:sz w:val="21"/>
+              </w:rPr>
+              <w:t>ARMAS DE FUEGO DETECTADAS</w:t>
+            </w:r>
+          </w:p>
+        </w:tc>
+      </w:tr>
+      <w:tr>
+        <w:tc>
+          <w:tcPr>
             <w:tcW w:type="dxa" w:w="2835"/>
             <w:tcMar>
               <w:top w:w="70" w:type="dxa"/>
@@ -1045,7 +1278,7 @@
               <w:left w:w="120" w:type="dxa"/>
               <w:right w:w="120" w:type="dxa"/>
             </w:tcMar>
-            <w:shd w:fill="F8FAFC"/>
+            <w:shd w:fill="FDECEC"/>
           </w:tcPr>
           <w:p>
             <w:pPr>
@@ -1056,7 +1289,7 @@
                 <w:rFonts w:ascii="Arial" w:hAnsi="Arial"/>
                 <w:b/>
                 <w:i w:val="0"/>
-                <w:color w:val="003366"/>
+                <w:color w:val="D92D20"/>
                 <w:sz w:val="21"/>
               </w:rPr>
               <w:t>Marcas:</w:t>
@@ -1083,7 +1316,7 @@
                 <w:rFonts w:ascii="Arial" w:hAnsi="Arial"/>
                 <w:b w:val="0"/>
                 <w:i w:val="0"/>
-                <w:color w:val="222222"/>
+                <w:color w:val="1F2937"/>
                 <w:sz w:val="21"/>
               </w:rPr>
               <w:t>{{ Marcas_Arma }}</w:t>
@@ -1101,7 +1334,7 @@
               <w:left w:w="120" w:type="dxa"/>
               <w:right w:w="120" w:type="dxa"/>
             </w:tcMar>
-            <w:shd w:fill="F8FAFC"/>
+            <w:shd w:fill="FDECEC"/>
           </w:tcPr>
           <w:p>
             <w:pPr>
@@ -1112,7 +1345,7 @@
                 <w:rFonts w:ascii="Arial" w:hAnsi="Arial"/>
                 <w:b/>
                 <w:i w:val="0"/>
-                <w:color w:val="003366"/>
+                <w:color w:val="D92D20"/>
                 <w:sz w:val="21"/>
               </w:rPr>
               <w:t>Modelos:</w:t>
@@ -1139,7 +1372,7 @@
                 <w:rFonts w:ascii="Arial" w:hAnsi="Arial"/>
                 <w:b w:val="0"/>
                 <w:i w:val="0"/>
-                <w:color w:val="222222"/>
+                <w:color w:val="1F2937"/>
                 <w:sz w:val="21"/>
               </w:rPr>
               <w:t>{{ Modelos_Arma }}</w:t>
@@ -1157,7 +1390,7 @@
               <w:left w:w="120" w:type="dxa"/>
               <w:right w:w="120" w:type="dxa"/>
             </w:tcMar>
-            <w:shd w:fill="F8FAFC"/>
+            <w:shd w:fill="FDECEC"/>
           </w:tcPr>
           <w:p>
             <w:pPr>
@@ -1168,7 +1401,7 @@
                 <w:rFonts w:ascii="Arial" w:hAnsi="Arial"/>
                 <w:b/>
                 <w:i w:val="0"/>
-                <w:color w:val="003366"/>
+                <w:color w:val="D92D20"/>
                 <w:sz w:val="21"/>
               </w:rPr>
               <w:t>Tipo de Arma:</w:t>
@@ -1195,7 +1428,7 @@
                 <w:rFonts w:ascii="Arial" w:hAnsi="Arial"/>
                 <w:b w:val="0"/>
                 <w:i w:val="0"/>
-                <w:color w:val="222222"/>
+                <w:color w:val="1F2937"/>
                 <w:sz w:val="21"/>
               </w:rPr>
               <w:t>{{ Tipo }}</w:t>
@@ -1213,7 +1446,7 @@
               <w:left w:w="120" w:type="dxa"/>
               <w:right w:w="120" w:type="dxa"/>
             </w:tcMar>
-            <w:shd w:fill="F8FAFC"/>
+            <w:shd w:fill="FDECEC"/>
           </w:tcPr>
           <w:p>
             <w:pPr>
@@ -1224,7 +1457,7 @@
                 <w:rFonts w:ascii="Arial" w:hAnsi="Arial"/>
                 <w:b/>
                 <w:i w:val="0"/>
-                <w:color w:val="003366"/>
+                <w:color w:val="D92D20"/>
                 <w:sz w:val="21"/>
               </w:rPr>
               <w:t>Calibres:</w:t>
@@ -1251,7 +1484,7 @@
                 <w:rFonts w:ascii="Arial" w:hAnsi="Arial"/>
                 <w:b w:val="0"/>
                 <w:i w:val="0"/>
-                <w:color w:val="222222"/>
+                <w:color w:val="1F2937"/>
                 <w:sz w:val="21"/>
               </w:rPr>
               <w:t>{{ Calibres }}</w:t>
@@ -1269,7 +1502,7 @@
               <w:left w:w="120" w:type="dxa"/>
               <w:right w:w="120" w:type="dxa"/>
             </w:tcMar>
-            <w:shd w:fill="F8FAFC"/>
+            <w:shd w:fill="FDECEC"/>
           </w:tcPr>
           <w:p>
             <w:pPr>
@@ -1280,7 +1513,7 @@
                 <w:rFonts w:ascii="Arial" w:hAnsi="Arial"/>
                 <w:b/>
                 <w:i w:val="0"/>
-                <w:color w:val="003366"/>
+                <w:color w:val="D92D20"/>
                 <w:sz w:val="21"/>
               </w:rPr>
               <w:t>Números de Serie:</w:t>
@@ -1307,7 +1540,7 @@
                 <w:rFonts w:ascii="Arial" w:hAnsi="Arial"/>
                 <w:b w:val="0"/>
                 <w:i w:val="0"/>
-                <w:color w:val="222222"/>
+                <w:color w:val="1F2937"/>
                 <w:sz w:val="21"/>
               </w:rPr>
               <w:t>{{ Numerosdeserie }}</w:t>
@@ -1318,7 +1551,7 @@
     </w:tbl>
     <w:p>
       <w:pPr>
-        <w:spacing w:after="120"/>
+        <w:spacing w:after="140"/>
       </w:pPr>
     </w:p>
     <w:p>
@@ -1342,7 +1575,7 @@
           <w:rFonts w:ascii="Arial" w:hAnsi="Arial"/>
           <w:b/>
           <w:i w:val="0"/>
-          <w:color w:val="003366"/>
+          <w:color w:val="0B2A5B"/>
           <w:sz w:val="23"/>
         </w:rPr>
         <w:t>2.3 Sustancias Ilícitas Detectadas</w:t>
@@ -1355,11 +1588,11 @@
         <w:tblLayout w:type="fixed"/>
         <w:tblLook w:firstColumn="1" w:firstRow="1" w:lastColumn="0" w:lastRow="0" w:noHBand="0" w:noVBand="1" w:val="04A0"/>
         <w:tblBorders>
-          <w:top w:val="single" w:sz="6" w:space="0" w:color="003366"/>
-          <w:bottom w:val="single" w:sz="6" w:space="0" w:color="003366"/>
-          <w:left w:val="single" w:sz="6" w:space="0" w:color="003366"/>
-          <w:right w:val="single" w:sz="6" w:space="0" w:color="003366"/>
-          <w:insideH w:val="single" w:sz="4" w:space="0" w:color="E2E8F0"/>
+          <w:top w:val="single" w:sz="6" w:space="0" w:color="C69214"/>
+          <w:bottom w:val="single" w:sz="6" w:space="0" w:color="C69214"/>
+          <w:left w:val="single" w:sz="6" w:space="0" w:color="C69214"/>
+          <w:right w:val="single" w:sz="6" w:space="0" w:color="C69214"/>
+          <w:insideH w:val="single" w:sz="4" w:space="0" w:color="D7DEE9"/>
           <w:insideV w:val="none"/>
         </w:tblBorders>
       </w:tblPr>
@@ -1370,6 +1603,36 @@
       <w:tr>
         <w:tc>
           <w:tcPr>
+            <w:tcW w:type="dxa" w:w="9360"/>
+            <w:gridSpan w:val="2"/>
+            <w:tcMar>
+              <w:top w:w="95" w:type="dxa"/>
+              <w:bottom w:w="95" w:type="dxa"/>
+              <w:left w:w="140" w:type="dxa"/>
+              <w:right w:w="140" w:type="dxa"/>
+            </w:tcMar>
+            <w:shd w:fill="C69214"/>
+          </w:tcPr>
+          <w:p>
+            <w:pPr>
+              <w:spacing w:before="20" w:after="20"/>
+            </w:pPr>
+            <w:r>
+              <w:rPr>
+                <w:rFonts w:ascii="Arial" w:hAnsi="Arial"/>
+                <w:b/>
+                <w:i w:val="0"/>
+                <w:color w:val="FFFFFF"/>
+                <w:sz w:val="21"/>
+              </w:rPr>
+              <w:t>SUSTANCIAS ILÍCITAS DETECTADAS</w:t>
+            </w:r>
+          </w:p>
+        </w:tc>
+      </w:tr>
+      <w:tr>
+        <w:tc>
+          <w:tcPr>
             <w:tcW w:type="dxa" w:w="2835"/>
             <w:tcMar>
               <w:top w:w="70" w:type="dxa"/>
@@ -1377,7 +1640,7 @@
               <w:left w:w="120" w:type="dxa"/>
               <w:right w:w="120" w:type="dxa"/>
             </w:tcMar>
-            <w:shd w:fill="F8FAFC"/>
+            <w:shd w:fill="FFF7DF"/>
           </w:tcPr>
           <w:p>
             <w:pPr>
@@ -1388,7 +1651,7 @@
                 <w:rFonts w:ascii="Arial" w:hAnsi="Arial"/>
                 <w:b/>
                 <w:i w:val="0"/>
-                <w:color w:val="003366"/>
+                <w:color w:val="A07000"/>
                 <w:sz w:val="21"/>
               </w:rPr>
               <w:t>Sustancias:</w:t>
@@ -1415,7 +1678,7 @@
                 <w:rFonts w:ascii="Arial" w:hAnsi="Arial"/>
                 <w:b w:val="0"/>
                 <w:i w:val="0"/>
-                <w:color w:val="222222"/>
+                <w:color w:val="1F2937"/>
                 <w:sz w:val="21"/>
               </w:rPr>
               <w:t>{{ Sustancias }}</w:t>
@@ -1433,7 +1696,7 @@
               <w:left w:w="120" w:type="dxa"/>
               <w:right w:w="120" w:type="dxa"/>
             </w:tcMar>
-            <w:shd w:fill="F8FAFC"/>
+            <w:shd w:fill="FFF7DF"/>
           </w:tcPr>
           <w:p>
             <w:pPr>
@@ -1444,7 +1707,7 @@
                 <w:rFonts w:ascii="Arial" w:hAnsi="Arial"/>
                 <w:b/>
                 <w:i w:val="0"/>
-                <w:color w:val="003366"/>
+                <w:color w:val="A07000"/>
                 <w:sz w:val="21"/>
               </w:rPr>
               <w:t>Medidas / Pesajes:</w:t>
@@ -1471,7 +1734,7 @@
                 <w:rFonts w:ascii="Arial" w:hAnsi="Arial"/>
                 <w:b w:val="0"/>
                 <w:i w:val="0"/>
-                <w:color w:val="222222"/>
+                <w:color w:val="1F2937"/>
                 <w:sz w:val="21"/>
               </w:rPr>
               <w:t>{{ Medidas_pesajes }}</w:t>
@@ -1482,7 +1745,7 @@
     </w:tbl>
     <w:p>
       <w:pPr>
-        <w:spacing w:after="120"/>
+        <w:spacing w:after="140"/>
       </w:pPr>
     </w:p>
     <w:p>
@@ -1506,7 +1769,7 @@
           <w:rFonts w:ascii="Arial" w:hAnsi="Arial"/>
           <w:b/>
           <w:i w:val="0"/>
-          <w:color w:val="003366"/>
+          <w:color w:val="0B2A5B"/>
           <w:sz w:val="23"/>
         </w:rPr>
         <w:t>2.4 Personas Involucradas</w:t>
@@ -1519,11 +1782,11 @@
         <w:tblLayout w:type="fixed"/>
         <w:tblLook w:firstColumn="1" w:firstRow="1" w:lastColumn="0" w:lastRow="0" w:noHBand="0" w:noVBand="1" w:val="04A0"/>
         <w:tblBorders>
-          <w:top w:val="single" w:sz="6" w:space="0" w:color="003366"/>
-          <w:bottom w:val="single" w:sz="6" w:space="0" w:color="003366"/>
-          <w:left w:val="single" w:sz="6" w:space="0" w:color="003366"/>
-          <w:right w:val="single" w:sz="6" w:space="0" w:color="003366"/>
-          <w:insideH w:val="single" w:sz="4" w:space="0" w:color="E2E8F0"/>
+          <w:top w:val="single" w:sz="6" w:space="0" w:color="7C3AED"/>
+          <w:bottom w:val="single" w:sz="6" w:space="0" w:color="7C3AED"/>
+          <w:left w:val="single" w:sz="6" w:space="0" w:color="7C3AED"/>
+          <w:right w:val="single" w:sz="6" w:space="0" w:color="7C3AED"/>
+          <w:insideH w:val="single" w:sz="4" w:space="0" w:color="D7DEE9"/>
           <w:insideV w:val="none"/>
         </w:tblBorders>
       </w:tblPr>
@@ -1534,6 +1797,36 @@
       <w:tr>
         <w:tc>
           <w:tcPr>
+            <w:tcW w:type="dxa" w:w="9360"/>
+            <w:gridSpan w:val="2"/>
+            <w:tcMar>
+              <w:top w:w="95" w:type="dxa"/>
+              <w:bottom w:w="95" w:type="dxa"/>
+              <w:left w:w="140" w:type="dxa"/>
+              <w:right w:w="140" w:type="dxa"/>
+            </w:tcMar>
+            <w:shd w:fill="7C3AED"/>
+          </w:tcPr>
+          <w:p>
+            <w:pPr>
+              <w:spacing w:before="20" w:after="20"/>
+            </w:pPr>
+            <w:r>
+              <w:rPr>
+                <w:rFonts w:ascii="Arial" w:hAnsi="Arial"/>
+                <w:b/>
+                <w:i w:val="0"/>
+                <w:color w:val="FFFFFF"/>
+                <w:sz w:val="21"/>
+              </w:rPr>
+              <w:t>PERSONAS INVOLUCRADAS Y N.N.A.</w:t>
+            </w:r>
+          </w:p>
+        </w:tc>
+      </w:tr>
+      <w:tr>
+        <w:tc>
+          <w:tcPr>
             <w:tcW w:type="dxa" w:w="2835"/>
             <w:tcMar>
               <w:top w:w="70" w:type="dxa"/>
@@ -1541,7 +1834,7 @@
               <w:left w:w="120" w:type="dxa"/>
               <w:right w:w="120" w:type="dxa"/>
             </w:tcMar>
-            <w:shd w:fill="F8FAFC"/>
+            <w:shd w:fill="F3E8FF"/>
           </w:tcPr>
           <w:p>
             <w:pPr>
@@ -1552,7 +1845,7 @@
                 <w:rFonts w:ascii="Arial" w:hAnsi="Arial"/>
                 <w:b/>
                 <w:i w:val="0"/>
-                <w:color w:val="003366"/>
+                <w:color w:val="7C3AED"/>
                 <w:sz w:val="21"/>
               </w:rPr>
               <w:t>Detenidos / Imputados:</w:t>
@@ -1579,7 +1872,7 @@
                 <w:rFonts w:ascii="Arial" w:hAnsi="Arial"/>
                 <w:b w:val="0"/>
                 <w:i w:val="0"/>
-                <w:color w:val="222222"/>
+                <w:color w:val="1F2937"/>
                 <w:sz w:val="21"/>
               </w:rPr>
               <w:t>{{ Detenidos }}</w:t>
@@ -1597,7 +1890,7 @@
               <w:left w:w="120" w:type="dxa"/>
               <w:right w:w="120" w:type="dxa"/>
             </w:tcMar>
-            <w:shd w:fill="F8FAFC"/>
+            <w:shd w:fill="F3E8FF"/>
           </w:tcPr>
           <w:p>
             <w:pPr>
@@ -1608,7 +1901,7 @@
                 <w:rFonts w:ascii="Arial" w:hAnsi="Arial"/>
                 <w:b/>
                 <w:i w:val="0"/>
-                <w:color w:val="003366"/>
+                <w:color w:val="7C3AED"/>
                 <w:sz w:val="21"/>
               </w:rPr>
               <w:t>Víctimas Identificadas:</w:t>
@@ -1635,7 +1928,7 @@
                 <w:rFonts w:ascii="Arial" w:hAnsi="Arial"/>
                 <w:b w:val="0"/>
                 <w:i w:val="0"/>
-                <w:color w:val="222222"/>
+                <w:color w:val="1F2937"/>
                 <w:sz w:val="21"/>
               </w:rPr>
               <w:t>{{ Victimas }}</w:t>
@@ -1653,7 +1946,7 @@
               <w:left w:w="120" w:type="dxa"/>
               <w:right w:w="120" w:type="dxa"/>
             </w:tcMar>
-            <w:shd w:fill="F8FAFC"/>
+            <w:shd w:fill="F3E8FF"/>
           </w:tcPr>
           <w:p>
             <w:pPr>
@@ -1664,7 +1957,7 @@
                 <w:rFonts w:ascii="Arial" w:hAnsi="Arial"/>
                 <w:b/>
                 <w:i w:val="0"/>
-                <w:color w:val="003366"/>
+                <w:color w:val="7C3AED"/>
                 <w:sz w:val="21"/>
               </w:rPr>
               <w:t>Detenidos menores de edad:</w:t>
@@ -1691,7 +1984,7 @@
                 <w:rFonts w:ascii="Arial" w:hAnsi="Arial"/>
                 <w:b w:val="0"/>
                 <w:i w:val="0"/>
-                <w:color w:val="222222"/>
+                <w:color w:val="1F2937"/>
                 <w:sz w:val="21"/>
               </w:rPr>
               <w:t>{{ Detenidos_Menores }}</w:t>
@@ -1709,7 +2002,7 @@
               <w:left w:w="120" w:type="dxa"/>
               <w:right w:w="120" w:type="dxa"/>
             </w:tcMar>
-            <w:shd w:fill="F8FAFC"/>
+            <w:shd w:fill="F3E8FF"/>
           </w:tcPr>
           <w:p>
             <w:pPr>
@@ -1720,7 +2013,7 @@
                 <w:rFonts w:ascii="Arial" w:hAnsi="Arial"/>
                 <w:b/>
                 <w:i w:val="0"/>
-                <w:color w:val="003366"/>
+                <w:color w:val="7C3AED"/>
                 <w:sz w:val="21"/>
               </w:rPr>
               <w:t>Víctimas menores de edad:</w:t>
@@ -1747,7 +2040,7 @@
                 <w:rFonts w:ascii="Arial" w:hAnsi="Arial"/>
                 <w:b w:val="0"/>
                 <w:i w:val="0"/>
-                <w:color w:val="222222"/>
+                <w:color w:val="1F2937"/>
                 <w:sz w:val="21"/>
               </w:rPr>
               <w:t>{{ Victimas_Menores }}</w:t>
@@ -1755,10 +2048,122 @@
           </w:p>
         </w:tc>
       </w:tr>
+      <w:tr>
+        <w:tc>
+          <w:tcPr>
+            <w:tcW w:type="dxa" w:w="2835"/>
+            <w:tcMar>
+              <w:top w:w="70" w:type="dxa"/>
+              <w:bottom w:w="70" w:type="dxa"/>
+              <w:left w:w="120" w:type="dxa"/>
+              <w:right w:w="120" w:type="dxa"/>
+            </w:tcMar>
+            <w:shd w:fill="F3E8FF"/>
+          </w:tcPr>
+          <w:p>
+            <w:pPr>
+              <w:spacing w:before="40" w:after="40" w:line="276" w:lineRule="auto"/>
+            </w:pPr>
+            <w:r>
+              <w:rPr>
+                <w:rFonts w:ascii="Arial" w:hAnsi="Arial"/>
+                <w:b/>
+                <w:i w:val="0"/>
+                <w:color w:val="7C3AED"/>
+                <w:sz w:val="21"/>
+              </w:rPr>
+              <w:t>Detalle detenidos menores:</w:t>
+            </w:r>
+          </w:p>
+        </w:tc>
+        <w:tc>
+          <w:tcPr>
+            <w:tcW w:type="dxa" w:w="6236"/>
+            <w:tcMar>
+              <w:top w:w="70" w:type="dxa"/>
+              <w:bottom w:w="70" w:type="dxa"/>
+              <w:left w:w="120" w:type="dxa"/>
+              <w:right w:w="120" w:type="dxa"/>
+            </w:tcMar>
+            <w:shd w:fill="FFFFFF"/>
+          </w:tcPr>
+          <w:p>
+            <w:pPr>
+              <w:spacing w:before="40" w:after="40" w:line="276" w:lineRule="auto"/>
+            </w:pPr>
+            <w:r>
+              <w:rPr>
+                <w:rFonts w:ascii="Arial" w:hAnsi="Arial"/>
+                <w:b w:val="0"/>
+                <w:i w:val="0"/>
+                <w:color w:val="1F2937"/>
+                <w:sz w:val="21"/>
+              </w:rPr>
+              <w:t>{{ Detenidos_Menores_Detalle }}</w:t>
+            </w:r>
+          </w:p>
+        </w:tc>
+      </w:tr>
+      <w:tr>
+        <w:tc>
+          <w:tcPr>
+            <w:tcW w:type="dxa" w:w="2835"/>
+            <w:tcMar>
+              <w:top w:w="70" w:type="dxa"/>
+              <w:bottom w:w="70" w:type="dxa"/>
+              <w:left w:w="120" w:type="dxa"/>
+              <w:right w:w="120" w:type="dxa"/>
+            </w:tcMar>
+            <w:shd w:fill="F3E8FF"/>
+          </w:tcPr>
+          <w:p>
+            <w:pPr>
+              <w:spacing w:before="40" w:after="40" w:line="276" w:lineRule="auto"/>
+            </w:pPr>
+            <w:r>
+              <w:rPr>
+                <w:rFonts w:ascii="Arial" w:hAnsi="Arial"/>
+                <w:b/>
+                <w:i w:val="0"/>
+                <w:color w:val="7C3AED"/>
+                <w:sz w:val="21"/>
+              </w:rPr>
+              <w:t>Detalle víctimas menores:</w:t>
+            </w:r>
+          </w:p>
+        </w:tc>
+        <w:tc>
+          <w:tcPr>
+            <w:tcW w:type="dxa" w:w="6236"/>
+            <w:tcMar>
+              <w:top w:w="70" w:type="dxa"/>
+              <w:bottom w:w="70" w:type="dxa"/>
+              <w:left w:w="120" w:type="dxa"/>
+              <w:right w:w="120" w:type="dxa"/>
+            </w:tcMar>
+            <w:shd w:fill="FFFFFF"/>
+          </w:tcPr>
+          <w:p>
+            <w:pPr>
+              <w:spacing w:before="40" w:after="40" w:line="276" w:lineRule="auto"/>
+            </w:pPr>
+            <w:r>
+              <w:rPr>
+                <w:rFonts w:ascii="Arial" w:hAnsi="Arial"/>
+                <w:b w:val="0"/>
+                <w:i w:val="0"/>
+                <w:color w:val="1F2937"/>
+                <w:sz w:val="21"/>
+              </w:rPr>
+              <w:t>{{ Victimas_Menores_Detalle }}</w:t>
+            </w:r>
+          </w:p>
+        </w:tc>
+      </w:tr>
     </w:tbl>
     <w:p>
       <w:pPr>
-        <w:spacing w:after="120"/>
+        <w:spacing w:after="140"/>
       </w:pPr>
     </w:p>
     <w:p>
@@ -1796,7 +2201,7 @@
           <w:rFonts w:ascii="Arial" w:hAnsi="Arial"/>
           <w:b w:val="0"/>
           <w:i w:val="0"/>
-          <w:color w:val="222222"/>
+          <w:color w:val="1F2937"/>
           <w:sz w:val="22"/>
         </w:rPr>
         <w:t>{{ advertencia_faltantes }}</w:t>
@@ -1832,7 +2237,7 @@
         <w:rFonts w:ascii="Arial" w:hAnsi="Arial"/>
         <w:b w:val="0"/>
         <w:i/>
-        <w:color w:val="646464"/>
+        <w:color w:val="64748B"/>
         <w:sz w:val="17"/>
       </w:rPr>
       <w:t>Documento emitido para análisis policial — Estándar APA 7ma Edición — Confidencial</w:t>
@@ -1929,7 +2334,7 @@
               <w:rFonts w:ascii="Arial" w:hAnsi="Arial"/>
               <w:b/>
               <w:i w:val="0"/>
-              <w:color w:val="003366"/>
+              <w:color w:val="0B2A5B"/>
               <w:sz w:val="20"/>
             </w:rPr>
             <w:t>POLICÍA DE INVESTIGACIONES DE CHILE</w:t>
@@ -1945,7 +2350,7 @@
               <w:rFonts w:ascii="Arial" w:hAnsi="Arial"/>
               <w:b w:val="0"/>
               <w:i/>
-              <w:color w:val="646464"/>
+              <w:color w:val="64748B"/>
               <w:sz w:val="17"/>
             </w:rPr>
             <w:t>Sistema de Análisis Documental, OCR y Estadísticas — SIAD</w:t>

</xml_diff>

<commit_message>
feat: integrar mejoras de SIAD desde Ashley
</commit_message>
<xml_diff>
--- a/siad/docs/Plantilla_Word.docx
+++ b/siad/docs/Plantilla_Word.docx
@@ -12,10 +12,26 @@
           <w:rFonts w:ascii="Arial" w:hAnsi="Arial"/>
           <w:b/>
           <w:i w:val="0"/>
-          <w:color w:val="003366"/>
+          <w:color w:val="0B2A5B"/>
           <w:sz w:val="28"/>
         </w:rPr>
         <w:t>INFORME DE ANÁLISIS DOCUMENTAL</w:t>
+      </w:r>
+    </w:p>
+    <w:p>
+      <w:pPr>
+        <w:spacing w:before="0" w:after="200"/>
+        <w:jc w:val="center"/>
+      </w:pPr>
+      <w:r>
+        <w:rPr>
+          <w:rFonts w:ascii="Arial" w:hAnsi="Arial"/>
+          <w:b/>
+          <w:i w:val="0"/>
+          <w:color w:val="C69214"/>
+          <w:sz w:val="15"/>
+        </w:rPr>
+        <w:t>━━━━━━━━━━━━━━━━━━━━━━━━━━━━━━━━</w:t>
       </w:r>
     </w:p>
     <w:tbl>
@@ -58,7 +74,7 @@
                 <w:rFonts w:ascii="Arial" w:hAnsi="Arial"/>
                 <w:b/>
                 <w:i w:val="0"/>
-                <w:color w:val="003366"/>
+                <w:color w:val="0B2A5B"/>
                 <w:sz w:val="21"/>
               </w:rPr>
               <w:t>Documento Analizado:</w:t>
@@ -85,7 +101,7 @@
                 <w:rFonts w:ascii="Arial" w:hAnsi="Arial"/>
                 <w:b w:val="0"/>
                 <w:i w:val="0"/>
-                <w:color w:val="222222"/>
+                <w:color w:val="1F2937"/>
                 <w:sz w:val="21"/>
               </w:rPr>
               <w:t>{{ Nombre_Documento }}</w:t>
@@ -114,7 +130,7 @@
                 <w:rFonts w:ascii="Arial" w:hAnsi="Arial"/>
                 <w:b/>
                 <w:i w:val="0"/>
-                <w:color w:val="003366"/>
+                <w:color w:val="0B2A5B"/>
                 <w:sz w:val="21"/>
               </w:rPr>
               <w:t>Fecha de Generación:</w:t>
@@ -141,7 +157,7 @@
                 <w:rFonts w:ascii="Arial" w:hAnsi="Arial"/>
                 <w:b w:val="0"/>
                 <w:i w:val="0"/>
-                <w:color w:val="222222"/>
+                <w:color w:val="1F2937"/>
                 <w:sz w:val="21"/>
               </w:rPr>
               <w:t>{{ Fecha_Generacion }}</w:t>
@@ -161,7 +177,7 @@
           <w:rFonts w:ascii="Arial" w:hAnsi="Arial"/>
           <w:b/>
           <w:i w:val="0"/>
-          <w:color w:val="003366"/>
+          <w:color w:val="0B2A5B"/>
           <w:sz w:val="24"/>
         </w:rPr>
         <w:t>1. Resumen de Diligencia</w:t>
@@ -263,7 +279,7 @@
                 <w:rFonts w:ascii="Arial" w:hAnsi="Arial"/>
                 <w:b/>
                 <w:i w:val="0"/>
-                <w:color w:val="222222"/>
+                <w:color w:val="1F2937"/>
                 <w:sz w:val="21"/>
               </w:rPr>
               <w:t>Unidad</w:t>
@@ -290,7 +306,7 @@
                 <w:rFonts w:ascii="Arial" w:hAnsi="Arial"/>
                 <w:b w:val="0"/>
                 <w:i w:val="0"/>
-                <w:color w:val="222222"/>
+                <w:color w:val="1F2937"/>
                 <w:sz w:val="21"/>
               </w:rPr>
               <w:t>{{ Unidad }}</w:t>
@@ -319,7 +335,7 @@
                 <w:rFonts w:ascii="Arial" w:hAnsi="Arial"/>
                 <w:b/>
                 <w:i w:val="0"/>
-                <w:color w:val="222222"/>
+                <w:color w:val="1F2937"/>
                 <w:sz w:val="21"/>
               </w:rPr>
               <w:t>Hecho</w:t>
@@ -346,7 +362,7 @@
                 <w:rFonts w:ascii="Arial" w:hAnsi="Arial"/>
                 <w:b w:val="0"/>
                 <w:i w:val="0"/>
-                <w:color w:val="222222"/>
+                <w:color w:val="1F2937"/>
                 <w:sz w:val="21"/>
               </w:rPr>
               <w:t>{{ Hecho }}</w:t>
@@ -375,7 +391,7 @@
                 <w:rFonts w:ascii="Arial" w:hAnsi="Arial"/>
                 <w:b/>
                 <w:i w:val="0"/>
-                <w:color w:val="222222"/>
+                <w:color w:val="1F2937"/>
                 <w:sz w:val="21"/>
               </w:rPr>
               <w:t>Detenido</w:t>
@@ -402,7 +418,7 @@
                 <w:rFonts w:ascii="Arial" w:hAnsi="Arial"/>
                 <w:b w:val="0"/>
                 <w:i w:val="0"/>
-                <w:color w:val="222222"/>
+                <w:color w:val="1F2937"/>
                 <w:sz w:val="21"/>
               </w:rPr>
               <w:t>{{ Detenidos }}</w:t>
@@ -431,7 +447,7 @@
                 <w:rFonts w:ascii="Arial" w:hAnsi="Arial"/>
                 <w:b/>
                 <w:i w:val="0"/>
-                <w:color w:val="222222"/>
+                <w:color w:val="1F2937"/>
                 <w:sz w:val="21"/>
               </w:rPr>
               <w:t>Víctima</w:t>
@@ -458,7 +474,7 @@
                 <w:rFonts w:ascii="Arial" w:hAnsi="Arial"/>
                 <w:b w:val="0"/>
                 <w:i w:val="0"/>
-                <w:color w:val="222222"/>
+                <w:color w:val="1F2937"/>
                 <w:sz w:val="21"/>
               </w:rPr>
               <w:t>{{ Victimas }}</w:t>
@@ -487,7 +503,7 @@
                 <w:rFonts w:ascii="Arial" w:hAnsi="Arial"/>
                 <w:b/>
                 <w:i w:val="0"/>
-                <w:color w:val="222222"/>
+                <w:color w:val="1F2937"/>
                 <w:sz w:val="21"/>
               </w:rPr>
               <w:t>Detenidos menores de edad</w:t>
@@ -514,7 +530,7 @@
                 <w:rFonts w:ascii="Arial" w:hAnsi="Arial"/>
                 <w:b w:val="0"/>
                 <w:i w:val="0"/>
-                <w:color w:val="222222"/>
+                <w:color w:val="1F2937"/>
                 <w:sz w:val="21"/>
               </w:rPr>
               <w:t>{{ Detenidos_Menores }}</w:t>
@@ -543,7 +559,7 @@
                 <w:rFonts w:ascii="Arial" w:hAnsi="Arial"/>
                 <w:b/>
                 <w:i w:val="0"/>
-                <w:color w:val="222222"/>
+                <w:color w:val="1F2937"/>
                 <w:sz w:val="21"/>
               </w:rPr>
               <w:t>Víctimas menores de edad</w:t>
@@ -570,7 +586,7 @@
                 <w:rFonts w:ascii="Arial" w:hAnsi="Arial"/>
                 <w:b w:val="0"/>
                 <w:i w:val="0"/>
-                <w:color w:val="222222"/>
+                <w:color w:val="1F2937"/>
                 <w:sz w:val="21"/>
               </w:rPr>
               <w:t>{{ Victimas_Menores }}</w:t>
@@ -599,7 +615,7 @@
                 <w:rFonts w:ascii="Arial" w:hAnsi="Arial"/>
                 <w:b/>
                 <w:i w:val="0"/>
-                <w:color w:val="222222"/>
+                <w:color w:val="1F2937"/>
                 <w:sz w:val="21"/>
               </w:rPr>
               <w:t>Resumen Diligencia</w:t>
@@ -626,7 +642,7 @@
                 <w:rFonts w:ascii="Arial" w:hAnsi="Arial"/>
                 <w:b w:val="0"/>
                 <w:i w:val="0"/>
-                <w:color w:val="222222"/>
+                <w:color w:val="1F2937"/>
                 <w:sz w:val="21"/>
               </w:rPr>
               <w:t>{{ Resumen_Relato }}</w:t>
@@ -638,6 +654,163 @@
     <w:p>
       <w:pPr>
         <w:spacing w:after="320"/>
+      </w:pPr>
+    </w:p>
+    <w:p>
+      <w:pPr>
+        <w:keepNext/>
+        <w:spacing w:before="100" w:after="100"/>
+      </w:pPr>
+      <w:r>
+        <w:rPr>
+          <w:rFonts w:ascii="Arial" w:hAnsi="Arial"/>
+          <w:b/>
+          <w:i w:val="0"/>
+          <w:color w:val="0B2A5B"/>
+          <w:sz w:val="21"/>
+        </w:rPr>
+        <w:t>INDICADORES DE NIÑOS, NIÑAS Y ADOLESCENTES</w:t>
+      </w:r>
+    </w:p>
+    <w:tbl>
+      <w:tblPr>
+        <w:tblW w:type="auto" w:w="0"/>
+        <w:jc w:val="center"/>
+        <w:tblLayout w:type="fixed"/>
+        <w:tblLook w:firstColumn="1" w:firstRow="1" w:lastColumn="0" w:lastRow="0" w:noHBand="0" w:noVBand="1" w:val="04A0"/>
+        <w:tblBorders>
+          <w:top w:val="single" w:sz="6" w:space="0" w:color="CBD5E1"/>
+          <w:bottom w:val="single" w:sz="6" w:space="0" w:color="CBD5E1"/>
+          <w:left w:val="single" w:sz="6" w:space="0" w:color="CBD5E1"/>
+          <w:right w:val="single" w:sz="6" w:space="0" w:color="CBD5E1"/>
+          <w:insideH w:val="single" w:sz="4" w:space="0" w:color="FFFFFF"/>
+          <w:insideV w:val="none"/>
+        </w:tblBorders>
+      </w:tblPr>
+      <w:tblGrid>
+        <w:gridCol w:w="4680"/>
+        <w:gridCol w:w="4680"/>
+      </w:tblGrid>
+      <w:tr>
+        <w:tc>
+          <w:tcPr>
+            <w:tcW w:type="dxa" w:w="4535"/>
+            <w:tcMar>
+              <w:top w:w="120" w:type="dxa"/>
+              <w:bottom w:w="120" w:type="dxa"/>
+              <w:left w:w="150" w:type="dxa"/>
+              <w:right w:w="150" w:type="dxa"/>
+            </w:tcMar>
+            <w:shd w:fill="E6F7FB"/>
+          </w:tcPr>
+          <w:p>
+            <w:pPr>
+              <w:spacing w:before="20" w:after="60"/>
+            </w:pPr>
+            <w:r>
+              <w:rPr>
+                <w:rFonts w:ascii="Arial" w:hAnsi="Arial"/>
+                <w:b/>
+                <w:i w:val="0"/>
+                <w:color w:val="0891B2"/>
+                <w:sz w:val="17"/>
+              </w:rPr>
+              <w:t>VÍCTIMAS MENORES DE EDAD (N.N.A.)</w:t>
+            </w:r>
+          </w:p>
+          <w:p>
+            <w:pPr>
+              <w:spacing w:before="0" w:after="20"/>
+            </w:pPr>
+            <w:r>
+              <w:rPr>
+                <w:rFonts w:ascii="Arial" w:hAnsi="Arial"/>
+                <w:b/>
+                <w:i w:val="0"/>
+                <w:color w:val="0891B2"/>
+                <w:sz w:val="40"/>
+              </w:rPr>
+              <w:t>{{ Victimas_Menores }}</w:t>
+            </w:r>
+          </w:p>
+          <w:p>
+            <w:pPr>
+              <w:spacing w:before="0" w:after="20"/>
+            </w:pPr>
+            <w:r>
+              <w:rPr>
+                <w:rFonts w:ascii="Arial" w:hAnsi="Arial"/>
+                <w:b w:val="0"/>
+                <w:i w:val="0"/>
+                <w:color w:val="64748B"/>
+                <w:sz w:val="17"/>
+              </w:rPr>
+              <w:t>Personas detectadas en el documento</w:t>
+            </w:r>
+          </w:p>
+        </w:tc>
+        <w:tc>
+          <w:tcPr>
+            <w:tcW w:type="dxa" w:w="4535"/>
+            <w:tcMar>
+              <w:top w:w="120" w:type="dxa"/>
+              <w:bottom w:w="120" w:type="dxa"/>
+              <w:left w:w="150" w:type="dxa"/>
+              <w:right w:w="150" w:type="dxa"/>
+            </w:tcMar>
+            <w:shd w:fill="FFF0E7"/>
+          </w:tcPr>
+          <w:p>
+            <w:pPr>
+              <w:spacing w:before="20" w:after="60"/>
+            </w:pPr>
+            <w:r>
+              <w:rPr>
+                <w:rFonts w:ascii="Arial" w:hAnsi="Arial"/>
+                <w:b/>
+                <w:i w:val="0"/>
+                <w:color w:val="EA580C"/>
+                <w:sz w:val="17"/>
+              </w:rPr>
+              <w:t>DETENIDOS MENORES DE EDAD (N.N.A.)</w:t>
+            </w:r>
+          </w:p>
+          <w:p>
+            <w:pPr>
+              <w:spacing w:before="0" w:after="20"/>
+            </w:pPr>
+            <w:r>
+              <w:rPr>
+                <w:rFonts w:ascii="Arial" w:hAnsi="Arial"/>
+                <w:b/>
+                <w:i w:val="0"/>
+                <w:color w:val="EA580C"/>
+                <w:sz w:val="40"/>
+              </w:rPr>
+              <w:t>{{ Detenidos_Menores }}</w:t>
+            </w:r>
+          </w:p>
+          <w:p>
+            <w:pPr>
+              <w:spacing w:before="0" w:after="20"/>
+            </w:pPr>
+            <w:r>
+              <w:rPr>
+                <w:rFonts w:ascii="Arial" w:hAnsi="Arial"/>
+                <w:b w:val="0"/>
+                <w:i w:val="0"/>
+                <w:color w:val="64748B"/>
+                <w:sz w:val="17"/>
+              </w:rPr>
+              <w:t>Personas detectadas en el documento</w:t>
+            </w:r>
+          </w:p>
+        </w:tc>
+      </w:tr>
+    </w:tbl>
+    <w:p>
+      <w:pPr>
+        <w:spacing w:after="140"/>
       </w:pPr>
     </w:p>
     <w:p>
@@ -656,7 +829,7 @@
           <w:rFonts w:ascii="Arial" w:hAnsi="Arial"/>
           <w:b/>
           <w:i w:val="0"/>
-          <w:color w:val="003366"/>
+          <w:color w:val="0B2A5B"/>
           <w:sz w:val="24"/>
         </w:rPr>
         <w:t>2. Entidades Identificadas</w:t>
@@ -678,7 +851,7 @@
           <w:rFonts w:ascii="Arial" w:hAnsi="Arial"/>
           <w:b/>
           <w:i w:val="0"/>
-          <w:color w:val="003366"/>
+          <w:color w:val="0B2A5B"/>
           <w:sz w:val="23"/>
         </w:rPr>
         <w:t>2.1 Vehículos Detectados</w:t>
@@ -691,11 +864,11 @@
         <w:tblLayout w:type="fixed"/>
         <w:tblLook w:firstColumn="1" w:firstRow="1" w:lastColumn="0" w:lastRow="0" w:noHBand="0" w:noVBand="1" w:val="04A0"/>
         <w:tblBorders>
-          <w:top w:val="single" w:sz="6" w:space="0" w:color="003366"/>
-          <w:bottom w:val="single" w:sz="6" w:space="0" w:color="003366"/>
-          <w:left w:val="single" w:sz="6" w:space="0" w:color="003366"/>
-          <w:right w:val="single" w:sz="6" w:space="0" w:color="003366"/>
-          <w:insideH w:val="single" w:sz="4" w:space="0" w:color="E2E8F0"/>
+          <w:top w:val="single" w:sz="6" w:space="0" w:color="2B5FAE"/>
+          <w:bottom w:val="single" w:sz="6" w:space="0" w:color="2B5FAE"/>
+          <w:left w:val="single" w:sz="6" w:space="0" w:color="2B5FAE"/>
+          <w:right w:val="single" w:sz="6" w:space="0" w:color="2B5FAE"/>
+          <w:insideH w:val="single" w:sz="4" w:space="0" w:color="D7DEE9"/>
           <w:insideV w:val="none"/>
         </w:tblBorders>
       </w:tblPr>
@@ -706,6 +879,36 @@
       <w:tr>
         <w:tc>
           <w:tcPr>
+            <w:tcW w:type="dxa" w:w="9360"/>
+            <w:gridSpan w:val="2"/>
+            <w:tcMar>
+              <w:top w:w="95" w:type="dxa"/>
+              <w:bottom w:w="95" w:type="dxa"/>
+              <w:left w:w="140" w:type="dxa"/>
+              <w:right w:w="140" w:type="dxa"/>
+            </w:tcMar>
+            <w:shd w:fill="2B5FAE"/>
+          </w:tcPr>
+          <w:p>
+            <w:pPr>
+              <w:spacing w:before="20" w:after="20"/>
+            </w:pPr>
+            <w:r>
+              <w:rPr>
+                <w:rFonts w:ascii="Arial" w:hAnsi="Arial"/>
+                <w:b/>
+                <w:i w:val="0"/>
+                <w:color w:val="FFFFFF"/>
+                <w:sz w:val="21"/>
+              </w:rPr>
+              <w:t>VEHÍCULOS DETECTADOS</w:t>
+            </w:r>
+          </w:p>
+        </w:tc>
+      </w:tr>
+      <w:tr>
+        <w:tc>
+          <w:tcPr>
             <w:tcW w:type="dxa" w:w="2835"/>
             <w:tcMar>
               <w:top w:w="70" w:type="dxa"/>
@@ -713,7 +916,7 @@
               <w:left w:w="120" w:type="dxa"/>
               <w:right w:w="120" w:type="dxa"/>
             </w:tcMar>
-            <w:shd w:fill="F8FAFC"/>
+            <w:shd w:fill="EAF2FF"/>
           </w:tcPr>
           <w:p>
             <w:pPr>
@@ -724,7 +927,7 @@
                 <w:rFonts w:ascii="Arial" w:hAnsi="Arial"/>
                 <w:b/>
                 <w:i w:val="0"/>
-                <w:color w:val="003366"/>
+                <w:color w:val="2B5FAE"/>
                 <w:sz w:val="21"/>
               </w:rPr>
               <w:t>Marcas:</w:t>
@@ -751,7 +954,7 @@
                 <w:rFonts w:ascii="Arial" w:hAnsi="Arial"/>
                 <w:b w:val="0"/>
                 <w:i w:val="0"/>
-                <w:color w:val="222222"/>
+                <w:color w:val="1F2937"/>
                 <w:sz w:val="21"/>
               </w:rPr>
               <w:t>{{ Marcas }}</w:t>
@@ -769,7 +972,7 @@
               <w:left w:w="120" w:type="dxa"/>
               <w:right w:w="120" w:type="dxa"/>
             </w:tcMar>
-            <w:shd w:fill="F8FAFC"/>
+            <w:shd w:fill="EAF2FF"/>
           </w:tcPr>
           <w:p>
             <w:pPr>
@@ -780,7 +983,7 @@
                 <w:rFonts w:ascii="Arial" w:hAnsi="Arial"/>
                 <w:b/>
                 <w:i w:val="0"/>
-                <w:color w:val="003366"/>
+                <w:color w:val="2B5FAE"/>
                 <w:sz w:val="21"/>
               </w:rPr>
               <w:t>Modelos:</w:t>
@@ -807,7 +1010,7 @@
                 <w:rFonts w:ascii="Arial" w:hAnsi="Arial"/>
                 <w:b w:val="0"/>
                 <w:i w:val="0"/>
-                <w:color w:val="222222"/>
+                <w:color w:val="1F2937"/>
                 <w:sz w:val="21"/>
               </w:rPr>
               <w:t>{{ Modelos }}</w:t>
@@ -825,7 +1028,7 @@
               <w:left w:w="120" w:type="dxa"/>
               <w:right w:w="120" w:type="dxa"/>
             </w:tcMar>
-            <w:shd w:fill="F8FAFC"/>
+            <w:shd w:fill="EAF2FF"/>
           </w:tcPr>
           <w:p>
             <w:pPr>
@@ -836,7 +1039,7 @@
                 <w:rFonts w:ascii="Arial" w:hAnsi="Arial"/>
                 <w:b/>
                 <w:i w:val="0"/>
-                <w:color w:val="003366"/>
+                <w:color w:val="2B5FAE"/>
                 <w:sz w:val="21"/>
               </w:rPr>
               <w:t>Colores:</w:t>
@@ -863,7 +1066,7 @@
                 <w:rFonts w:ascii="Arial" w:hAnsi="Arial"/>
                 <w:b w:val="0"/>
                 <w:i w:val="0"/>
-                <w:color w:val="222222"/>
+                <w:color w:val="1F2937"/>
                 <w:sz w:val="21"/>
               </w:rPr>
               <w:t>{{ Colores }}</w:t>
@@ -881,7 +1084,7 @@
               <w:left w:w="120" w:type="dxa"/>
               <w:right w:w="120" w:type="dxa"/>
             </w:tcMar>
-            <w:shd w:fill="F8FAFC"/>
+            <w:shd w:fill="EAF2FF"/>
           </w:tcPr>
           <w:p>
             <w:pPr>
@@ -892,7 +1095,7 @@
                 <w:rFonts w:ascii="Arial" w:hAnsi="Arial"/>
                 <w:b/>
                 <w:i w:val="0"/>
-                <w:color w:val="003366"/>
+                <w:color w:val="2B5FAE"/>
                 <w:sz w:val="21"/>
               </w:rPr>
               <w:t>Años de Fabricación:</w:t>
@@ -919,7 +1122,7 @@
                 <w:rFonts w:ascii="Arial" w:hAnsi="Arial"/>
                 <w:b w:val="0"/>
                 <w:i w:val="0"/>
-                <w:color w:val="222222"/>
+                <w:color w:val="1F2937"/>
                 <w:sz w:val="21"/>
               </w:rPr>
               <w:t>{{ Anios }}</w:t>
@@ -937,7 +1140,7 @@
               <w:left w:w="120" w:type="dxa"/>
               <w:right w:w="120" w:type="dxa"/>
             </w:tcMar>
-            <w:shd w:fill="F8FAFC"/>
+            <w:shd w:fill="EAF2FF"/>
           </w:tcPr>
           <w:p>
             <w:pPr>
@@ -948,7 +1151,7 @@
                 <w:rFonts w:ascii="Arial" w:hAnsi="Arial"/>
                 <w:b/>
                 <w:i w:val="0"/>
-                <w:color w:val="003366"/>
+                <w:color w:val="2B5FAE"/>
                 <w:sz w:val="21"/>
               </w:rPr>
               <w:t>Patentes / PPU:</w:t>
@@ -975,7 +1178,7 @@
                 <w:rFonts w:ascii="Arial" w:hAnsi="Arial"/>
                 <w:b w:val="0"/>
                 <w:i w:val="0"/>
-                <w:color w:val="222222"/>
+                <w:color w:val="1F2937"/>
                 <w:sz w:val="21"/>
               </w:rPr>
               <w:t>{{ Patentes_PPU }}</w:t>
@@ -986,7 +1189,7 @@
     </w:tbl>
     <w:p>
       <w:pPr>
-        <w:spacing w:after="120"/>
+        <w:spacing w:after="140"/>
       </w:pPr>
     </w:p>
     <w:p>
@@ -1010,7 +1213,7 @@
           <w:rFonts w:ascii="Arial" w:hAnsi="Arial"/>
           <w:b/>
           <w:i w:val="0"/>
-          <w:color w:val="003366"/>
+          <w:color w:val="0B2A5B"/>
           <w:sz w:val="23"/>
         </w:rPr>
         <w:t>2.2 Armas de Fuego Detectadas</w:t>
@@ -1023,11 +1226,11 @@
         <w:tblLayout w:type="fixed"/>
         <w:tblLook w:firstColumn="1" w:firstRow="1" w:lastColumn="0" w:lastRow="0" w:noHBand="0" w:noVBand="1" w:val="04A0"/>
         <w:tblBorders>
-          <w:top w:val="single" w:sz="6" w:space="0" w:color="003366"/>
-          <w:bottom w:val="single" w:sz="6" w:space="0" w:color="003366"/>
-          <w:left w:val="single" w:sz="6" w:space="0" w:color="003366"/>
-          <w:right w:val="single" w:sz="6" w:space="0" w:color="003366"/>
-          <w:insideH w:val="single" w:sz="4" w:space="0" w:color="E2E8F0"/>
+          <w:top w:val="single" w:sz="6" w:space="0" w:color="D92D20"/>
+          <w:bottom w:val="single" w:sz="6" w:space="0" w:color="D92D20"/>
+          <w:left w:val="single" w:sz="6" w:space="0" w:color="D92D20"/>
+          <w:right w:val="single" w:sz="6" w:space="0" w:color="D92D20"/>
+          <w:insideH w:val="single" w:sz="4" w:space="0" w:color="D7DEE9"/>
           <w:insideV w:val="none"/>
         </w:tblBorders>
       </w:tblPr>
@@ -1038,6 +1241,36 @@
       <w:tr>
         <w:tc>
           <w:tcPr>
+            <w:tcW w:type="dxa" w:w="9360"/>
+            <w:gridSpan w:val="2"/>
+            <w:tcMar>
+              <w:top w:w="95" w:type="dxa"/>
+              <w:bottom w:w="95" w:type="dxa"/>
+              <w:left w:w="140" w:type="dxa"/>
+              <w:right w:w="140" w:type="dxa"/>
+            </w:tcMar>
+            <w:shd w:fill="D92D20"/>
+          </w:tcPr>
+          <w:p>
+            <w:pPr>
+              <w:spacing w:before="20" w:after="20"/>
+            </w:pPr>
+            <w:r>
+              <w:rPr>
+                <w:rFonts w:ascii="Arial" w:hAnsi="Arial"/>
+                <w:b/>
+                <w:i w:val="0"/>
+                <w:color w:val="FFFFFF"/>
+                <w:sz w:val="21"/>
+              </w:rPr>
+              <w:t>ARMAS DE FUEGO DETECTADAS</w:t>
+            </w:r>
+          </w:p>
+        </w:tc>
+      </w:tr>
+      <w:tr>
+        <w:tc>
+          <w:tcPr>
             <w:tcW w:type="dxa" w:w="2835"/>
             <w:tcMar>
               <w:top w:w="70" w:type="dxa"/>
@@ -1045,7 +1278,7 @@
               <w:left w:w="120" w:type="dxa"/>
               <w:right w:w="120" w:type="dxa"/>
             </w:tcMar>
-            <w:shd w:fill="F8FAFC"/>
+            <w:shd w:fill="FDECEC"/>
           </w:tcPr>
           <w:p>
             <w:pPr>
@@ -1056,7 +1289,7 @@
                 <w:rFonts w:ascii="Arial" w:hAnsi="Arial"/>
                 <w:b/>
                 <w:i w:val="0"/>
-                <w:color w:val="003366"/>
+                <w:color w:val="D92D20"/>
                 <w:sz w:val="21"/>
               </w:rPr>
               <w:t>Marcas:</w:t>
@@ -1083,7 +1316,7 @@
                 <w:rFonts w:ascii="Arial" w:hAnsi="Arial"/>
                 <w:b w:val="0"/>
                 <w:i w:val="0"/>
-                <w:color w:val="222222"/>
+                <w:color w:val="1F2937"/>
                 <w:sz w:val="21"/>
               </w:rPr>
               <w:t>{{ Marcas_Arma }}</w:t>
@@ -1101,7 +1334,7 @@
               <w:left w:w="120" w:type="dxa"/>
               <w:right w:w="120" w:type="dxa"/>
             </w:tcMar>
-            <w:shd w:fill="F8FAFC"/>
+            <w:shd w:fill="FDECEC"/>
           </w:tcPr>
           <w:p>
             <w:pPr>
@@ -1112,7 +1345,7 @@
                 <w:rFonts w:ascii="Arial" w:hAnsi="Arial"/>
                 <w:b/>
                 <w:i w:val="0"/>
-                <w:color w:val="003366"/>
+                <w:color w:val="D92D20"/>
                 <w:sz w:val="21"/>
               </w:rPr>
               <w:t>Modelos:</w:t>
@@ -1139,7 +1372,7 @@
                 <w:rFonts w:ascii="Arial" w:hAnsi="Arial"/>
                 <w:b w:val="0"/>
                 <w:i w:val="0"/>
-                <w:color w:val="222222"/>
+                <w:color w:val="1F2937"/>
                 <w:sz w:val="21"/>
               </w:rPr>
               <w:t>{{ Modelos_Arma }}</w:t>
@@ -1157,7 +1390,7 @@
               <w:left w:w="120" w:type="dxa"/>
               <w:right w:w="120" w:type="dxa"/>
             </w:tcMar>
-            <w:shd w:fill="F8FAFC"/>
+            <w:shd w:fill="FDECEC"/>
           </w:tcPr>
           <w:p>
             <w:pPr>
@@ -1168,7 +1401,7 @@
                 <w:rFonts w:ascii="Arial" w:hAnsi="Arial"/>
                 <w:b/>
                 <w:i w:val="0"/>
-                <w:color w:val="003366"/>
+                <w:color w:val="D92D20"/>
                 <w:sz w:val="21"/>
               </w:rPr>
               <w:t>Tipo de Arma:</w:t>
@@ -1195,7 +1428,7 @@
                 <w:rFonts w:ascii="Arial" w:hAnsi="Arial"/>
                 <w:b w:val="0"/>
                 <w:i w:val="0"/>
-                <w:color w:val="222222"/>
+                <w:color w:val="1F2937"/>
                 <w:sz w:val="21"/>
               </w:rPr>
               <w:t>{{ Tipo }}</w:t>
@@ -1213,7 +1446,7 @@
               <w:left w:w="120" w:type="dxa"/>
               <w:right w:w="120" w:type="dxa"/>
             </w:tcMar>
-            <w:shd w:fill="F8FAFC"/>
+            <w:shd w:fill="FDECEC"/>
           </w:tcPr>
           <w:p>
             <w:pPr>
@@ -1224,7 +1457,7 @@
                 <w:rFonts w:ascii="Arial" w:hAnsi="Arial"/>
                 <w:b/>
                 <w:i w:val="0"/>
-                <w:color w:val="003366"/>
+                <w:color w:val="D92D20"/>
                 <w:sz w:val="21"/>
               </w:rPr>
               <w:t>Calibres:</w:t>
@@ -1251,7 +1484,7 @@
                 <w:rFonts w:ascii="Arial" w:hAnsi="Arial"/>
                 <w:b w:val="0"/>
                 <w:i w:val="0"/>
-                <w:color w:val="222222"/>
+                <w:color w:val="1F2937"/>
                 <w:sz w:val="21"/>
               </w:rPr>
               <w:t>{{ Calibres }}</w:t>
@@ -1269,7 +1502,7 @@
               <w:left w:w="120" w:type="dxa"/>
               <w:right w:w="120" w:type="dxa"/>
             </w:tcMar>
-            <w:shd w:fill="F8FAFC"/>
+            <w:shd w:fill="FDECEC"/>
           </w:tcPr>
           <w:p>
             <w:pPr>
@@ -1280,7 +1513,7 @@
                 <w:rFonts w:ascii="Arial" w:hAnsi="Arial"/>
                 <w:b/>
                 <w:i w:val="0"/>
-                <w:color w:val="003366"/>
+                <w:color w:val="D92D20"/>
                 <w:sz w:val="21"/>
               </w:rPr>
               <w:t>Números de Serie:</w:t>
@@ -1307,7 +1540,7 @@
                 <w:rFonts w:ascii="Arial" w:hAnsi="Arial"/>
                 <w:b w:val="0"/>
                 <w:i w:val="0"/>
-                <w:color w:val="222222"/>
+                <w:color w:val="1F2937"/>
                 <w:sz w:val="21"/>
               </w:rPr>
               <w:t>{{ Numerosdeserie }}</w:t>
@@ -1318,7 +1551,7 @@
     </w:tbl>
     <w:p>
       <w:pPr>
-        <w:spacing w:after="120"/>
+        <w:spacing w:after="140"/>
       </w:pPr>
     </w:p>
     <w:p>
@@ -1342,7 +1575,7 @@
           <w:rFonts w:ascii="Arial" w:hAnsi="Arial"/>
           <w:b/>
           <w:i w:val="0"/>
-          <w:color w:val="003366"/>
+          <w:color w:val="0B2A5B"/>
           <w:sz w:val="23"/>
         </w:rPr>
         <w:t>2.3 Sustancias Ilícitas Detectadas</w:t>
@@ -1355,11 +1588,11 @@
         <w:tblLayout w:type="fixed"/>
         <w:tblLook w:firstColumn="1" w:firstRow="1" w:lastColumn="0" w:lastRow="0" w:noHBand="0" w:noVBand="1" w:val="04A0"/>
         <w:tblBorders>
-          <w:top w:val="single" w:sz="6" w:space="0" w:color="003366"/>
-          <w:bottom w:val="single" w:sz="6" w:space="0" w:color="003366"/>
-          <w:left w:val="single" w:sz="6" w:space="0" w:color="003366"/>
-          <w:right w:val="single" w:sz="6" w:space="0" w:color="003366"/>
-          <w:insideH w:val="single" w:sz="4" w:space="0" w:color="E2E8F0"/>
+          <w:top w:val="single" w:sz="6" w:space="0" w:color="C69214"/>
+          <w:bottom w:val="single" w:sz="6" w:space="0" w:color="C69214"/>
+          <w:left w:val="single" w:sz="6" w:space="0" w:color="C69214"/>
+          <w:right w:val="single" w:sz="6" w:space="0" w:color="C69214"/>
+          <w:insideH w:val="single" w:sz="4" w:space="0" w:color="D7DEE9"/>
           <w:insideV w:val="none"/>
         </w:tblBorders>
       </w:tblPr>
@@ -1370,6 +1603,36 @@
       <w:tr>
         <w:tc>
           <w:tcPr>
+            <w:tcW w:type="dxa" w:w="9360"/>
+            <w:gridSpan w:val="2"/>
+            <w:tcMar>
+              <w:top w:w="95" w:type="dxa"/>
+              <w:bottom w:w="95" w:type="dxa"/>
+              <w:left w:w="140" w:type="dxa"/>
+              <w:right w:w="140" w:type="dxa"/>
+            </w:tcMar>
+            <w:shd w:fill="C69214"/>
+          </w:tcPr>
+          <w:p>
+            <w:pPr>
+              <w:spacing w:before="20" w:after="20"/>
+            </w:pPr>
+            <w:r>
+              <w:rPr>
+                <w:rFonts w:ascii="Arial" w:hAnsi="Arial"/>
+                <w:b/>
+                <w:i w:val="0"/>
+                <w:color w:val="FFFFFF"/>
+                <w:sz w:val="21"/>
+              </w:rPr>
+              <w:t>SUSTANCIAS ILÍCITAS DETECTADAS</w:t>
+            </w:r>
+          </w:p>
+        </w:tc>
+      </w:tr>
+      <w:tr>
+        <w:tc>
+          <w:tcPr>
             <w:tcW w:type="dxa" w:w="2835"/>
             <w:tcMar>
               <w:top w:w="70" w:type="dxa"/>
@@ -1377,7 +1640,7 @@
               <w:left w:w="120" w:type="dxa"/>
               <w:right w:w="120" w:type="dxa"/>
             </w:tcMar>
-            <w:shd w:fill="F8FAFC"/>
+            <w:shd w:fill="FFF7DF"/>
           </w:tcPr>
           <w:p>
             <w:pPr>
@@ -1388,7 +1651,7 @@
                 <w:rFonts w:ascii="Arial" w:hAnsi="Arial"/>
                 <w:b/>
                 <w:i w:val="0"/>
-                <w:color w:val="003366"/>
+                <w:color w:val="A07000"/>
                 <w:sz w:val="21"/>
               </w:rPr>
               <w:t>Sustancias:</w:t>
@@ -1415,7 +1678,7 @@
                 <w:rFonts w:ascii="Arial" w:hAnsi="Arial"/>
                 <w:b w:val="0"/>
                 <w:i w:val="0"/>
-                <w:color w:val="222222"/>
+                <w:color w:val="1F2937"/>
                 <w:sz w:val="21"/>
               </w:rPr>
               <w:t>{{ Sustancias }}</w:t>
@@ -1433,7 +1696,7 @@
               <w:left w:w="120" w:type="dxa"/>
               <w:right w:w="120" w:type="dxa"/>
             </w:tcMar>
-            <w:shd w:fill="F8FAFC"/>
+            <w:shd w:fill="FFF7DF"/>
           </w:tcPr>
           <w:p>
             <w:pPr>
@@ -1444,7 +1707,7 @@
                 <w:rFonts w:ascii="Arial" w:hAnsi="Arial"/>
                 <w:b/>
                 <w:i w:val="0"/>
-                <w:color w:val="003366"/>
+                <w:color w:val="A07000"/>
                 <w:sz w:val="21"/>
               </w:rPr>
               <w:t>Medidas / Pesajes:</w:t>
@@ -1471,7 +1734,7 @@
                 <w:rFonts w:ascii="Arial" w:hAnsi="Arial"/>
                 <w:b w:val="0"/>
                 <w:i w:val="0"/>
-                <w:color w:val="222222"/>
+                <w:color w:val="1F2937"/>
                 <w:sz w:val="21"/>
               </w:rPr>
               <w:t>{{ Medidas_pesajes }}</w:t>
@@ -1482,7 +1745,7 @@
     </w:tbl>
     <w:p>
       <w:pPr>
-        <w:spacing w:after="120"/>
+        <w:spacing w:after="140"/>
       </w:pPr>
     </w:p>
     <w:p>
@@ -1506,7 +1769,7 @@
           <w:rFonts w:ascii="Arial" w:hAnsi="Arial"/>
           <w:b/>
           <w:i w:val="0"/>
-          <w:color w:val="003366"/>
+          <w:color w:val="0B2A5B"/>
           <w:sz w:val="23"/>
         </w:rPr>
         <w:t>2.4 Personas Involucradas</w:t>
@@ -1519,11 +1782,11 @@
         <w:tblLayout w:type="fixed"/>
         <w:tblLook w:firstColumn="1" w:firstRow="1" w:lastColumn="0" w:lastRow="0" w:noHBand="0" w:noVBand="1" w:val="04A0"/>
         <w:tblBorders>
-          <w:top w:val="single" w:sz="6" w:space="0" w:color="003366"/>
-          <w:bottom w:val="single" w:sz="6" w:space="0" w:color="003366"/>
-          <w:left w:val="single" w:sz="6" w:space="0" w:color="003366"/>
-          <w:right w:val="single" w:sz="6" w:space="0" w:color="003366"/>
-          <w:insideH w:val="single" w:sz="4" w:space="0" w:color="E2E8F0"/>
+          <w:top w:val="single" w:sz="6" w:space="0" w:color="7C3AED"/>
+          <w:bottom w:val="single" w:sz="6" w:space="0" w:color="7C3AED"/>
+          <w:left w:val="single" w:sz="6" w:space="0" w:color="7C3AED"/>
+          <w:right w:val="single" w:sz="6" w:space="0" w:color="7C3AED"/>
+          <w:insideH w:val="single" w:sz="4" w:space="0" w:color="D7DEE9"/>
           <w:insideV w:val="none"/>
         </w:tblBorders>
       </w:tblPr>
@@ -1534,6 +1797,36 @@
       <w:tr>
         <w:tc>
           <w:tcPr>
+            <w:tcW w:type="dxa" w:w="9360"/>
+            <w:gridSpan w:val="2"/>
+            <w:tcMar>
+              <w:top w:w="95" w:type="dxa"/>
+              <w:bottom w:w="95" w:type="dxa"/>
+              <w:left w:w="140" w:type="dxa"/>
+              <w:right w:w="140" w:type="dxa"/>
+            </w:tcMar>
+            <w:shd w:fill="7C3AED"/>
+          </w:tcPr>
+          <w:p>
+            <w:pPr>
+              <w:spacing w:before="20" w:after="20"/>
+            </w:pPr>
+            <w:r>
+              <w:rPr>
+                <w:rFonts w:ascii="Arial" w:hAnsi="Arial"/>
+                <w:b/>
+                <w:i w:val="0"/>
+                <w:color w:val="FFFFFF"/>
+                <w:sz w:val="21"/>
+              </w:rPr>
+              <w:t>PERSONAS INVOLUCRADAS Y N.N.A.</w:t>
+            </w:r>
+          </w:p>
+        </w:tc>
+      </w:tr>
+      <w:tr>
+        <w:tc>
+          <w:tcPr>
             <w:tcW w:type="dxa" w:w="2835"/>
             <w:tcMar>
               <w:top w:w="70" w:type="dxa"/>
@@ -1541,7 +1834,7 @@
               <w:left w:w="120" w:type="dxa"/>
               <w:right w:w="120" w:type="dxa"/>
             </w:tcMar>
-            <w:shd w:fill="F8FAFC"/>
+            <w:shd w:fill="F3E8FF"/>
           </w:tcPr>
           <w:p>
             <w:pPr>
@@ -1552,7 +1845,7 @@
                 <w:rFonts w:ascii="Arial" w:hAnsi="Arial"/>
                 <w:b/>
                 <w:i w:val="0"/>
-                <w:color w:val="003366"/>
+                <w:color w:val="7C3AED"/>
                 <w:sz w:val="21"/>
               </w:rPr>
               <w:t>Detenidos / Imputados:</w:t>
@@ -1579,7 +1872,7 @@
                 <w:rFonts w:ascii="Arial" w:hAnsi="Arial"/>
                 <w:b w:val="0"/>
                 <w:i w:val="0"/>
-                <w:color w:val="222222"/>
+                <w:color w:val="1F2937"/>
                 <w:sz w:val="21"/>
               </w:rPr>
               <w:t>{{ Detenidos }}</w:t>
@@ -1597,7 +1890,7 @@
               <w:left w:w="120" w:type="dxa"/>
               <w:right w:w="120" w:type="dxa"/>
             </w:tcMar>
-            <w:shd w:fill="F8FAFC"/>
+            <w:shd w:fill="F3E8FF"/>
           </w:tcPr>
           <w:p>
             <w:pPr>
@@ -1608,7 +1901,7 @@
                 <w:rFonts w:ascii="Arial" w:hAnsi="Arial"/>
                 <w:b/>
                 <w:i w:val="0"/>
-                <w:color w:val="003366"/>
+                <w:color w:val="7C3AED"/>
                 <w:sz w:val="21"/>
               </w:rPr>
               <w:t>Víctimas Identificadas:</w:t>
@@ -1635,7 +1928,7 @@
                 <w:rFonts w:ascii="Arial" w:hAnsi="Arial"/>
                 <w:b w:val="0"/>
                 <w:i w:val="0"/>
-                <w:color w:val="222222"/>
+                <w:color w:val="1F2937"/>
                 <w:sz w:val="21"/>
               </w:rPr>
               <w:t>{{ Victimas }}</w:t>
@@ -1653,7 +1946,7 @@
               <w:left w:w="120" w:type="dxa"/>
               <w:right w:w="120" w:type="dxa"/>
             </w:tcMar>
-            <w:shd w:fill="F8FAFC"/>
+            <w:shd w:fill="F3E8FF"/>
           </w:tcPr>
           <w:p>
             <w:pPr>
@@ -1664,7 +1957,7 @@
                 <w:rFonts w:ascii="Arial" w:hAnsi="Arial"/>
                 <w:b/>
                 <w:i w:val="0"/>
-                <w:color w:val="003366"/>
+                <w:color w:val="7C3AED"/>
                 <w:sz w:val="21"/>
               </w:rPr>
               <w:t>Detenidos menores de edad:</w:t>
@@ -1691,7 +1984,7 @@
                 <w:rFonts w:ascii="Arial" w:hAnsi="Arial"/>
                 <w:b w:val="0"/>
                 <w:i w:val="0"/>
-                <w:color w:val="222222"/>
+                <w:color w:val="1F2937"/>
                 <w:sz w:val="21"/>
               </w:rPr>
               <w:t>{{ Detenidos_Menores }}</w:t>
@@ -1709,7 +2002,7 @@
               <w:left w:w="120" w:type="dxa"/>
               <w:right w:w="120" w:type="dxa"/>
             </w:tcMar>
-            <w:shd w:fill="F8FAFC"/>
+            <w:shd w:fill="F3E8FF"/>
           </w:tcPr>
           <w:p>
             <w:pPr>
@@ -1720,7 +2013,7 @@
                 <w:rFonts w:ascii="Arial" w:hAnsi="Arial"/>
                 <w:b/>
                 <w:i w:val="0"/>
-                <w:color w:val="003366"/>
+                <w:color w:val="7C3AED"/>
                 <w:sz w:val="21"/>
               </w:rPr>
               <w:t>Víctimas menores de edad:</w:t>
@@ -1747,7 +2040,7 @@
                 <w:rFonts w:ascii="Arial" w:hAnsi="Arial"/>
                 <w:b w:val="0"/>
                 <w:i w:val="0"/>
-                <w:color w:val="222222"/>
+                <w:color w:val="1F2937"/>
                 <w:sz w:val="21"/>
               </w:rPr>
               <w:t>{{ Victimas_Menores }}</w:t>
@@ -1755,10 +2048,122 @@
           </w:p>
         </w:tc>
       </w:tr>
+      <w:tr>
+        <w:tc>
+          <w:tcPr>
+            <w:tcW w:type="dxa" w:w="2835"/>
+            <w:tcMar>
+              <w:top w:w="70" w:type="dxa"/>
+              <w:bottom w:w="70" w:type="dxa"/>
+              <w:left w:w="120" w:type="dxa"/>
+              <w:right w:w="120" w:type="dxa"/>
+            </w:tcMar>
+            <w:shd w:fill="F3E8FF"/>
+          </w:tcPr>
+          <w:p>
+            <w:pPr>
+              <w:spacing w:before="40" w:after="40" w:line="276" w:lineRule="auto"/>
+            </w:pPr>
+            <w:r>
+              <w:rPr>
+                <w:rFonts w:ascii="Arial" w:hAnsi="Arial"/>
+                <w:b/>
+                <w:i w:val="0"/>
+                <w:color w:val="7C3AED"/>
+                <w:sz w:val="21"/>
+              </w:rPr>
+              <w:t>Detalle detenidos menores:</w:t>
+            </w:r>
+          </w:p>
+        </w:tc>
+        <w:tc>
+          <w:tcPr>
+            <w:tcW w:type="dxa" w:w="6236"/>
+            <w:tcMar>
+              <w:top w:w="70" w:type="dxa"/>
+              <w:bottom w:w="70" w:type="dxa"/>
+              <w:left w:w="120" w:type="dxa"/>
+              <w:right w:w="120" w:type="dxa"/>
+            </w:tcMar>
+            <w:shd w:fill="FFFFFF"/>
+          </w:tcPr>
+          <w:p>
+            <w:pPr>
+              <w:spacing w:before="40" w:after="40" w:line="276" w:lineRule="auto"/>
+            </w:pPr>
+            <w:r>
+              <w:rPr>
+                <w:rFonts w:ascii="Arial" w:hAnsi="Arial"/>
+                <w:b w:val="0"/>
+                <w:i w:val="0"/>
+                <w:color w:val="1F2937"/>
+                <w:sz w:val="21"/>
+              </w:rPr>
+              <w:t>{{ Detenidos_Menores_Detalle }}</w:t>
+            </w:r>
+          </w:p>
+        </w:tc>
+      </w:tr>
+      <w:tr>
+        <w:tc>
+          <w:tcPr>
+            <w:tcW w:type="dxa" w:w="2835"/>
+            <w:tcMar>
+              <w:top w:w="70" w:type="dxa"/>
+              <w:bottom w:w="70" w:type="dxa"/>
+              <w:left w:w="120" w:type="dxa"/>
+              <w:right w:w="120" w:type="dxa"/>
+            </w:tcMar>
+            <w:shd w:fill="F3E8FF"/>
+          </w:tcPr>
+          <w:p>
+            <w:pPr>
+              <w:spacing w:before="40" w:after="40" w:line="276" w:lineRule="auto"/>
+            </w:pPr>
+            <w:r>
+              <w:rPr>
+                <w:rFonts w:ascii="Arial" w:hAnsi="Arial"/>
+                <w:b/>
+                <w:i w:val="0"/>
+                <w:color w:val="7C3AED"/>
+                <w:sz w:val="21"/>
+              </w:rPr>
+              <w:t>Detalle víctimas menores:</w:t>
+            </w:r>
+          </w:p>
+        </w:tc>
+        <w:tc>
+          <w:tcPr>
+            <w:tcW w:type="dxa" w:w="6236"/>
+            <w:tcMar>
+              <w:top w:w="70" w:type="dxa"/>
+              <w:bottom w:w="70" w:type="dxa"/>
+              <w:left w:w="120" w:type="dxa"/>
+              <w:right w:w="120" w:type="dxa"/>
+            </w:tcMar>
+            <w:shd w:fill="FFFFFF"/>
+          </w:tcPr>
+          <w:p>
+            <w:pPr>
+              <w:spacing w:before="40" w:after="40" w:line="276" w:lineRule="auto"/>
+            </w:pPr>
+            <w:r>
+              <w:rPr>
+                <w:rFonts w:ascii="Arial" w:hAnsi="Arial"/>
+                <w:b w:val="0"/>
+                <w:i w:val="0"/>
+                <w:color w:val="1F2937"/>
+                <w:sz w:val="21"/>
+              </w:rPr>
+              <w:t>{{ Victimas_Menores_Detalle }}</w:t>
+            </w:r>
+          </w:p>
+        </w:tc>
+      </w:tr>
     </w:tbl>
     <w:p>
       <w:pPr>
-        <w:spacing w:after="120"/>
+        <w:spacing w:after="140"/>
       </w:pPr>
     </w:p>
     <w:p>
@@ -1796,7 +2201,7 @@
           <w:rFonts w:ascii="Arial" w:hAnsi="Arial"/>
           <w:b w:val="0"/>
           <w:i w:val="0"/>
-          <w:color w:val="222222"/>
+          <w:color w:val="1F2937"/>
           <w:sz w:val="22"/>
         </w:rPr>
         <w:t>{{ advertencia_faltantes }}</w:t>
@@ -1832,7 +2237,7 @@
         <w:rFonts w:ascii="Arial" w:hAnsi="Arial"/>
         <w:b w:val="0"/>
         <w:i/>
-        <w:color w:val="646464"/>
+        <w:color w:val="64748B"/>
         <w:sz w:val="17"/>
       </w:rPr>
       <w:t>Documento emitido para análisis policial — Estándar APA 7ma Edición — Confidencial</w:t>
@@ -1929,7 +2334,7 @@
               <w:rFonts w:ascii="Arial" w:hAnsi="Arial"/>
               <w:b/>
               <w:i w:val="0"/>
-              <w:color w:val="003366"/>
+              <w:color w:val="0B2A5B"/>
               <w:sz w:val="20"/>
             </w:rPr>
             <w:t>POLICÍA DE INVESTIGACIONES DE CHILE</w:t>
@@ -1945,7 +2350,7 @@
               <w:rFonts w:ascii="Arial" w:hAnsi="Arial"/>
               <w:b w:val="0"/>
               <w:i/>
-              <w:color w:val="646464"/>
+              <w:color w:val="64748B"/>
               <w:sz w:val="17"/>
             </w:rPr>
             <w:t>Sistema de Análisis Documental, OCR y Estadísticas — SIAD</w:t>

</xml_diff>

<commit_message>
style(export): formalizar plantilla word para alto mando eliminando colores llamativos y unificando paleta institucional PDI
</commit_message>
<xml_diff>
--- a/siad/docs/Plantilla_Word.docx
+++ b/siad/docs/Plantilla_Word.docx
@@ -28,7 +28,7 @@
           <w:rFonts w:ascii="Arial" w:hAnsi="Arial"/>
           <w:b/>
           <w:i w:val="0"/>
-          <w:color w:val="C69214"/>
+          <w:color w:val="0B2A5B"/>
           <w:sz w:val="15"/>
         </w:rPr>
         <w:t>━━━━━━━━━━━━━━━━━━━━━━━━━━━━━━━━</w:t>
@@ -45,7 +45,7 @@
           <w:bottom w:val="single" w:sz="6" w:space="0" w:color="CBD5E1"/>
           <w:left w:val="single" w:sz="6" w:space="0" w:color="CBD5E1"/>
           <w:right w:val="single" w:sz="6" w:space="0" w:color="CBD5E1"/>
-          <w:insideH w:val="single" w:sz="4" w:space="0" w:color="F1F5F9"/>
+          <w:insideH w:val="single" w:sz="4" w:space="0" w:color="E2E8F0"/>
           <w:insideV w:val="none"/>
         </w:tblBorders>
       </w:tblPr>
@@ -75,7 +75,7 @@
                 <w:b/>
                 <w:i w:val="0"/>
                 <w:color w:val="0B2A5B"/>
-                <w:sz w:val="21"/>
+                <w:sz w:val="20"/>
               </w:rPr>
               <w:t>Documento Analizado:</w:t>
             </w:r>
@@ -102,7 +102,7 @@
                 <w:b w:val="0"/>
                 <w:i w:val="0"/>
                 <w:color w:val="1F2937"/>
-                <w:sz w:val="21"/>
+                <w:sz w:val="20"/>
               </w:rPr>
               <w:t>{{ Nombre_Documento }}</w:t>
             </w:r>
@@ -131,7 +131,7 @@
                 <w:b/>
                 <w:i w:val="0"/>
                 <w:color w:val="0B2A5B"/>
-                <w:sz w:val="21"/>
+                <w:sz w:val="20"/>
               </w:rPr>
               <w:t>Fecha de Generación:</w:t>
             </w:r>
@@ -158,7 +158,7 @@
                 <w:b w:val="0"/>
                 <w:i w:val="0"/>
                 <w:color w:val="1F2937"/>
-                <w:sz w:val="21"/>
+                <w:sz w:val="20"/>
               </w:rPr>
               <w:t>{{ Fecha_Generacion }}</w:t>
             </w:r>
@@ -190,12 +190,12 @@
         <w:tblLayout w:type="fixed"/>
         <w:tblLook w:firstColumn="1" w:firstRow="1" w:lastColumn="0" w:lastRow="0" w:noHBand="0" w:noVBand="1" w:val="04A0"/>
         <w:tblBorders>
-          <w:top w:val="single" w:sz="6" w:space="0" w:color="000000"/>
-          <w:bottom w:val="single" w:sz="6" w:space="0" w:color="000000"/>
-          <w:left w:val="single" w:sz="6" w:space="0" w:color="000000"/>
-          <w:right w:val="single" w:sz="6" w:space="0" w:color="000000"/>
-          <w:insideH w:val="single" w:sz="6" w:space="0" w:color="000000"/>
-          <w:insideV w:val="single" w:sz="6" w:space="0" w:color="000000"/>
+          <w:top w:val="single" w:sz="6" w:space="0" w:color="CBD5E1"/>
+          <w:bottom w:val="single" w:sz="6" w:space="0" w:color="CBD5E1"/>
+          <w:left w:val="single" w:sz="6" w:space="0" w:color="CBD5E1"/>
+          <w:right w:val="single" w:sz="6" w:space="0" w:color="CBD5E1"/>
+          <w:insideH w:val="single" w:sz="4" w:space="0" w:color="CBD5E1"/>
+          <w:insideV w:val="single" w:sz="4" w:space="0" w:color="CBD5E1"/>
         </w:tblBorders>
       </w:tblPr>
       <w:tblGrid>
@@ -207,12 +207,12 @@
           <w:tcPr>
             <w:tcW w:type="dxa" w:w="2154"/>
             <w:tcMar>
-              <w:top w:w="70" w:type="dxa"/>
-              <w:bottom w:w="70" w:type="dxa"/>
-              <w:left w:w="120" w:type="dxa"/>
-              <w:right w:w="120" w:type="dxa"/>
+              <w:top w:w="65" w:type="dxa"/>
+              <w:bottom w:w="65" w:type="dxa"/>
+              <w:left w:w="110" w:type="dxa"/>
+              <w:right w:w="110" w:type="dxa"/>
             </w:tcMar>
-            <w:shd w:fill="003366"/>
+            <w:shd w:fill="F8FAFC"/>
           </w:tcPr>
           <w:p>
             <w:pPr>
@@ -223,8 +223,8 @@
                 <w:rFonts w:ascii="Arial" w:hAnsi="Arial"/>
                 <w:b/>
                 <w:i w:val="0"/>
-                <w:color w:val="FFFFFF"/>
-                <w:sz w:val="21"/>
+                <w:color w:val="0B2A5B"/>
+                <w:sz w:val="20"/>
               </w:rPr>
               <w:t>Fecha</w:t>
             </w:r>
@@ -234,66 +234,10 @@
           <w:tcPr>
             <w:tcW w:type="dxa" w:w="6917"/>
             <w:tcMar>
-              <w:top w:w="70" w:type="dxa"/>
-              <w:bottom w:w="70" w:type="dxa"/>
-              <w:left w:w="120" w:type="dxa"/>
-              <w:right w:w="120" w:type="dxa"/>
-            </w:tcMar>
-            <w:shd w:fill="003366"/>
-          </w:tcPr>
-          <w:p>
-            <w:pPr>
-              <w:spacing w:before="40" w:after="40"/>
-            </w:pPr>
-            <w:r>
-              <w:rPr>
-                <w:rFonts w:ascii="Arial" w:hAnsi="Arial"/>
-                <w:b/>
-                <w:i w:val="0"/>
-                <w:color w:val="FFFFFF"/>
-                <w:sz w:val="21"/>
-              </w:rPr>
-              <w:t>{{ Fecha_Hecho }}</w:t>
-            </w:r>
-          </w:p>
-        </w:tc>
-      </w:tr>
-      <w:tr>
-        <w:tc>
-          <w:tcPr>
-            <w:tcW w:type="dxa" w:w="2154"/>
-            <w:tcMar>
-              <w:top w:w="70" w:type="dxa"/>
-              <w:bottom w:w="70" w:type="dxa"/>
-              <w:left w:w="120" w:type="dxa"/>
-              <w:right w:w="120" w:type="dxa"/>
-            </w:tcMar>
-            <w:shd w:fill="FFFFFF"/>
-          </w:tcPr>
-          <w:p>
-            <w:pPr>
-              <w:spacing w:before="40" w:after="40"/>
-            </w:pPr>
-            <w:r>
-              <w:rPr>
-                <w:rFonts w:ascii="Arial" w:hAnsi="Arial"/>
-                <w:b/>
-                <w:i w:val="0"/>
-                <w:color w:val="1F2937"/>
-                <w:sz w:val="21"/>
-              </w:rPr>
-              <w:t>Unidad</w:t>
-            </w:r>
-          </w:p>
-        </w:tc>
-        <w:tc>
-          <w:tcPr>
-            <w:tcW w:type="dxa" w:w="6917"/>
-            <w:tcMar>
-              <w:top w:w="70" w:type="dxa"/>
-              <w:bottom w:w="70" w:type="dxa"/>
-              <w:left w:w="120" w:type="dxa"/>
-              <w:right w:w="120" w:type="dxa"/>
+              <w:top w:w="65" w:type="dxa"/>
+              <w:bottom w:w="65" w:type="dxa"/>
+              <w:left w:w="110" w:type="dxa"/>
+              <w:right w:w="110" w:type="dxa"/>
             </w:tcMar>
             <w:shd w:fill="FFFFFF"/>
           </w:tcPr>
@@ -307,9 +251,9 @@
                 <w:b w:val="0"/>
                 <w:i w:val="0"/>
                 <w:color w:val="1F2937"/>
-                <w:sz w:val="21"/>
+                <w:sz w:val="20"/>
               </w:rPr>
-              <w:t>{{ Unidad }}</w:t>
+              <w:t>{{ Fecha_Hecho }}</w:t>
             </w:r>
           </w:p>
         </w:tc>
@@ -319,12 +263,12 @@
           <w:tcPr>
             <w:tcW w:type="dxa" w:w="2154"/>
             <w:tcMar>
-              <w:top w:w="70" w:type="dxa"/>
-              <w:bottom w:w="70" w:type="dxa"/>
-              <w:left w:w="120" w:type="dxa"/>
-              <w:right w:w="120" w:type="dxa"/>
+              <w:top w:w="65" w:type="dxa"/>
+              <w:bottom w:w="65" w:type="dxa"/>
+              <w:left w:w="110" w:type="dxa"/>
+              <w:right w:w="110" w:type="dxa"/>
             </w:tcMar>
-            <w:shd w:fill="FFFFFF"/>
+            <w:shd w:fill="F8FAFC"/>
           </w:tcPr>
           <w:p>
             <w:pPr>
@@ -335,10 +279,10 @@
                 <w:rFonts w:ascii="Arial" w:hAnsi="Arial"/>
                 <w:b/>
                 <w:i w:val="0"/>
-                <w:color w:val="1F2937"/>
-                <w:sz w:val="21"/>
+                <w:color w:val="0B2A5B"/>
+                <w:sz w:val="20"/>
               </w:rPr>
-              <w:t>Hecho</w:t>
+              <w:t>Unidad</w:t>
             </w:r>
           </w:p>
         </w:tc>
@@ -346,10 +290,10 @@
           <w:tcPr>
             <w:tcW w:type="dxa" w:w="6917"/>
             <w:tcMar>
-              <w:top w:w="70" w:type="dxa"/>
-              <w:bottom w:w="70" w:type="dxa"/>
-              <w:left w:w="120" w:type="dxa"/>
-              <w:right w:w="120" w:type="dxa"/>
+              <w:top w:w="65" w:type="dxa"/>
+              <w:bottom w:w="65" w:type="dxa"/>
+              <w:left w:w="110" w:type="dxa"/>
+              <w:right w:w="110" w:type="dxa"/>
             </w:tcMar>
             <w:shd w:fill="FFFFFF"/>
           </w:tcPr>
@@ -363,9 +307,9 @@
                 <w:b w:val="0"/>
                 <w:i w:val="0"/>
                 <w:color w:val="1F2937"/>
-                <w:sz w:val="21"/>
+                <w:sz w:val="20"/>
               </w:rPr>
-              <w:t>{{ Hecho }}</w:t>
+              <w:t>{{ Unidad }}</w:t>
             </w:r>
           </w:p>
         </w:tc>
@@ -375,12 +319,12 @@
           <w:tcPr>
             <w:tcW w:type="dxa" w:w="2154"/>
             <w:tcMar>
-              <w:top w:w="70" w:type="dxa"/>
-              <w:bottom w:w="70" w:type="dxa"/>
-              <w:left w:w="120" w:type="dxa"/>
-              <w:right w:w="120" w:type="dxa"/>
+              <w:top w:w="65" w:type="dxa"/>
+              <w:bottom w:w="65" w:type="dxa"/>
+              <w:left w:w="110" w:type="dxa"/>
+              <w:right w:w="110" w:type="dxa"/>
             </w:tcMar>
-            <w:shd w:fill="FFFFFF"/>
+            <w:shd w:fill="F8FAFC"/>
           </w:tcPr>
           <w:p>
             <w:pPr>
@@ -391,10 +335,10 @@
                 <w:rFonts w:ascii="Arial" w:hAnsi="Arial"/>
                 <w:b/>
                 <w:i w:val="0"/>
-                <w:color w:val="1F2937"/>
-                <w:sz w:val="21"/>
+                <w:color w:val="0B2A5B"/>
+                <w:sz w:val="20"/>
               </w:rPr>
-              <w:t>Detenido</w:t>
+              <w:t>Hecho</w:t>
             </w:r>
           </w:p>
         </w:tc>
@@ -402,10 +346,10 @@
           <w:tcPr>
             <w:tcW w:type="dxa" w:w="6917"/>
             <w:tcMar>
-              <w:top w:w="70" w:type="dxa"/>
-              <w:bottom w:w="70" w:type="dxa"/>
-              <w:left w:w="120" w:type="dxa"/>
-              <w:right w:w="120" w:type="dxa"/>
+              <w:top w:w="65" w:type="dxa"/>
+              <w:bottom w:w="65" w:type="dxa"/>
+              <w:left w:w="110" w:type="dxa"/>
+              <w:right w:w="110" w:type="dxa"/>
             </w:tcMar>
             <w:shd w:fill="FFFFFF"/>
           </w:tcPr>
@@ -419,9 +363,9 @@
                 <w:b w:val="0"/>
                 <w:i w:val="0"/>
                 <w:color w:val="1F2937"/>
-                <w:sz w:val="21"/>
+                <w:sz w:val="20"/>
               </w:rPr>
-              <w:t>{{ Detenidos }}</w:t>
+              <w:t>{{ Hecho }}</w:t>
             </w:r>
           </w:p>
         </w:tc>
@@ -431,12 +375,12 @@
           <w:tcPr>
             <w:tcW w:type="dxa" w:w="2154"/>
             <w:tcMar>
-              <w:top w:w="70" w:type="dxa"/>
-              <w:bottom w:w="70" w:type="dxa"/>
-              <w:left w:w="120" w:type="dxa"/>
-              <w:right w:w="120" w:type="dxa"/>
+              <w:top w:w="65" w:type="dxa"/>
+              <w:bottom w:w="65" w:type="dxa"/>
+              <w:left w:w="110" w:type="dxa"/>
+              <w:right w:w="110" w:type="dxa"/>
             </w:tcMar>
-            <w:shd w:fill="FFFFFF"/>
+            <w:shd w:fill="F8FAFC"/>
           </w:tcPr>
           <w:p>
             <w:pPr>
@@ -447,10 +391,10 @@
                 <w:rFonts w:ascii="Arial" w:hAnsi="Arial"/>
                 <w:b/>
                 <w:i w:val="0"/>
-                <w:color w:val="1F2937"/>
-                <w:sz w:val="21"/>
+                <w:color w:val="0B2A5B"/>
+                <w:sz w:val="20"/>
               </w:rPr>
-              <w:t>Víctima</w:t>
+              <w:t>Detenido</w:t>
             </w:r>
           </w:p>
         </w:tc>
@@ -458,10 +402,10 @@
           <w:tcPr>
             <w:tcW w:type="dxa" w:w="6917"/>
             <w:tcMar>
-              <w:top w:w="70" w:type="dxa"/>
-              <w:bottom w:w="70" w:type="dxa"/>
-              <w:left w:w="120" w:type="dxa"/>
-              <w:right w:w="120" w:type="dxa"/>
+              <w:top w:w="65" w:type="dxa"/>
+              <w:bottom w:w="65" w:type="dxa"/>
+              <w:left w:w="110" w:type="dxa"/>
+              <w:right w:w="110" w:type="dxa"/>
             </w:tcMar>
             <w:shd w:fill="FFFFFF"/>
           </w:tcPr>
@@ -475,9 +419,9 @@
                 <w:b w:val="0"/>
                 <w:i w:val="0"/>
                 <w:color w:val="1F2937"/>
-                <w:sz w:val="21"/>
+                <w:sz w:val="20"/>
               </w:rPr>
-              <w:t>{{ Victimas }}</w:t>
+              <w:t>{{ Detenidos }}</w:t>
             </w:r>
           </w:p>
         </w:tc>
@@ -487,12 +431,12 @@
           <w:tcPr>
             <w:tcW w:type="dxa" w:w="2154"/>
             <w:tcMar>
-              <w:top w:w="70" w:type="dxa"/>
-              <w:bottom w:w="70" w:type="dxa"/>
-              <w:left w:w="120" w:type="dxa"/>
-              <w:right w:w="120" w:type="dxa"/>
+              <w:top w:w="65" w:type="dxa"/>
+              <w:bottom w:w="65" w:type="dxa"/>
+              <w:left w:w="110" w:type="dxa"/>
+              <w:right w:w="110" w:type="dxa"/>
             </w:tcMar>
-            <w:shd w:fill="FFFFFF"/>
+            <w:shd w:fill="F8FAFC"/>
           </w:tcPr>
           <w:p>
             <w:pPr>
@@ -503,10 +447,10 @@
                 <w:rFonts w:ascii="Arial" w:hAnsi="Arial"/>
                 <w:b/>
                 <w:i w:val="0"/>
-                <w:color w:val="1F2937"/>
-                <w:sz w:val="21"/>
+                <w:color w:val="0B2A5B"/>
+                <w:sz w:val="20"/>
               </w:rPr>
-              <w:t>Detenidos menores de edad</w:t>
+              <w:t>Víctima</w:t>
             </w:r>
           </w:p>
         </w:tc>
@@ -514,10 +458,10 @@
           <w:tcPr>
             <w:tcW w:type="dxa" w:w="6917"/>
             <w:tcMar>
-              <w:top w:w="70" w:type="dxa"/>
-              <w:bottom w:w="70" w:type="dxa"/>
-              <w:left w:w="120" w:type="dxa"/>
-              <w:right w:w="120" w:type="dxa"/>
+              <w:top w:w="65" w:type="dxa"/>
+              <w:bottom w:w="65" w:type="dxa"/>
+              <w:left w:w="110" w:type="dxa"/>
+              <w:right w:w="110" w:type="dxa"/>
             </w:tcMar>
             <w:shd w:fill="FFFFFF"/>
           </w:tcPr>
@@ -531,9 +475,9 @@
                 <w:b w:val="0"/>
                 <w:i w:val="0"/>
                 <w:color w:val="1F2937"/>
-                <w:sz w:val="21"/>
+                <w:sz w:val="20"/>
               </w:rPr>
-              <w:t>{{ Detenidos_Menores }}</w:t>
+              <w:t>{{ Victimas }}</w:t>
             </w:r>
           </w:p>
         </w:tc>
@@ -543,12 +487,12 @@
           <w:tcPr>
             <w:tcW w:type="dxa" w:w="2154"/>
             <w:tcMar>
-              <w:top w:w="70" w:type="dxa"/>
-              <w:bottom w:w="70" w:type="dxa"/>
-              <w:left w:w="120" w:type="dxa"/>
-              <w:right w:w="120" w:type="dxa"/>
+              <w:top w:w="65" w:type="dxa"/>
+              <w:bottom w:w="65" w:type="dxa"/>
+              <w:left w:w="110" w:type="dxa"/>
+              <w:right w:w="110" w:type="dxa"/>
             </w:tcMar>
-            <w:shd w:fill="FFFFFF"/>
+            <w:shd w:fill="F8FAFC"/>
           </w:tcPr>
           <w:p>
             <w:pPr>
@@ -559,10 +503,10 @@
                 <w:rFonts w:ascii="Arial" w:hAnsi="Arial"/>
                 <w:b/>
                 <w:i w:val="0"/>
-                <w:color w:val="1F2937"/>
-                <w:sz w:val="21"/>
+                <w:color w:val="0B2A5B"/>
+                <w:sz w:val="20"/>
               </w:rPr>
-              <w:t>Víctimas menores de edad</w:t>
+              <w:t>Detenidos menores de edad</w:t>
             </w:r>
           </w:p>
         </w:tc>
@@ -570,10 +514,10 @@
           <w:tcPr>
             <w:tcW w:type="dxa" w:w="6917"/>
             <w:tcMar>
-              <w:top w:w="70" w:type="dxa"/>
-              <w:bottom w:w="70" w:type="dxa"/>
-              <w:left w:w="120" w:type="dxa"/>
-              <w:right w:w="120" w:type="dxa"/>
+              <w:top w:w="65" w:type="dxa"/>
+              <w:bottom w:w="65" w:type="dxa"/>
+              <w:left w:w="110" w:type="dxa"/>
+              <w:right w:w="110" w:type="dxa"/>
             </w:tcMar>
             <w:shd w:fill="FFFFFF"/>
           </w:tcPr>
@@ -587,9 +531,9 @@
                 <w:b w:val="0"/>
                 <w:i w:val="0"/>
                 <w:color w:val="1F2937"/>
-                <w:sz w:val="21"/>
+                <w:sz w:val="20"/>
               </w:rPr>
-              <w:t>{{ Victimas_Menores }}</w:t>
+              <w:t>{{ Detenidos_Menores }}</w:t>
             </w:r>
           </w:p>
         </w:tc>
@@ -599,12 +543,12 @@
           <w:tcPr>
             <w:tcW w:type="dxa" w:w="2154"/>
             <w:tcMar>
-              <w:top w:w="70" w:type="dxa"/>
-              <w:bottom w:w="70" w:type="dxa"/>
-              <w:left w:w="120" w:type="dxa"/>
-              <w:right w:w="120" w:type="dxa"/>
+              <w:top w:w="65" w:type="dxa"/>
+              <w:bottom w:w="65" w:type="dxa"/>
+              <w:left w:w="110" w:type="dxa"/>
+              <w:right w:w="110" w:type="dxa"/>
             </w:tcMar>
-            <w:shd w:fill="FFFFFF"/>
+            <w:shd w:fill="F8FAFC"/>
           </w:tcPr>
           <w:p>
             <w:pPr>
@@ -615,10 +559,10 @@
                 <w:rFonts w:ascii="Arial" w:hAnsi="Arial"/>
                 <w:b/>
                 <w:i w:val="0"/>
-                <w:color w:val="1F2937"/>
-                <w:sz w:val="21"/>
+                <w:color w:val="0B2A5B"/>
+                <w:sz w:val="20"/>
               </w:rPr>
-              <w:t>Resumen Diligencia</w:t>
+              <w:t>Víctimas menores de edad</w:t>
             </w:r>
           </w:p>
         </w:tc>
@@ -626,10 +570,10 @@
           <w:tcPr>
             <w:tcW w:type="dxa" w:w="6917"/>
             <w:tcMar>
-              <w:top w:w="70" w:type="dxa"/>
-              <w:bottom w:w="70" w:type="dxa"/>
-              <w:left w:w="120" w:type="dxa"/>
-              <w:right w:w="120" w:type="dxa"/>
+              <w:top w:w="65" w:type="dxa"/>
+              <w:bottom w:w="65" w:type="dxa"/>
+              <w:left w:w="110" w:type="dxa"/>
+              <w:right w:w="110" w:type="dxa"/>
             </w:tcMar>
             <w:shd w:fill="FFFFFF"/>
           </w:tcPr>
@@ -643,7 +587,63 @@
                 <w:b w:val="0"/>
                 <w:i w:val="0"/>
                 <w:color w:val="1F2937"/>
-                <w:sz w:val="21"/>
+                <w:sz w:val="20"/>
+              </w:rPr>
+              <w:t>{{ Victimas_Menores }}</w:t>
+            </w:r>
+          </w:p>
+        </w:tc>
+      </w:tr>
+      <w:tr>
+        <w:tc>
+          <w:tcPr>
+            <w:tcW w:type="dxa" w:w="2154"/>
+            <w:tcMar>
+              <w:top w:w="65" w:type="dxa"/>
+              <w:bottom w:w="65" w:type="dxa"/>
+              <w:left w:w="110" w:type="dxa"/>
+              <w:right w:w="110" w:type="dxa"/>
+            </w:tcMar>
+            <w:shd w:fill="F8FAFC"/>
+          </w:tcPr>
+          <w:p>
+            <w:pPr>
+              <w:spacing w:before="40" w:after="40"/>
+            </w:pPr>
+            <w:r>
+              <w:rPr>
+                <w:rFonts w:ascii="Arial" w:hAnsi="Arial"/>
+                <w:b/>
+                <w:i w:val="0"/>
+                <w:color w:val="0B2A5B"/>
+                <w:sz w:val="20"/>
+              </w:rPr>
+              <w:t>Resumen Diligencia</w:t>
+            </w:r>
+          </w:p>
+        </w:tc>
+        <w:tc>
+          <w:tcPr>
+            <w:tcW w:type="dxa" w:w="6917"/>
+            <w:tcMar>
+              <w:top w:w="65" w:type="dxa"/>
+              <w:bottom w:w="65" w:type="dxa"/>
+              <w:left w:w="110" w:type="dxa"/>
+              <w:right w:w="110" w:type="dxa"/>
+            </w:tcMar>
+            <w:shd w:fill="FFFFFF"/>
+          </w:tcPr>
+          <w:p>
+            <w:pPr>
+              <w:spacing w:before="40" w:after="40"/>
+            </w:pPr>
+            <w:r>
+              <w:rPr>
+                <w:rFonts w:ascii="Arial" w:hAnsi="Arial"/>
+                <w:b w:val="0"/>
+                <w:i w:val="0"/>
+                <w:color w:val="1F2937"/>
+                <w:sz w:val="20"/>
               </w:rPr>
               <w:t>{{ Resumen_Relato }}</w:t>
             </w:r>
@@ -696,23 +696,23 @@
           <w:tcPr>
             <w:tcW w:type="dxa" w:w="4535"/>
             <w:tcMar>
-              <w:top w:w="120" w:type="dxa"/>
-              <w:bottom w:w="120" w:type="dxa"/>
-              <w:left w:w="150" w:type="dxa"/>
-              <w:right w:w="150" w:type="dxa"/>
+              <w:top w:w="100" w:type="dxa"/>
+              <w:bottom w:w="100" w:type="dxa"/>
+              <w:left w:w="130" w:type="dxa"/>
+              <w:right w:w="130" w:type="dxa"/>
             </w:tcMar>
-            <w:shd w:fill="E6F7FB"/>
+            <w:shd w:fill="F8FAFC"/>
           </w:tcPr>
           <w:p>
             <w:pPr>
-              <w:spacing w:before="20" w:after="60"/>
+              <w:spacing w:before="20" w:after="40"/>
             </w:pPr>
             <w:r>
               <w:rPr>
                 <w:rFonts w:ascii="Arial" w:hAnsi="Arial"/>
                 <w:b/>
                 <w:i w:val="0"/>
-                <w:color w:val="0891B2"/>
+                <w:color w:val="0B2A5B"/>
                 <w:sz w:val="17"/>
               </w:rPr>
               <w:t>VÍCTIMAS MENORES DE EDAD (N.N.A.)</w:t>
@@ -727,8 +727,8 @@
                 <w:rFonts w:ascii="Arial" w:hAnsi="Arial"/>
                 <w:b/>
                 <w:i w:val="0"/>
-                <w:color w:val="0891B2"/>
-                <w:sz w:val="40"/>
+                <w:color w:val="0B2A5B"/>
+                <w:sz w:val="36"/>
               </w:rPr>
               <w:t>{{ Victimas_Menores }}</w:t>
             </w:r>
@@ -753,23 +753,23 @@
           <w:tcPr>
             <w:tcW w:type="dxa" w:w="4535"/>
             <w:tcMar>
-              <w:top w:w="120" w:type="dxa"/>
-              <w:bottom w:w="120" w:type="dxa"/>
-              <w:left w:w="150" w:type="dxa"/>
-              <w:right w:w="150" w:type="dxa"/>
+              <w:top w:w="100" w:type="dxa"/>
+              <w:bottom w:w="100" w:type="dxa"/>
+              <w:left w:w="130" w:type="dxa"/>
+              <w:right w:w="130" w:type="dxa"/>
             </w:tcMar>
-            <w:shd w:fill="FFF0E7"/>
+            <w:shd w:fill="F8FAFC"/>
           </w:tcPr>
           <w:p>
             <w:pPr>
-              <w:spacing w:before="20" w:after="60"/>
+              <w:spacing w:before="20" w:after="40"/>
             </w:pPr>
             <w:r>
               <w:rPr>
                 <w:rFonts w:ascii="Arial" w:hAnsi="Arial"/>
                 <w:b/>
                 <w:i w:val="0"/>
-                <w:color w:val="EA580C"/>
+                <w:color w:val="0B2A5B"/>
                 <w:sz w:val="17"/>
               </w:rPr>
               <w:t>DETENIDOS MENORES DE EDAD (N.N.A.)</w:t>
@@ -784,8 +784,8 @@
                 <w:rFonts w:ascii="Arial" w:hAnsi="Arial"/>
                 <w:b/>
                 <w:i w:val="0"/>
-                <w:color w:val="EA580C"/>
-                <w:sz w:val="40"/>
+                <w:color w:val="0B2A5B"/>
+                <w:sz w:val="36"/>
               </w:rPr>
               <w:t>{{ Detenidos_Menores }}</w:t>
             </w:r>
@@ -810,7 +810,7 @@
     </w:tbl>
     <w:p>
       <w:pPr>
-        <w:spacing w:after="140"/>
+        <w:spacing w:after="120"/>
       </w:pPr>
     </w:p>
     <w:p>
@@ -864,11 +864,11 @@
         <w:tblLayout w:type="fixed"/>
         <w:tblLook w:firstColumn="1" w:firstRow="1" w:lastColumn="0" w:lastRow="0" w:noHBand="0" w:noVBand="1" w:val="04A0"/>
         <w:tblBorders>
-          <w:top w:val="single" w:sz="6" w:space="0" w:color="2B5FAE"/>
-          <w:bottom w:val="single" w:sz="6" w:space="0" w:color="2B5FAE"/>
-          <w:left w:val="single" w:sz="6" w:space="0" w:color="2B5FAE"/>
-          <w:right w:val="single" w:sz="6" w:space="0" w:color="2B5FAE"/>
-          <w:insideH w:val="single" w:sz="4" w:space="0" w:color="D7DEE9"/>
+          <w:top w:val="single" w:sz="6" w:space="0" w:color="0B2A5B"/>
+          <w:bottom w:val="single" w:sz="6" w:space="0" w:color="0B2A5B"/>
+          <w:left w:val="single" w:sz="6" w:space="0" w:color="0B2A5B"/>
+          <w:right w:val="single" w:sz="6" w:space="0" w:color="0B2A5B"/>
+          <w:insideH w:val="single" w:sz="4" w:space="0" w:color="E2E8F0"/>
           <w:insideV w:val="none"/>
         </w:tblBorders>
       </w:tblPr>
@@ -882,12 +882,12 @@
             <w:tcW w:type="dxa" w:w="9360"/>
             <w:gridSpan w:val="2"/>
             <w:tcMar>
-              <w:top w:w="95" w:type="dxa"/>
-              <w:bottom w:w="95" w:type="dxa"/>
-              <w:left w:w="140" w:type="dxa"/>
-              <w:right w:w="140" w:type="dxa"/>
+              <w:top w:w="85" w:type="dxa"/>
+              <w:bottom w:w="85" w:type="dxa"/>
+              <w:left w:w="130" w:type="dxa"/>
+              <w:right w:w="130" w:type="dxa"/>
             </w:tcMar>
-            <w:shd w:fill="2B5FAE"/>
+            <w:shd w:fill="0B2A5B"/>
           </w:tcPr>
           <w:p>
             <w:pPr>
@@ -899,7 +899,7 @@
                 <w:b/>
                 <w:i w:val="0"/>
                 <w:color w:val="FFFFFF"/>
-                <w:sz w:val="21"/>
+                <w:sz w:val="20"/>
               </w:rPr>
               <w:t>VEHÍCULOS DETECTADOS</w:t>
             </w:r>
@@ -911,12 +911,12 @@
           <w:tcPr>
             <w:tcW w:type="dxa" w:w="2835"/>
             <w:tcMar>
-              <w:top w:w="70" w:type="dxa"/>
-              <w:bottom w:w="70" w:type="dxa"/>
-              <w:left w:w="120" w:type="dxa"/>
-              <w:right w:w="120" w:type="dxa"/>
+              <w:top w:w="65" w:type="dxa"/>
+              <w:bottom w:w="65" w:type="dxa"/>
+              <w:left w:w="110" w:type="dxa"/>
+              <w:right w:w="110" w:type="dxa"/>
             </w:tcMar>
-            <w:shd w:fill="EAF2FF"/>
+            <w:shd w:fill="F8FAFC"/>
           </w:tcPr>
           <w:p>
             <w:pPr>
@@ -927,8 +927,8 @@
                 <w:rFonts w:ascii="Arial" w:hAnsi="Arial"/>
                 <w:b/>
                 <w:i w:val="0"/>
-                <w:color w:val="2B5FAE"/>
-                <w:sz w:val="21"/>
+                <w:color w:val="0B2A5B"/>
+                <w:sz w:val="20"/>
               </w:rPr>
               <w:t>Marcas:</w:t>
             </w:r>
@@ -938,10 +938,10 @@
           <w:tcPr>
             <w:tcW w:type="dxa" w:w="6236"/>
             <w:tcMar>
-              <w:top w:w="70" w:type="dxa"/>
-              <w:bottom w:w="70" w:type="dxa"/>
-              <w:left w:w="120" w:type="dxa"/>
-              <w:right w:w="120" w:type="dxa"/>
+              <w:top w:w="65" w:type="dxa"/>
+              <w:bottom w:w="65" w:type="dxa"/>
+              <w:left w:w="110" w:type="dxa"/>
+              <w:right w:w="110" w:type="dxa"/>
             </w:tcMar>
             <w:shd w:fill="FFFFFF"/>
           </w:tcPr>
@@ -955,7 +955,7 @@
                 <w:b w:val="0"/>
                 <w:i w:val="0"/>
                 <w:color w:val="1F2937"/>
-                <w:sz w:val="21"/>
+                <w:sz w:val="20"/>
               </w:rPr>
               <w:t>{{ Marcas }}</w:t>
             </w:r>
@@ -967,12 +967,12 @@
           <w:tcPr>
             <w:tcW w:type="dxa" w:w="2835"/>
             <w:tcMar>
-              <w:top w:w="70" w:type="dxa"/>
-              <w:bottom w:w="70" w:type="dxa"/>
-              <w:left w:w="120" w:type="dxa"/>
-              <w:right w:w="120" w:type="dxa"/>
+              <w:top w:w="65" w:type="dxa"/>
+              <w:bottom w:w="65" w:type="dxa"/>
+              <w:left w:w="110" w:type="dxa"/>
+              <w:right w:w="110" w:type="dxa"/>
             </w:tcMar>
-            <w:shd w:fill="EAF2FF"/>
+            <w:shd w:fill="F8FAFC"/>
           </w:tcPr>
           <w:p>
             <w:pPr>
@@ -983,8 +983,8 @@
                 <w:rFonts w:ascii="Arial" w:hAnsi="Arial"/>
                 <w:b/>
                 <w:i w:val="0"/>
-                <w:color w:val="2B5FAE"/>
-                <w:sz w:val="21"/>
+                <w:color w:val="0B2A5B"/>
+                <w:sz w:val="20"/>
               </w:rPr>
               <w:t>Modelos:</w:t>
             </w:r>
@@ -994,10 +994,10 @@
           <w:tcPr>
             <w:tcW w:type="dxa" w:w="6236"/>
             <w:tcMar>
-              <w:top w:w="70" w:type="dxa"/>
-              <w:bottom w:w="70" w:type="dxa"/>
-              <w:left w:w="120" w:type="dxa"/>
-              <w:right w:w="120" w:type="dxa"/>
+              <w:top w:w="65" w:type="dxa"/>
+              <w:bottom w:w="65" w:type="dxa"/>
+              <w:left w:w="110" w:type="dxa"/>
+              <w:right w:w="110" w:type="dxa"/>
             </w:tcMar>
             <w:shd w:fill="FFFFFF"/>
           </w:tcPr>
@@ -1011,7 +1011,7 @@
                 <w:b w:val="0"/>
                 <w:i w:val="0"/>
                 <w:color w:val="1F2937"/>
-                <w:sz w:val="21"/>
+                <w:sz w:val="20"/>
               </w:rPr>
               <w:t>{{ Modelos }}</w:t>
             </w:r>
@@ -1023,12 +1023,12 @@
           <w:tcPr>
             <w:tcW w:type="dxa" w:w="2835"/>
             <w:tcMar>
-              <w:top w:w="70" w:type="dxa"/>
-              <w:bottom w:w="70" w:type="dxa"/>
-              <w:left w:w="120" w:type="dxa"/>
-              <w:right w:w="120" w:type="dxa"/>
+              <w:top w:w="65" w:type="dxa"/>
+              <w:bottom w:w="65" w:type="dxa"/>
+              <w:left w:w="110" w:type="dxa"/>
+              <w:right w:w="110" w:type="dxa"/>
             </w:tcMar>
-            <w:shd w:fill="EAF2FF"/>
+            <w:shd w:fill="F8FAFC"/>
           </w:tcPr>
           <w:p>
             <w:pPr>
@@ -1039,8 +1039,8 @@
                 <w:rFonts w:ascii="Arial" w:hAnsi="Arial"/>
                 <w:b/>
                 <w:i w:val="0"/>
-                <w:color w:val="2B5FAE"/>
-                <w:sz w:val="21"/>
+                <w:color w:val="0B2A5B"/>
+                <w:sz w:val="20"/>
               </w:rPr>
               <w:t>Colores:</w:t>
             </w:r>
@@ -1050,10 +1050,10 @@
           <w:tcPr>
             <w:tcW w:type="dxa" w:w="6236"/>
             <w:tcMar>
-              <w:top w:w="70" w:type="dxa"/>
-              <w:bottom w:w="70" w:type="dxa"/>
-              <w:left w:w="120" w:type="dxa"/>
-              <w:right w:w="120" w:type="dxa"/>
+              <w:top w:w="65" w:type="dxa"/>
+              <w:bottom w:w="65" w:type="dxa"/>
+              <w:left w:w="110" w:type="dxa"/>
+              <w:right w:w="110" w:type="dxa"/>
             </w:tcMar>
             <w:shd w:fill="FFFFFF"/>
           </w:tcPr>
@@ -1067,7 +1067,7 @@
                 <w:b w:val="0"/>
                 <w:i w:val="0"/>
                 <w:color w:val="1F2937"/>
-                <w:sz w:val="21"/>
+                <w:sz w:val="20"/>
               </w:rPr>
               <w:t>{{ Colores }}</w:t>
             </w:r>
@@ -1079,12 +1079,12 @@
           <w:tcPr>
             <w:tcW w:type="dxa" w:w="2835"/>
             <w:tcMar>
-              <w:top w:w="70" w:type="dxa"/>
-              <w:bottom w:w="70" w:type="dxa"/>
-              <w:left w:w="120" w:type="dxa"/>
-              <w:right w:w="120" w:type="dxa"/>
+              <w:top w:w="65" w:type="dxa"/>
+              <w:bottom w:w="65" w:type="dxa"/>
+              <w:left w:w="110" w:type="dxa"/>
+              <w:right w:w="110" w:type="dxa"/>
             </w:tcMar>
-            <w:shd w:fill="EAF2FF"/>
+            <w:shd w:fill="F8FAFC"/>
           </w:tcPr>
           <w:p>
             <w:pPr>
@@ -1095,8 +1095,8 @@
                 <w:rFonts w:ascii="Arial" w:hAnsi="Arial"/>
                 <w:b/>
                 <w:i w:val="0"/>
-                <w:color w:val="2B5FAE"/>
-                <w:sz w:val="21"/>
+                <w:color w:val="0B2A5B"/>
+                <w:sz w:val="20"/>
               </w:rPr>
               <w:t>Años de Fabricación:</w:t>
             </w:r>
@@ -1106,10 +1106,10 @@
           <w:tcPr>
             <w:tcW w:type="dxa" w:w="6236"/>
             <w:tcMar>
-              <w:top w:w="70" w:type="dxa"/>
-              <w:bottom w:w="70" w:type="dxa"/>
-              <w:left w:w="120" w:type="dxa"/>
-              <w:right w:w="120" w:type="dxa"/>
+              <w:top w:w="65" w:type="dxa"/>
+              <w:bottom w:w="65" w:type="dxa"/>
+              <w:left w:w="110" w:type="dxa"/>
+              <w:right w:w="110" w:type="dxa"/>
             </w:tcMar>
             <w:shd w:fill="FFFFFF"/>
           </w:tcPr>
@@ -1123,7 +1123,7 @@
                 <w:b w:val="0"/>
                 <w:i w:val="0"/>
                 <w:color w:val="1F2937"/>
-                <w:sz w:val="21"/>
+                <w:sz w:val="20"/>
               </w:rPr>
               <w:t>{{ Anios }}</w:t>
             </w:r>
@@ -1135,12 +1135,12 @@
           <w:tcPr>
             <w:tcW w:type="dxa" w:w="2835"/>
             <w:tcMar>
-              <w:top w:w="70" w:type="dxa"/>
-              <w:bottom w:w="70" w:type="dxa"/>
-              <w:left w:w="120" w:type="dxa"/>
-              <w:right w:w="120" w:type="dxa"/>
+              <w:top w:w="65" w:type="dxa"/>
+              <w:bottom w:w="65" w:type="dxa"/>
+              <w:left w:w="110" w:type="dxa"/>
+              <w:right w:w="110" w:type="dxa"/>
             </w:tcMar>
-            <w:shd w:fill="EAF2FF"/>
+            <w:shd w:fill="F8FAFC"/>
           </w:tcPr>
           <w:p>
             <w:pPr>
@@ -1151,8 +1151,8 @@
                 <w:rFonts w:ascii="Arial" w:hAnsi="Arial"/>
                 <w:b/>
                 <w:i w:val="0"/>
-                <w:color w:val="2B5FAE"/>
-                <w:sz w:val="21"/>
+                <w:color w:val="0B2A5B"/>
+                <w:sz w:val="20"/>
               </w:rPr>
               <w:t>Patentes / PPU:</w:t>
             </w:r>
@@ -1162,10 +1162,10 @@
           <w:tcPr>
             <w:tcW w:type="dxa" w:w="6236"/>
             <w:tcMar>
-              <w:top w:w="70" w:type="dxa"/>
-              <w:bottom w:w="70" w:type="dxa"/>
-              <w:left w:w="120" w:type="dxa"/>
-              <w:right w:w="120" w:type="dxa"/>
+              <w:top w:w="65" w:type="dxa"/>
+              <w:bottom w:w="65" w:type="dxa"/>
+              <w:left w:w="110" w:type="dxa"/>
+              <w:right w:w="110" w:type="dxa"/>
             </w:tcMar>
             <w:shd w:fill="FFFFFF"/>
           </w:tcPr>
@@ -1179,7 +1179,7 @@
                 <w:b w:val="0"/>
                 <w:i w:val="0"/>
                 <w:color w:val="1F2937"/>
-                <w:sz w:val="21"/>
+                <w:sz w:val="20"/>
               </w:rPr>
               <w:t>{{ Patentes_PPU }}</w:t>
             </w:r>
@@ -1189,7 +1189,7 @@
     </w:tbl>
     <w:p>
       <w:pPr>
-        <w:spacing w:after="140"/>
+        <w:spacing w:after="120"/>
       </w:pPr>
     </w:p>
     <w:p>
@@ -1226,11 +1226,11 @@
         <w:tblLayout w:type="fixed"/>
         <w:tblLook w:firstColumn="1" w:firstRow="1" w:lastColumn="0" w:lastRow="0" w:noHBand="0" w:noVBand="1" w:val="04A0"/>
         <w:tblBorders>
-          <w:top w:val="single" w:sz="6" w:space="0" w:color="D92D20"/>
-          <w:bottom w:val="single" w:sz="6" w:space="0" w:color="D92D20"/>
-          <w:left w:val="single" w:sz="6" w:space="0" w:color="D92D20"/>
-          <w:right w:val="single" w:sz="6" w:space="0" w:color="D92D20"/>
-          <w:insideH w:val="single" w:sz="4" w:space="0" w:color="D7DEE9"/>
+          <w:top w:val="single" w:sz="6" w:space="0" w:color="0B2A5B"/>
+          <w:bottom w:val="single" w:sz="6" w:space="0" w:color="0B2A5B"/>
+          <w:left w:val="single" w:sz="6" w:space="0" w:color="0B2A5B"/>
+          <w:right w:val="single" w:sz="6" w:space="0" w:color="0B2A5B"/>
+          <w:insideH w:val="single" w:sz="4" w:space="0" w:color="E2E8F0"/>
           <w:insideV w:val="none"/>
         </w:tblBorders>
       </w:tblPr>
@@ -1244,12 +1244,12 @@
             <w:tcW w:type="dxa" w:w="9360"/>
             <w:gridSpan w:val="2"/>
             <w:tcMar>
-              <w:top w:w="95" w:type="dxa"/>
-              <w:bottom w:w="95" w:type="dxa"/>
-              <w:left w:w="140" w:type="dxa"/>
-              <w:right w:w="140" w:type="dxa"/>
+              <w:top w:w="85" w:type="dxa"/>
+              <w:bottom w:w="85" w:type="dxa"/>
+              <w:left w:w="130" w:type="dxa"/>
+              <w:right w:w="130" w:type="dxa"/>
             </w:tcMar>
-            <w:shd w:fill="D92D20"/>
+            <w:shd w:fill="0B2A5B"/>
           </w:tcPr>
           <w:p>
             <w:pPr>
@@ -1261,7 +1261,7 @@
                 <w:b/>
                 <w:i w:val="0"/>
                 <w:color w:val="FFFFFF"/>
-                <w:sz w:val="21"/>
+                <w:sz w:val="20"/>
               </w:rPr>
               <w:t>ARMAS DE FUEGO DETECTADAS</w:t>
             </w:r>
@@ -1273,12 +1273,12 @@
           <w:tcPr>
             <w:tcW w:type="dxa" w:w="2835"/>
             <w:tcMar>
-              <w:top w:w="70" w:type="dxa"/>
-              <w:bottom w:w="70" w:type="dxa"/>
-              <w:left w:w="120" w:type="dxa"/>
-              <w:right w:w="120" w:type="dxa"/>
+              <w:top w:w="65" w:type="dxa"/>
+              <w:bottom w:w="65" w:type="dxa"/>
+              <w:left w:w="110" w:type="dxa"/>
+              <w:right w:w="110" w:type="dxa"/>
             </w:tcMar>
-            <w:shd w:fill="FDECEC"/>
+            <w:shd w:fill="F8FAFC"/>
           </w:tcPr>
           <w:p>
             <w:pPr>
@@ -1289,8 +1289,8 @@
                 <w:rFonts w:ascii="Arial" w:hAnsi="Arial"/>
                 <w:b/>
                 <w:i w:val="0"/>
-                <w:color w:val="D92D20"/>
-                <w:sz w:val="21"/>
+                <w:color w:val="0B2A5B"/>
+                <w:sz w:val="20"/>
               </w:rPr>
               <w:t>Marcas:</w:t>
             </w:r>
@@ -1300,10 +1300,10 @@
           <w:tcPr>
             <w:tcW w:type="dxa" w:w="6236"/>
             <w:tcMar>
-              <w:top w:w="70" w:type="dxa"/>
-              <w:bottom w:w="70" w:type="dxa"/>
-              <w:left w:w="120" w:type="dxa"/>
-              <w:right w:w="120" w:type="dxa"/>
+              <w:top w:w="65" w:type="dxa"/>
+              <w:bottom w:w="65" w:type="dxa"/>
+              <w:left w:w="110" w:type="dxa"/>
+              <w:right w:w="110" w:type="dxa"/>
             </w:tcMar>
             <w:shd w:fill="FFFFFF"/>
           </w:tcPr>
@@ -1317,7 +1317,7 @@
                 <w:b w:val="0"/>
                 <w:i w:val="0"/>
                 <w:color w:val="1F2937"/>
-                <w:sz w:val="21"/>
+                <w:sz w:val="20"/>
               </w:rPr>
               <w:t>{{ Marcas_Arma }}</w:t>
             </w:r>
@@ -1329,12 +1329,12 @@
           <w:tcPr>
             <w:tcW w:type="dxa" w:w="2835"/>
             <w:tcMar>
-              <w:top w:w="70" w:type="dxa"/>
-              <w:bottom w:w="70" w:type="dxa"/>
-              <w:left w:w="120" w:type="dxa"/>
-              <w:right w:w="120" w:type="dxa"/>
+              <w:top w:w="65" w:type="dxa"/>
+              <w:bottom w:w="65" w:type="dxa"/>
+              <w:left w:w="110" w:type="dxa"/>
+              <w:right w:w="110" w:type="dxa"/>
             </w:tcMar>
-            <w:shd w:fill="FDECEC"/>
+            <w:shd w:fill="F8FAFC"/>
           </w:tcPr>
           <w:p>
             <w:pPr>
@@ -1345,8 +1345,8 @@
                 <w:rFonts w:ascii="Arial" w:hAnsi="Arial"/>
                 <w:b/>
                 <w:i w:val="0"/>
-                <w:color w:val="D92D20"/>
-                <w:sz w:val="21"/>
+                <w:color w:val="0B2A5B"/>
+                <w:sz w:val="20"/>
               </w:rPr>
               <w:t>Modelos:</w:t>
             </w:r>
@@ -1356,10 +1356,10 @@
           <w:tcPr>
             <w:tcW w:type="dxa" w:w="6236"/>
             <w:tcMar>
-              <w:top w:w="70" w:type="dxa"/>
-              <w:bottom w:w="70" w:type="dxa"/>
-              <w:left w:w="120" w:type="dxa"/>
-              <w:right w:w="120" w:type="dxa"/>
+              <w:top w:w="65" w:type="dxa"/>
+              <w:bottom w:w="65" w:type="dxa"/>
+              <w:left w:w="110" w:type="dxa"/>
+              <w:right w:w="110" w:type="dxa"/>
             </w:tcMar>
             <w:shd w:fill="FFFFFF"/>
           </w:tcPr>
@@ -1373,7 +1373,7 @@
                 <w:b w:val="0"/>
                 <w:i w:val="0"/>
                 <w:color w:val="1F2937"/>
-                <w:sz w:val="21"/>
+                <w:sz w:val="20"/>
               </w:rPr>
               <w:t>{{ Modelos_Arma }}</w:t>
             </w:r>
@@ -1385,12 +1385,12 @@
           <w:tcPr>
             <w:tcW w:type="dxa" w:w="2835"/>
             <w:tcMar>
-              <w:top w:w="70" w:type="dxa"/>
-              <w:bottom w:w="70" w:type="dxa"/>
-              <w:left w:w="120" w:type="dxa"/>
-              <w:right w:w="120" w:type="dxa"/>
+              <w:top w:w="65" w:type="dxa"/>
+              <w:bottom w:w="65" w:type="dxa"/>
+              <w:left w:w="110" w:type="dxa"/>
+              <w:right w:w="110" w:type="dxa"/>
             </w:tcMar>
-            <w:shd w:fill="FDECEC"/>
+            <w:shd w:fill="F8FAFC"/>
           </w:tcPr>
           <w:p>
             <w:pPr>
@@ -1401,8 +1401,8 @@
                 <w:rFonts w:ascii="Arial" w:hAnsi="Arial"/>
                 <w:b/>
                 <w:i w:val="0"/>
-                <w:color w:val="D92D20"/>
-                <w:sz w:val="21"/>
+                <w:color w:val="0B2A5B"/>
+                <w:sz w:val="20"/>
               </w:rPr>
               <w:t>Tipo de Arma:</w:t>
             </w:r>
@@ -1412,10 +1412,10 @@
           <w:tcPr>
             <w:tcW w:type="dxa" w:w="6236"/>
             <w:tcMar>
-              <w:top w:w="70" w:type="dxa"/>
-              <w:bottom w:w="70" w:type="dxa"/>
-              <w:left w:w="120" w:type="dxa"/>
-              <w:right w:w="120" w:type="dxa"/>
+              <w:top w:w="65" w:type="dxa"/>
+              <w:bottom w:w="65" w:type="dxa"/>
+              <w:left w:w="110" w:type="dxa"/>
+              <w:right w:w="110" w:type="dxa"/>
             </w:tcMar>
             <w:shd w:fill="FFFFFF"/>
           </w:tcPr>
@@ -1429,7 +1429,7 @@
                 <w:b w:val="0"/>
                 <w:i w:val="0"/>
                 <w:color w:val="1F2937"/>
-                <w:sz w:val="21"/>
+                <w:sz w:val="20"/>
               </w:rPr>
               <w:t>{{ Tipo }}</w:t>
             </w:r>
@@ -1441,12 +1441,12 @@
           <w:tcPr>
             <w:tcW w:type="dxa" w:w="2835"/>
             <w:tcMar>
-              <w:top w:w="70" w:type="dxa"/>
-              <w:bottom w:w="70" w:type="dxa"/>
-              <w:left w:w="120" w:type="dxa"/>
-              <w:right w:w="120" w:type="dxa"/>
+              <w:top w:w="65" w:type="dxa"/>
+              <w:bottom w:w="65" w:type="dxa"/>
+              <w:left w:w="110" w:type="dxa"/>
+              <w:right w:w="110" w:type="dxa"/>
             </w:tcMar>
-            <w:shd w:fill="FDECEC"/>
+            <w:shd w:fill="F8FAFC"/>
           </w:tcPr>
           <w:p>
             <w:pPr>
@@ -1457,8 +1457,8 @@
                 <w:rFonts w:ascii="Arial" w:hAnsi="Arial"/>
                 <w:b/>
                 <w:i w:val="0"/>
-                <w:color w:val="D92D20"/>
-                <w:sz w:val="21"/>
+                <w:color w:val="0B2A5B"/>
+                <w:sz w:val="20"/>
               </w:rPr>
               <w:t>Calibres:</w:t>
             </w:r>
@@ -1468,10 +1468,10 @@
           <w:tcPr>
             <w:tcW w:type="dxa" w:w="6236"/>
             <w:tcMar>
-              <w:top w:w="70" w:type="dxa"/>
-              <w:bottom w:w="70" w:type="dxa"/>
-              <w:left w:w="120" w:type="dxa"/>
-              <w:right w:w="120" w:type="dxa"/>
+              <w:top w:w="65" w:type="dxa"/>
+              <w:bottom w:w="65" w:type="dxa"/>
+              <w:left w:w="110" w:type="dxa"/>
+              <w:right w:w="110" w:type="dxa"/>
             </w:tcMar>
             <w:shd w:fill="FFFFFF"/>
           </w:tcPr>
@@ -1485,7 +1485,7 @@
                 <w:b w:val="0"/>
                 <w:i w:val="0"/>
                 <w:color w:val="1F2937"/>
-                <w:sz w:val="21"/>
+                <w:sz w:val="20"/>
               </w:rPr>
               <w:t>{{ Calibres }}</w:t>
             </w:r>
@@ -1497,12 +1497,12 @@
           <w:tcPr>
             <w:tcW w:type="dxa" w:w="2835"/>
             <w:tcMar>
-              <w:top w:w="70" w:type="dxa"/>
-              <w:bottom w:w="70" w:type="dxa"/>
-              <w:left w:w="120" w:type="dxa"/>
-              <w:right w:w="120" w:type="dxa"/>
+              <w:top w:w="65" w:type="dxa"/>
+              <w:bottom w:w="65" w:type="dxa"/>
+              <w:left w:w="110" w:type="dxa"/>
+              <w:right w:w="110" w:type="dxa"/>
             </w:tcMar>
-            <w:shd w:fill="FDECEC"/>
+            <w:shd w:fill="F8FAFC"/>
           </w:tcPr>
           <w:p>
             <w:pPr>
@@ -1513,8 +1513,8 @@
                 <w:rFonts w:ascii="Arial" w:hAnsi="Arial"/>
                 <w:b/>
                 <w:i w:val="0"/>
-                <w:color w:val="D92D20"/>
-                <w:sz w:val="21"/>
+                <w:color w:val="0B2A5B"/>
+                <w:sz w:val="20"/>
               </w:rPr>
               <w:t>Números de Serie:</w:t>
             </w:r>
@@ -1524,10 +1524,10 @@
           <w:tcPr>
             <w:tcW w:type="dxa" w:w="6236"/>
             <w:tcMar>
-              <w:top w:w="70" w:type="dxa"/>
-              <w:bottom w:w="70" w:type="dxa"/>
-              <w:left w:w="120" w:type="dxa"/>
-              <w:right w:w="120" w:type="dxa"/>
+              <w:top w:w="65" w:type="dxa"/>
+              <w:bottom w:w="65" w:type="dxa"/>
+              <w:left w:w="110" w:type="dxa"/>
+              <w:right w:w="110" w:type="dxa"/>
             </w:tcMar>
             <w:shd w:fill="FFFFFF"/>
           </w:tcPr>
@@ -1541,7 +1541,7 @@
                 <w:b w:val="0"/>
                 <w:i w:val="0"/>
                 <w:color w:val="1F2937"/>
-                <w:sz w:val="21"/>
+                <w:sz w:val="20"/>
               </w:rPr>
               <w:t>{{ Numerosdeserie }}</w:t>
             </w:r>
@@ -1551,7 +1551,7 @@
     </w:tbl>
     <w:p>
       <w:pPr>
-        <w:spacing w:after="140"/>
+        <w:spacing w:after="120"/>
       </w:pPr>
     </w:p>
     <w:p>
@@ -1588,11 +1588,11 @@
         <w:tblLayout w:type="fixed"/>
         <w:tblLook w:firstColumn="1" w:firstRow="1" w:lastColumn="0" w:lastRow="0" w:noHBand="0" w:noVBand="1" w:val="04A0"/>
         <w:tblBorders>
-          <w:top w:val="single" w:sz="6" w:space="0" w:color="C69214"/>
-          <w:bottom w:val="single" w:sz="6" w:space="0" w:color="C69214"/>
-          <w:left w:val="single" w:sz="6" w:space="0" w:color="C69214"/>
-          <w:right w:val="single" w:sz="6" w:space="0" w:color="C69214"/>
-          <w:insideH w:val="single" w:sz="4" w:space="0" w:color="D7DEE9"/>
+          <w:top w:val="single" w:sz="6" w:space="0" w:color="0B2A5B"/>
+          <w:bottom w:val="single" w:sz="6" w:space="0" w:color="0B2A5B"/>
+          <w:left w:val="single" w:sz="6" w:space="0" w:color="0B2A5B"/>
+          <w:right w:val="single" w:sz="6" w:space="0" w:color="0B2A5B"/>
+          <w:insideH w:val="single" w:sz="4" w:space="0" w:color="E2E8F0"/>
           <w:insideV w:val="none"/>
         </w:tblBorders>
       </w:tblPr>
@@ -1606,12 +1606,12 @@
             <w:tcW w:type="dxa" w:w="9360"/>
             <w:gridSpan w:val="2"/>
             <w:tcMar>
-              <w:top w:w="95" w:type="dxa"/>
-              <w:bottom w:w="95" w:type="dxa"/>
-              <w:left w:w="140" w:type="dxa"/>
-              <w:right w:w="140" w:type="dxa"/>
+              <w:top w:w="85" w:type="dxa"/>
+              <w:bottom w:w="85" w:type="dxa"/>
+              <w:left w:w="130" w:type="dxa"/>
+              <w:right w:w="130" w:type="dxa"/>
             </w:tcMar>
-            <w:shd w:fill="C69214"/>
+            <w:shd w:fill="0B2A5B"/>
           </w:tcPr>
           <w:p>
             <w:pPr>
@@ -1623,7 +1623,7 @@
                 <w:b/>
                 <w:i w:val="0"/>
                 <w:color w:val="FFFFFF"/>
-                <w:sz w:val="21"/>
+                <w:sz w:val="20"/>
               </w:rPr>
               <w:t>SUSTANCIAS ILÍCITAS DETECTADAS</w:t>
             </w:r>
@@ -1635,12 +1635,12 @@
           <w:tcPr>
             <w:tcW w:type="dxa" w:w="2835"/>
             <w:tcMar>
-              <w:top w:w="70" w:type="dxa"/>
-              <w:bottom w:w="70" w:type="dxa"/>
-              <w:left w:w="120" w:type="dxa"/>
-              <w:right w:w="120" w:type="dxa"/>
+              <w:top w:w="65" w:type="dxa"/>
+              <w:bottom w:w="65" w:type="dxa"/>
+              <w:left w:w="110" w:type="dxa"/>
+              <w:right w:w="110" w:type="dxa"/>
             </w:tcMar>
-            <w:shd w:fill="FFF7DF"/>
+            <w:shd w:fill="F8FAFC"/>
           </w:tcPr>
           <w:p>
             <w:pPr>
@@ -1651,8 +1651,8 @@
                 <w:rFonts w:ascii="Arial" w:hAnsi="Arial"/>
                 <w:b/>
                 <w:i w:val="0"/>
-                <w:color w:val="A07000"/>
-                <w:sz w:val="21"/>
+                <w:color w:val="0B2A5B"/>
+                <w:sz w:val="20"/>
               </w:rPr>
               <w:t>Sustancias:</w:t>
             </w:r>
@@ -1662,10 +1662,10 @@
           <w:tcPr>
             <w:tcW w:type="dxa" w:w="6236"/>
             <w:tcMar>
-              <w:top w:w="70" w:type="dxa"/>
-              <w:bottom w:w="70" w:type="dxa"/>
-              <w:left w:w="120" w:type="dxa"/>
-              <w:right w:w="120" w:type="dxa"/>
+              <w:top w:w="65" w:type="dxa"/>
+              <w:bottom w:w="65" w:type="dxa"/>
+              <w:left w:w="110" w:type="dxa"/>
+              <w:right w:w="110" w:type="dxa"/>
             </w:tcMar>
             <w:shd w:fill="FFFFFF"/>
           </w:tcPr>
@@ -1679,7 +1679,7 @@
                 <w:b w:val="0"/>
                 <w:i w:val="0"/>
                 <w:color w:val="1F2937"/>
-                <w:sz w:val="21"/>
+                <w:sz w:val="20"/>
               </w:rPr>
               <w:t>{{ Sustancias }}</w:t>
             </w:r>
@@ -1691,12 +1691,12 @@
           <w:tcPr>
             <w:tcW w:type="dxa" w:w="2835"/>
             <w:tcMar>
-              <w:top w:w="70" w:type="dxa"/>
-              <w:bottom w:w="70" w:type="dxa"/>
-              <w:left w:w="120" w:type="dxa"/>
-              <w:right w:w="120" w:type="dxa"/>
+              <w:top w:w="65" w:type="dxa"/>
+              <w:bottom w:w="65" w:type="dxa"/>
+              <w:left w:w="110" w:type="dxa"/>
+              <w:right w:w="110" w:type="dxa"/>
             </w:tcMar>
-            <w:shd w:fill="FFF7DF"/>
+            <w:shd w:fill="F8FAFC"/>
           </w:tcPr>
           <w:p>
             <w:pPr>
@@ -1707,8 +1707,8 @@
                 <w:rFonts w:ascii="Arial" w:hAnsi="Arial"/>
                 <w:b/>
                 <w:i w:val="0"/>
-                <w:color w:val="A07000"/>
-                <w:sz w:val="21"/>
+                <w:color w:val="0B2A5B"/>
+                <w:sz w:val="20"/>
               </w:rPr>
               <w:t>Medidas / Pesajes:</w:t>
             </w:r>
@@ -1718,10 +1718,10 @@
           <w:tcPr>
             <w:tcW w:type="dxa" w:w="6236"/>
             <w:tcMar>
-              <w:top w:w="70" w:type="dxa"/>
-              <w:bottom w:w="70" w:type="dxa"/>
-              <w:left w:w="120" w:type="dxa"/>
-              <w:right w:w="120" w:type="dxa"/>
+              <w:top w:w="65" w:type="dxa"/>
+              <w:bottom w:w="65" w:type="dxa"/>
+              <w:left w:w="110" w:type="dxa"/>
+              <w:right w:w="110" w:type="dxa"/>
             </w:tcMar>
             <w:shd w:fill="FFFFFF"/>
           </w:tcPr>
@@ -1735,7 +1735,7 @@
                 <w:b w:val="0"/>
                 <w:i w:val="0"/>
                 <w:color w:val="1F2937"/>
-                <w:sz w:val="21"/>
+                <w:sz w:val="20"/>
               </w:rPr>
               <w:t>{{ Medidas_pesajes }}</w:t>
             </w:r>
@@ -1745,7 +1745,7 @@
     </w:tbl>
     <w:p>
       <w:pPr>
-        <w:spacing w:after="140"/>
+        <w:spacing w:after="120"/>
       </w:pPr>
     </w:p>
     <w:p>
@@ -1782,11 +1782,11 @@
         <w:tblLayout w:type="fixed"/>
         <w:tblLook w:firstColumn="1" w:firstRow="1" w:lastColumn="0" w:lastRow="0" w:noHBand="0" w:noVBand="1" w:val="04A0"/>
         <w:tblBorders>
-          <w:top w:val="single" w:sz="6" w:space="0" w:color="7C3AED"/>
-          <w:bottom w:val="single" w:sz="6" w:space="0" w:color="7C3AED"/>
-          <w:left w:val="single" w:sz="6" w:space="0" w:color="7C3AED"/>
-          <w:right w:val="single" w:sz="6" w:space="0" w:color="7C3AED"/>
-          <w:insideH w:val="single" w:sz="4" w:space="0" w:color="D7DEE9"/>
+          <w:top w:val="single" w:sz="6" w:space="0" w:color="0B2A5B"/>
+          <w:bottom w:val="single" w:sz="6" w:space="0" w:color="0B2A5B"/>
+          <w:left w:val="single" w:sz="6" w:space="0" w:color="0B2A5B"/>
+          <w:right w:val="single" w:sz="6" w:space="0" w:color="0B2A5B"/>
+          <w:insideH w:val="single" w:sz="4" w:space="0" w:color="E2E8F0"/>
           <w:insideV w:val="none"/>
         </w:tblBorders>
       </w:tblPr>
@@ -1800,12 +1800,12 @@
             <w:tcW w:type="dxa" w:w="9360"/>
             <w:gridSpan w:val="2"/>
             <w:tcMar>
-              <w:top w:w="95" w:type="dxa"/>
-              <w:bottom w:w="95" w:type="dxa"/>
-              <w:left w:w="140" w:type="dxa"/>
-              <w:right w:w="140" w:type="dxa"/>
+              <w:top w:w="85" w:type="dxa"/>
+              <w:bottom w:w="85" w:type="dxa"/>
+              <w:left w:w="130" w:type="dxa"/>
+              <w:right w:w="130" w:type="dxa"/>
             </w:tcMar>
-            <w:shd w:fill="7C3AED"/>
+            <w:shd w:fill="0B2A5B"/>
           </w:tcPr>
           <w:p>
             <w:pPr>
@@ -1817,7 +1817,7 @@
                 <w:b/>
                 <w:i w:val="0"/>
                 <w:color w:val="FFFFFF"/>
-                <w:sz w:val="21"/>
+                <w:sz w:val="20"/>
               </w:rPr>
               <w:t>PERSONAS INVOLUCRADAS Y N.N.A.</w:t>
             </w:r>
@@ -1829,12 +1829,12 @@
           <w:tcPr>
             <w:tcW w:type="dxa" w:w="2835"/>
             <w:tcMar>
-              <w:top w:w="70" w:type="dxa"/>
-              <w:bottom w:w="70" w:type="dxa"/>
-              <w:left w:w="120" w:type="dxa"/>
-              <w:right w:w="120" w:type="dxa"/>
+              <w:top w:w="65" w:type="dxa"/>
+              <w:bottom w:w="65" w:type="dxa"/>
+              <w:left w:w="110" w:type="dxa"/>
+              <w:right w:w="110" w:type="dxa"/>
             </w:tcMar>
-            <w:shd w:fill="F3E8FF"/>
+            <w:shd w:fill="F8FAFC"/>
           </w:tcPr>
           <w:p>
             <w:pPr>
@@ -1845,8 +1845,8 @@
                 <w:rFonts w:ascii="Arial" w:hAnsi="Arial"/>
                 <w:b/>
                 <w:i w:val="0"/>
-                <w:color w:val="7C3AED"/>
-                <w:sz w:val="21"/>
+                <w:color w:val="0B2A5B"/>
+                <w:sz w:val="20"/>
               </w:rPr>
               <w:t>Detenidos / Imputados:</w:t>
             </w:r>
@@ -1856,10 +1856,10 @@
           <w:tcPr>
             <w:tcW w:type="dxa" w:w="6236"/>
             <w:tcMar>
-              <w:top w:w="70" w:type="dxa"/>
-              <w:bottom w:w="70" w:type="dxa"/>
-              <w:left w:w="120" w:type="dxa"/>
-              <w:right w:w="120" w:type="dxa"/>
+              <w:top w:w="65" w:type="dxa"/>
+              <w:bottom w:w="65" w:type="dxa"/>
+              <w:left w:w="110" w:type="dxa"/>
+              <w:right w:w="110" w:type="dxa"/>
             </w:tcMar>
             <w:shd w:fill="FFFFFF"/>
           </w:tcPr>
@@ -1873,7 +1873,7 @@
                 <w:b w:val="0"/>
                 <w:i w:val="0"/>
                 <w:color w:val="1F2937"/>
-                <w:sz w:val="21"/>
+                <w:sz w:val="20"/>
               </w:rPr>
               <w:t>{{ Detenidos }}</w:t>
             </w:r>
@@ -1885,12 +1885,12 @@
           <w:tcPr>
             <w:tcW w:type="dxa" w:w="2835"/>
             <w:tcMar>
-              <w:top w:w="70" w:type="dxa"/>
-              <w:bottom w:w="70" w:type="dxa"/>
-              <w:left w:w="120" w:type="dxa"/>
-              <w:right w:w="120" w:type="dxa"/>
+              <w:top w:w="65" w:type="dxa"/>
+              <w:bottom w:w="65" w:type="dxa"/>
+              <w:left w:w="110" w:type="dxa"/>
+              <w:right w:w="110" w:type="dxa"/>
             </w:tcMar>
-            <w:shd w:fill="F3E8FF"/>
+            <w:shd w:fill="F8FAFC"/>
           </w:tcPr>
           <w:p>
             <w:pPr>
@@ -1901,8 +1901,8 @@
                 <w:rFonts w:ascii="Arial" w:hAnsi="Arial"/>
                 <w:b/>
                 <w:i w:val="0"/>
-                <w:color w:val="7C3AED"/>
-                <w:sz w:val="21"/>
+                <w:color w:val="0B2A5B"/>
+                <w:sz w:val="20"/>
               </w:rPr>
               <w:t>Víctimas Identificadas:</w:t>
             </w:r>
@@ -1912,10 +1912,10 @@
           <w:tcPr>
             <w:tcW w:type="dxa" w:w="6236"/>
             <w:tcMar>
-              <w:top w:w="70" w:type="dxa"/>
-              <w:bottom w:w="70" w:type="dxa"/>
-              <w:left w:w="120" w:type="dxa"/>
-              <w:right w:w="120" w:type="dxa"/>
+              <w:top w:w="65" w:type="dxa"/>
+              <w:bottom w:w="65" w:type="dxa"/>
+              <w:left w:w="110" w:type="dxa"/>
+              <w:right w:w="110" w:type="dxa"/>
             </w:tcMar>
             <w:shd w:fill="FFFFFF"/>
           </w:tcPr>
@@ -1929,7 +1929,7 @@
                 <w:b w:val="0"/>
                 <w:i w:val="0"/>
                 <w:color w:val="1F2937"/>
-                <w:sz w:val="21"/>
+                <w:sz w:val="20"/>
               </w:rPr>
               <w:t>{{ Victimas }}</w:t>
             </w:r>
@@ -1941,12 +1941,12 @@
           <w:tcPr>
             <w:tcW w:type="dxa" w:w="2835"/>
             <w:tcMar>
-              <w:top w:w="70" w:type="dxa"/>
-              <w:bottom w:w="70" w:type="dxa"/>
-              <w:left w:w="120" w:type="dxa"/>
-              <w:right w:w="120" w:type="dxa"/>
+              <w:top w:w="65" w:type="dxa"/>
+              <w:bottom w:w="65" w:type="dxa"/>
+              <w:left w:w="110" w:type="dxa"/>
+              <w:right w:w="110" w:type="dxa"/>
             </w:tcMar>
-            <w:shd w:fill="F3E8FF"/>
+            <w:shd w:fill="F8FAFC"/>
           </w:tcPr>
           <w:p>
             <w:pPr>
@@ -1957,8 +1957,8 @@
                 <w:rFonts w:ascii="Arial" w:hAnsi="Arial"/>
                 <w:b/>
                 <w:i w:val="0"/>
-                <w:color w:val="7C3AED"/>
-                <w:sz w:val="21"/>
+                <w:color w:val="0B2A5B"/>
+                <w:sz w:val="20"/>
               </w:rPr>
               <w:t>Detenidos menores de edad:</w:t>
             </w:r>
@@ -1968,10 +1968,10 @@
           <w:tcPr>
             <w:tcW w:type="dxa" w:w="6236"/>
             <w:tcMar>
-              <w:top w:w="70" w:type="dxa"/>
-              <w:bottom w:w="70" w:type="dxa"/>
-              <w:left w:w="120" w:type="dxa"/>
-              <w:right w:w="120" w:type="dxa"/>
+              <w:top w:w="65" w:type="dxa"/>
+              <w:bottom w:w="65" w:type="dxa"/>
+              <w:left w:w="110" w:type="dxa"/>
+              <w:right w:w="110" w:type="dxa"/>
             </w:tcMar>
             <w:shd w:fill="FFFFFF"/>
           </w:tcPr>
@@ -1985,7 +1985,7 @@
                 <w:b w:val="0"/>
                 <w:i w:val="0"/>
                 <w:color w:val="1F2937"/>
-                <w:sz w:val="21"/>
+                <w:sz w:val="20"/>
               </w:rPr>
               <w:t>{{ Detenidos_Menores }}</w:t>
             </w:r>
@@ -1997,12 +1997,12 @@
           <w:tcPr>
             <w:tcW w:type="dxa" w:w="2835"/>
             <w:tcMar>
-              <w:top w:w="70" w:type="dxa"/>
-              <w:bottom w:w="70" w:type="dxa"/>
-              <w:left w:w="120" w:type="dxa"/>
-              <w:right w:w="120" w:type="dxa"/>
+              <w:top w:w="65" w:type="dxa"/>
+              <w:bottom w:w="65" w:type="dxa"/>
+              <w:left w:w="110" w:type="dxa"/>
+              <w:right w:w="110" w:type="dxa"/>
             </w:tcMar>
-            <w:shd w:fill="F3E8FF"/>
+            <w:shd w:fill="F8FAFC"/>
           </w:tcPr>
           <w:p>
             <w:pPr>
@@ -2013,8 +2013,8 @@
                 <w:rFonts w:ascii="Arial" w:hAnsi="Arial"/>
                 <w:b/>
                 <w:i w:val="0"/>
-                <w:color w:val="7C3AED"/>
-                <w:sz w:val="21"/>
+                <w:color w:val="0B2A5B"/>
+                <w:sz w:val="20"/>
               </w:rPr>
               <w:t>Víctimas menores de edad:</w:t>
             </w:r>
@@ -2024,10 +2024,10 @@
           <w:tcPr>
             <w:tcW w:type="dxa" w:w="6236"/>
             <w:tcMar>
-              <w:top w:w="70" w:type="dxa"/>
-              <w:bottom w:w="70" w:type="dxa"/>
-              <w:left w:w="120" w:type="dxa"/>
-              <w:right w:w="120" w:type="dxa"/>
+              <w:top w:w="65" w:type="dxa"/>
+              <w:bottom w:w="65" w:type="dxa"/>
+              <w:left w:w="110" w:type="dxa"/>
+              <w:right w:w="110" w:type="dxa"/>
             </w:tcMar>
             <w:shd w:fill="FFFFFF"/>
           </w:tcPr>
@@ -2041,7 +2041,7 @@
                 <w:b w:val="0"/>
                 <w:i w:val="0"/>
                 <w:color w:val="1F2937"/>
-                <w:sz w:val="21"/>
+                <w:sz w:val="20"/>
               </w:rPr>
               <w:t>{{ Victimas_Menores }}</w:t>
             </w:r>
@@ -2053,12 +2053,12 @@
           <w:tcPr>
             <w:tcW w:type="dxa" w:w="2835"/>
             <w:tcMar>
-              <w:top w:w="70" w:type="dxa"/>
-              <w:bottom w:w="70" w:type="dxa"/>
-              <w:left w:w="120" w:type="dxa"/>
-              <w:right w:w="120" w:type="dxa"/>
+              <w:top w:w="65" w:type="dxa"/>
+              <w:bottom w:w="65" w:type="dxa"/>
+              <w:left w:w="110" w:type="dxa"/>
+              <w:right w:w="110" w:type="dxa"/>
             </w:tcMar>
-            <w:shd w:fill="F3E8FF"/>
+            <w:shd w:fill="F8FAFC"/>
           </w:tcPr>
           <w:p>
             <w:pPr>
@@ -2069,8 +2069,8 @@
                 <w:rFonts w:ascii="Arial" w:hAnsi="Arial"/>
                 <w:b/>
                 <w:i w:val="0"/>
-                <w:color w:val="7C3AED"/>
-                <w:sz w:val="21"/>
+                <w:color w:val="0B2A5B"/>
+                <w:sz w:val="20"/>
               </w:rPr>
               <w:t>Detalle detenidos menores:</w:t>
             </w:r>
@@ -2080,10 +2080,10 @@
           <w:tcPr>
             <w:tcW w:type="dxa" w:w="6236"/>
             <w:tcMar>
-              <w:top w:w="70" w:type="dxa"/>
-              <w:bottom w:w="70" w:type="dxa"/>
-              <w:left w:w="120" w:type="dxa"/>
-              <w:right w:w="120" w:type="dxa"/>
+              <w:top w:w="65" w:type="dxa"/>
+              <w:bottom w:w="65" w:type="dxa"/>
+              <w:left w:w="110" w:type="dxa"/>
+              <w:right w:w="110" w:type="dxa"/>
             </w:tcMar>
             <w:shd w:fill="FFFFFF"/>
           </w:tcPr>
@@ -2097,7 +2097,7 @@
                 <w:b w:val="0"/>
                 <w:i w:val="0"/>
                 <w:color w:val="1F2937"/>
-                <w:sz w:val="21"/>
+                <w:sz w:val="20"/>
               </w:rPr>
               <w:t>{{ Detenidos_Menores_Detalle }}</w:t>
             </w:r>
@@ -2109,12 +2109,12 @@
           <w:tcPr>
             <w:tcW w:type="dxa" w:w="2835"/>
             <w:tcMar>
-              <w:top w:w="70" w:type="dxa"/>
-              <w:bottom w:w="70" w:type="dxa"/>
-              <w:left w:w="120" w:type="dxa"/>
-              <w:right w:w="120" w:type="dxa"/>
+              <w:top w:w="65" w:type="dxa"/>
+              <w:bottom w:w="65" w:type="dxa"/>
+              <w:left w:w="110" w:type="dxa"/>
+              <w:right w:w="110" w:type="dxa"/>
             </w:tcMar>
-            <w:shd w:fill="F3E8FF"/>
+            <w:shd w:fill="F8FAFC"/>
           </w:tcPr>
           <w:p>
             <w:pPr>
@@ -2125,8 +2125,8 @@
                 <w:rFonts w:ascii="Arial" w:hAnsi="Arial"/>
                 <w:b/>
                 <w:i w:val="0"/>
-                <w:color w:val="7C3AED"/>
-                <w:sz w:val="21"/>
+                <w:color w:val="0B2A5B"/>
+                <w:sz w:val="20"/>
               </w:rPr>
               <w:t>Detalle víctimas menores:</w:t>
             </w:r>
@@ -2136,10 +2136,10 @@
           <w:tcPr>
             <w:tcW w:type="dxa" w:w="6236"/>
             <w:tcMar>
-              <w:top w:w="70" w:type="dxa"/>
-              <w:bottom w:w="70" w:type="dxa"/>
-              <w:left w:w="120" w:type="dxa"/>
-              <w:right w:w="120" w:type="dxa"/>
+              <w:top w:w="65" w:type="dxa"/>
+              <w:bottom w:w="65" w:type="dxa"/>
+              <w:left w:w="110" w:type="dxa"/>
+              <w:right w:w="110" w:type="dxa"/>
             </w:tcMar>
             <w:shd w:fill="FFFFFF"/>
           </w:tcPr>
@@ -2153,7 +2153,7 @@
                 <w:b w:val="0"/>
                 <w:i w:val="0"/>
                 <w:color w:val="1F2937"/>
-                <w:sz w:val="21"/>
+                <w:sz w:val="20"/>
               </w:rPr>
               <w:t>{{ Victimas_Menores_Detalle }}</w:t>
             </w:r>
@@ -2163,7 +2163,7 @@
     </w:tbl>
     <w:p>
       <w:pPr>
-        <w:spacing w:after="140"/>
+        <w:spacing w:after="120"/>
       </w:pPr>
     </w:p>
     <w:p>
@@ -2190,19 +2190,19 @@
         <w:rPr>
           <w:rFonts w:ascii="Arial" w:hAnsi="Arial"/>
           <w:b/>
-          <w:i w:val="0"/>
-          <w:color w:val="B40000"/>
-          <w:sz w:val="22"/>
+          <w:i/>
+          <w:color w:val="64748B"/>
+          <w:sz w:val="20"/>
         </w:rPr>
-        <w:t xml:space="preserve">Advertencia: </w:t>
+        <w:t xml:space="preserve">Nota: </w:t>
       </w:r>
       <w:r>
         <w:rPr>
           <w:rFonts w:ascii="Arial" w:hAnsi="Arial"/>
           <w:b w:val="0"/>
-          <w:i w:val="0"/>
-          <w:color w:val="1F2937"/>
-          <w:sz w:val="22"/>
+          <w:i/>
+          <w:color w:val="64748B"/>
+          <w:sz w:val="20"/>
         </w:rPr>
         <w:t>{{ advertencia_faltantes }}</w:t>
       </w:r>

</xml_diff>